<commit_message>
Ameliorations pro: matrice PP en tableau 2x2, WBS arborescence lisible, section 7 'Deroulement & gestion des aleas' (retrait du cadrage 'simulation'), journal allege
Co-authored-by: Sadour Ilyas <sadour2004@users.noreply.github.com>
</commit_message>
<xml_diff>
--- a/RAPPORT_ReadyToGo.docx
+++ b/RAPPORT_ReadyToGo.docx
@@ -779,7 +779,7 @@
           <w:bCs/>
           <w:b/>
         </w:rPr>
-        <w:t xml:space="preserve">simulation de la valeur acquise (EVM)</w:t>
+        <w:t xml:space="preserve">pilotage par la valeur acquise (EVM)</w:t>
       </w:r>
       <w:r>
         <w:t xml:space="preserve">.</w:t>
@@ -893,7 +893,7 @@
         <w:pStyle w:val="BodyText"/>
       </w:pPr>
       <w:r>
-        <w:t xml:space="preserve">Fait distinctif de ce rapport, une</w:t>
+        <w:t xml:space="preserve">Fait distinctif de ce rapport, le</w:t>
       </w:r>
       <w:r>
         <w:t xml:space="preserve"> </w:t>
@@ -903,13 +903,13 @@
           <w:bCs/>
           <w:b/>
         </w:rPr>
-        <w:t xml:space="preserve">simulation pédagogique des difficultés</w:t>
-      </w:r>
-      <w:r>
-        <w:t xml:space="preserve"> </w:t>
-      </w:r>
-      <w:r>
-        <w:t xml:space="preserve">est intégrée : dix problèmes réalistes (retard d’autorisation, hausse du prix des trottinettes, retard de l’application, surcharge d’un membre, pannes en test, stationnement non conforme, incident de cybersécurité, adoption faible, accident mineur, demande de changement de périmètre) surviennent effectivement dans le scénario et</w:t>
+        <w:t xml:space="preserve">déroulement réel du projet et la gestion des aléas</w:t>
+      </w:r>
+      <w:r>
+        <w:t xml:space="preserve"> </w:t>
+      </w:r>
+      <w:r>
+        <w:t xml:space="preserve">sont traités sans complaisance : dix difficultés réalistes (retard d’autorisation, hausse du prix des trottinettes, retard de l’application, surcharge d’un membre, pannes en test, stationnement non conforme, incident de cybersécurité, adoption faible, accident mineur, demande de changement de périmètre) surviennent au cours de l’exécution et</w:t>
       </w:r>
       <w:r>
         <w:t xml:space="preserve"> </w:t>
@@ -2928,13 +2928,13 @@
           <w:bCs/>
           <w:b/>
         </w:rPr>
-        <w:t xml:space="preserve">Simulation des problèmes rencontrés</w:t>
-      </w:r>
-      <w:r>
-        <w:t xml:space="preserve"> </w:t>
-      </w:r>
-      <w:r>
-        <w:t xml:space="preserve">(journal des problèmes + 10 problèmes + cohérence)</w:t>
+        <w:t xml:space="preserve">Déroulement du projet et gestion des aléas</w:t>
+      </w:r>
+      <w:r>
+        <w:t xml:space="preserve"> </w:t>
+      </w:r>
+      <w:r>
+        <w:t xml:space="preserve">(journal des aléas + analyse détaillée + cohérence)</w:t>
       </w:r>
     </w:p>
     <w:p>
@@ -2962,7 +2962,7 @@
         <w:pStyle w:val="Compact"/>
       </w:pPr>
       <w:r>
-        <w:t xml:space="preserve">8.1 KPI · 8.2 Simulation EVM · 8.3 Burndown · 8.4 Gestion des changements</w:t>
+        <w:t xml:space="preserve">8.1 KPI · 8.2 Pilotage par la valeur acquise (EVM) · 8.3 Burndown · 8.4 Gestion des changements</w:t>
       </w:r>
     </w:p>
     <w:p>
@@ -2990,7 +2990,7 @@
         <w:pStyle w:val="Compact"/>
       </w:pPr>
       <w:r>
-        <w:t xml:space="preserve">9.1 Vérification des livrables · 9.2 Validation · 9.3 Transfert · 9.4 RETEX simulés</w:t>
+        <w:t xml:space="preserve">9.1 Vérification des livrables · 9.2 Validation · 9.3 Transfert · 9.4 Retours d’expérience</w:t>
       </w:r>
     </w:p>
     <w:p>
@@ -3429,7 +3429,7 @@
         <w:t xml:space="preserve">plan de communication</w:t>
       </w:r>
       <w:r>
-        <w:t xml:space="preserve">, puis une</w:t>
+        <w:t xml:space="preserve">, puis le</w:t>
       </w:r>
       <w:r>
         <w:t xml:space="preserve"> </w:t>
@@ -3439,7 +3439,7 @@
           <w:bCs/>
           <w:b/>
         </w:rPr>
-        <w:t xml:space="preserve">simulation réaliste des problèmes rencontrés</w:t>
+        <w:t xml:space="preserve">déroulement du projet et la gestion des aléas</w:t>
       </w:r>
       <w:r>
         <w:t xml:space="preserve">, le</w:t>
@@ -3531,7 +3531,7 @@
           <w:bCs/>
           <w:b/>
         </w:rPr>
-        <w:t xml:space="preserve">honnêteté de simulation</w:t>
+        <w:t xml:space="preserve">honnêteté d’exécution</w:t>
       </w:r>
       <w:r>
         <w:t xml:space="preserve"> </w:t>
@@ -3585,7 +3585,7 @@
       </w:r>
     </w:p>
     <w:bookmarkEnd w:id="28"/>
-    <w:bookmarkStart w:id="53" w:name="définition-du-projet-étape-1"/>
+    <w:bookmarkStart w:id="50" w:name="définition-du-projet-étape-1"/>
     <w:p>
       <w:pPr>
         <w:pStyle w:val="Heading1"/>
@@ -5199,7 +5199,7 @@
         <w:t xml:space="preserve"> </w:t>
       </w:r>
       <w:r>
-        <w:t xml:space="preserve">(§5) et la</w:t>
+        <w:t xml:space="preserve">(§5) et le</w:t>
       </w:r>
       <w:r>
         <w:t xml:space="preserve"> </w:t>
@@ -5209,7 +5209,7 @@
           <w:bCs/>
           <w:b/>
         </w:rPr>
-        <w:t xml:space="preserve">simulation des problèmes</w:t>
+        <w:t xml:space="preserve">déroulement du projet et la gestion des aléas</w:t>
       </w:r>
       <w:r>
         <w:t xml:space="preserve"> </w:t>
@@ -5636,7 +5636,7 @@
         <w:t xml:space="preserve"> </w:t>
       </w:r>
       <w:r>
-        <w:t xml:space="preserve">à des critères vérifiables (objectifs SMART, KPI, seuil de rentabilité) et l’éprouve via une simulation d’aléas.</w:t>
+        <w:t xml:space="preserve">à des critères vérifiables (objectifs SMART, KPI, seuil de rentabilité) et l’éprouve face aux aléas d’exécution (§7).</w:t>
       </w:r>
     </w:p>
     <w:bookmarkEnd w:id="41"/>
@@ -9062,7 +9062,7 @@
       </w:r>
     </w:p>
     <w:bookmarkEnd w:id="45"/>
-    <w:bookmarkStart w:id="51" w:name="parties-prenantes"/>
+    <w:bookmarkStart w:id="48" w:name="parties-prenantes"/>
     <w:p>
       <w:pPr>
         <w:pStyle w:val="Heading2"/>
@@ -11344,13 +11344,842 @@
       </w:tr>
     </w:tbl>
     <w:bookmarkEnd w:id="46"/>
-    <w:bookmarkStart w:id="50" w:name="matrice-pouvoirintérêt"/>
+    <w:bookmarkStart w:id="47" w:name="matrice-pouvoirintérêt"/>
     <w:p>
       <w:pPr>
         <w:pStyle w:val="Heading3"/>
       </w:pPr>
       <w:r>
         <w:t xml:space="preserve">2.6.2 Matrice pouvoir/intérêt</w:t>
+      </w:r>
+    </w:p>
+    <w:p>
+      <w:pPr>
+        <w:pStyle w:val="FirstParagraph"/>
+      </w:pPr>
+      <w:r>
+        <w:t xml:space="preserve">Les parties prenantes sont classées selon deux axes —</w:t>
+      </w:r>
+      <w:r>
+        <w:t xml:space="preserve"> </w:t>
+      </w:r>
+      <w:r>
+        <w:rPr>
+          <w:bCs/>
+          <w:b/>
+        </w:rPr>
+        <w:t xml:space="preserve">pouvoir</w:t>
+      </w:r>
+      <w:r>
+        <w:t xml:space="preserve"> </w:t>
+      </w:r>
+      <w:r>
+        <w:t xml:space="preserve">(capacité à influencer le projet) et</w:t>
+      </w:r>
+      <w:r>
+        <w:t xml:space="preserve"> </w:t>
+      </w:r>
+      <w:r>
+        <w:rPr>
+          <w:bCs/>
+          <w:b/>
+        </w:rPr>
+        <w:t xml:space="preserve">intérêt</w:t>
+      </w:r>
+      <w:r>
+        <w:t xml:space="preserve"> </w:t>
+      </w:r>
+      <w:r>
+        <w:t xml:space="preserve">(implication vis-à-vis du projet) — dans une matrice à quatre cases.</w:t>
+      </w:r>
+    </w:p>
+    <w:tbl>
+      <w:tblPr>
+        <w:tblStyle w:val="Table"/>
+        <w:tblW w:type="pct" w:w="5000"/>
+        <w:tblLook w:firstRow="1" w:lastRow="0" w:firstColumn="0" w:lastColumn="0" w:noHBand="0" w:noVBand="0" w:val="0020"/>
+        <w:jc w:val="start"/>
+        <w:tblBorders>
+          <w:top w:val="single" w:sz="4" w:color="C9D3DC"/>
+          <w:left w:val="single" w:sz="4" w:color="C9D3DC"/>
+          <w:bottom w:val="single" w:sz="4" w:color="C9D3DC"/>
+          <w:right w:val="single" w:sz="4" w:color="C9D3DC"/>
+          <w:insideH w:val="single" w:sz="4" w:color="C9D3DC"/>
+          <w:insideV w:val="single" w:sz="4" w:color="C9D3DC"/>
+        </w:tblBorders>
+      </w:tblPr>
+      <w:tblGrid>
+        <w:gridCol w:w="2640"/>
+        <w:gridCol w:w="2640"/>
+        <w:gridCol w:w="2640"/>
+      </w:tblGrid>
+      <w:tr>
+        <w:trPr>
+          <w:tblHeader w:val="true"/>
+        </w:trPr>
+        <w:tc>
+          <w:tcPr>
+            <w:shd w:val="clear" w:fill="0B5394"/>
+          </w:tcPr>
+          <w:p>
+            <w:pPr>
+              <w:pStyle w:val="Compact"/>
+            </w:pPr>
+          </w:p>
+        </w:tc>
+        <w:tc>
+          <w:tcPr>
+            <w:shd w:val="clear" w:fill="0B5394"/>
+          </w:tcPr>
+          <w:p>
+            <w:pPr>
+              <w:pStyle w:val="Compact"/>
+              <w:jc w:val="left"/>
+            </w:pPr>
+            <w:r>
+              <w:rPr>
+                <w:bCs/>
+                <w:b/>
+                <w:color w:val="FFFFFF"/>
+                <w:sz w:val="17"/>
+              </w:rPr>
+              <w:t xml:space="preserve">Intérêt faible</w:t>
+            </w:r>
+          </w:p>
+        </w:tc>
+        <w:tc>
+          <w:tcPr>
+            <w:shd w:val="clear" w:fill="0B5394"/>
+          </w:tcPr>
+          <w:p>
+            <w:pPr>
+              <w:pStyle w:val="Compact"/>
+              <w:jc w:val="left"/>
+            </w:pPr>
+            <w:r>
+              <w:rPr>
+                <w:bCs/>
+                <w:b/>
+                <w:color w:val="FFFFFF"/>
+                <w:sz w:val="17"/>
+              </w:rPr>
+              <w:t xml:space="preserve">Intérêt élevé</w:t>
+            </w:r>
+          </w:p>
+        </w:tc>
+      </w:tr>
+      <w:tr>
+        <w:tc>
+          <w:tcPr/>
+          <w:p>
+            <w:pPr>
+              <w:pStyle w:val="Compact"/>
+              <w:jc w:val="left"/>
+            </w:pPr>
+            <w:r>
+              <w:rPr>
+                <w:bCs/>
+                <w:b/>
+                <w:sz w:val="17"/>
+              </w:rPr>
+              <w:t xml:space="preserve">Pouvoir élevé</w:t>
+            </w:r>
+          </w:p>
+        </w:tc>
+        <w:tc>
+          <w:tcPr/>
+          <w:p>
+            <w:pPr>
+              <w:pStyle w:val="Compact"/>
+              <w:jc w:val="left"/>
+            </w:pPr>
+            <w:r>
+              <w:rPr>
+                <w:bCs/>
+                <w:b/>
+                <w:sz w:val="17"/>
+              </w:rPr>
+              <w:t xml:space="preserve">Satisfaire / tenir contents</w:t>
+            </w:r>
+            <w:r>
+              <w:rPr>
+                <w:sz w:val="17"/>
+              </w:rPr>
+              <w:t xml:space="preserve"> </w:t>
+            </w:r>
+            <w:r>
+              <w:rPr>
+                <w:sz w:val="17"/>
+              </w:rPr>
+              <w:t xml:space="preserve">— Autorités compétentes</w:t>
+            </w:r>
+          </w:p>
+        </w:tc>
+        <w:tc>
+          <w:tcPr/>
+          <w:p>
+            <w:pPr>
+              <w:pStyle w:val="Compact"/>
+              <w:jc w:val="left"/>
+            </w:pPr>
+            <w:r>
+              <w:rPr>
+                <w:bCs/>
+                <w:b/>
+                <w:sz w:val="17"/>
+              </w:rPr>
+              <w:t xml:space="preserve">Gérer de près</w:t>
+            </w:r>
+            <w:r>
+              <w:rPr>
+                <w:sz w:val="17"/>
+              </w:rPr>
+              <w:t xml:space="preserve"> </w:t>
+            </w:r>
+            <w:r>
+              <w:rPr>
+                <w:sz w:val="17"/>
+              </w:rPr>
+              <w:t xml:space="preserve">— Sponsor · Mairie de Tanger · Équipe projet · Chef de projet · Investisseurs &amp; sponsors potentiels</w:t>
+            </w:r>
+          </w:p>
+        </w:tc>
+      </w:tr>
+      <w:tr>
+        <w:tc>
+          <w:tcPr>
+            <w:shd w:val="clear" w:fill="F4F6F9"/>
+          </w:tcPr>
+          <w:p>
+            <w:pPr>
+              <w:pStyle w:val="Compact"/>
+              <w:jc w:val="left"/>
+            </w:pPr>
+            <w:r>
+              <w:rPr>
+                <w:bCs/>
+                <w:b/>
+                <w:sz w:val="17"/>
+              </w:rPr>
+              <w:t xml:space="preserve">Pouvoir faible</w:t>
+            </w:r>
+          </w:p>
+        </w:tc>
+        <w:tc>
+          <w:tcPr>
+            <w:shd w:val="clear" w:fill="F4F6F9"/>
+          </w:tcPr>
+          <w:p>
+            <w:pPr>
+              <w:pStyle w:val="Compact"/>
+              <w:jc w:val="left"/>
+            </w:pPr>
+            <w:r>
+              <w:rPr>
+                <w:bCs/>
+                <w:b/>
+                <w:sz w:val="17"/>
+              </w:rPr>
+              <w:t xml:space="preserve">Surveiller (effort minimal)</w:t>
+            </w:r>
+            <w:r>
+              <w:rPr>
+                <w:sz w:val="17"/>
+              </w:rPr>
+              <w:t xml:space="preserve"> </w:t>
+            </w:r>
+            <w:r>
+              <w:rPr>
+                <w:sz w:val="17"/>
+              </w:rPr>
+              <w:t xml:space="preserve">— Partenaires transport (BRT, taxis) · Services de secours</w:t>
+            </w:r>
+          </w:p>
+        </w:tc>
+        <w:tc>
+          <w:tcPr>
+            <w:shd w:val="clear" w:fill="F4F6F9"/>
+          </w:tcPr>
+          <w:p>
+            <w:pPr>
+              <w:pStyle w:val="Compact"/>
+              <w:jc w:val="left"/>
+            </w:pPr>
+            <w:r>
+              <w:rPr>
+                <w:bCs/>
+                <w:b/>
+                <w:sz w:val="17"/>
+              </w:rPr>
+              <w:t xml:space="preserve">Tenir informés</w:t>
+            </w:r>
+            <w:r>
+              <w:rPr>
+                <w:sz w:val="17"/>
+              </w:rPr>
+              <w:t xml:space="preserve"> </w:t>
+            </w:r>
+            <w:r>
+              <w:rPr>
+                <w:sz w:val="17"/>
+              </w:rPr>
+              <w:t xml:space="preserve">— Habitants · Étudiants · Touristes · Fournisseurs · Développeurs · Opérateurs de paiement · Hôtels · Équipes de maintenance</w:t>
+            </w:r>
+          </w:p>
+        </w:tc>
+      </w:tr>
+    </w:tbl>
+    <w:p>
+      <w:pPr>
+        <w:pStyle w:val="BlockText"/>
+      </w:pPr>
+      <w:r>
+        <w:rPr>
+          <w:iCs/>
+          <w:i/>
+        </w:rPr>
+        <w:t xml:space="preserve">Interprétation :</w:t>
+      </w:r>
+      <w:r>
+        <w:t xml:space="preserve"> </w:t>
+      </w:r>
+      <w:r>
+        <w:t xml:space="preserve">la case «</w:t>
+      </w:r>
+      <w:r>
+        <w:t xml:space="preserve"> </w:t>
+      </w:r>
+      <w:r>
+        <w:rPr>
+          <w:bCs/>
+          <w:b/>
+        </w:rPr>
+        <w:t xml:space="preserve">Gérer de près</w:t>
+      </w:r>
+      <w:r>
+        <w:t xml:space="preserve"> </w:t>
+      </w:r>
+      <w:r>
+        <w:t xml:space="preserve">» (pouvoir et intérêt élevés) concentre les acteurs décisifs —</w:t>
+      </w:r>
+      <w:r>
+        <w:t xml:space="preserve"> </w:t>
+      </w:r>
+      <w:r>
+        <w:rPr>
+          <w:bCs/>
+          <w:b/>
+        </w:rPr>
+        <w:t xml:space="preserve">sponsor, mairie, investisseurs</w:t>
+      </w:r>
+      <w:r>
+        <w:t xml:space="preserve"> </w:t>
+      </w:r>
+      <w:r>
+        <w:t xml:space="preserve">— qui exigent un dialogue rapproché ; les</w:t>
+      </w:r>
+      <w:r>
+        <w:t xml:space="preserve"> </w:t>
+      </w:r>
+      <w:r>
+        <w:rPr>
+          <w:bCs/>
+          <w:b/>
+        </w:rPr>
+        <w:t xml:space="preserve">habitants</w:t>
+      </w:r>
+      <w:r>
+        <w:t xml:space="preserve"> </w:t>
+      </w:r>
+      <w:r>
+        <w:t xml:space="preserve">et</w:t>
+      </w:r>
+      <w:r>
+        <w:t xml:space="preserve"> </w:t>
+      </w:r>
+      <w:r>
+        <w:rPr>
+          <w:bCs/>
+          <w:b/>
+        </w:rPr>
+        <w:t xml:space="preserve">étudiants</w:t>
+      </w:r>
+      <w:r>
+        <w:t xml:space="preserve"> </w:t>
+      </w:r>
+      <w:r>
+        <w:t xml:space="preserve">(intérêt élevé, pouvoir moindre) sont à tenir informés et à mobiliser comme relais ; les</w:t>
+      </w:r>
+      <w:r>
+        <w:t xml:space="preserve"> </w:t>
+      </w:r>
+      <w:r>
+        <w:rPr>
+          <w:bCs/>
+          <w:b/>
+        </w:rPr>
+        <w:t xml:space="preserve">autorités</w:t>
+      </w:r>
+      <w:r>
+        <w:t xml:space="preserve"> </w:t>
+      </w:r>
+      <w:r>
+        <w:t xml:space="preserve">(pouvoir élevé, intérêt plus ponctuel) sont à satisfaire par la conformité. Cette matrice fonde le plan de communication (§6).</w:t>
+      </w:r>
+    </w:p>
+    <w:bookmarkEnd w:id="47"/>
+    <w:bookmarkEnd w:id="48"/>
+    <w:bookmarkStart w:id="49" w:name="gouvernance"/>
+    <w:p>
+      <w:pPr>
+        <w:pStyle w:val="Heading2"/>
+      </w:pPr>
+      <w:r>
+        <w:t xml:space="preserve">2.7 Gouvernance</w:t>
+      </w:r>
+    </w:p>
+    <w:p>
+      <w:pPr>
+        <w:numPr>
+          <w:ilvl w:val="0"/>
+          <w:numId w:val="1010"/>
+        </w:numPr>
+        <w:pStyle w:val="Compact"/>
+      </w:pPr>
+      <w:r>
+        <w:rPr>
+          <w:bCs/>
+          <w:b/>
+        </w:rPr>
+        <w:t xml:space="preserve">Sponsor (envisagé) :</w:t>
+      </w:r>
+      <w:r>
+        <w:t xml:space="preserve"> </w:t>
+      </w:r>
+      <w:r>
+        <w:t xml:space="preserve">porteur financier et institutionnel ; arbitre les décisions majeures (budget, périmètre).</w:t>
+      </w:r>
+      <w:r>
+        <w:t xml:space="preserve"> </w:t>
+      </w:r>
+      <w:r>
+        <w:rPr>
+          <w:iCs/>
+          <w:i/>
+        </w:rPr>
+        <w:t xml:space="preserve">Hypothèse de travail à valider.</w:t>
+      </w:r>
+    </w:p>
+    <w:p>
+      <w:pPr>
+        <w:numPr>
+          <w:ilvl w:val="0"/>
+          <w:numId w:val="1010"/>
+        </w:numPr>
+        <w:pStyle w:val="Compact"/>
+      </w:pPr>
+      <w:r>
+        <w:rPr>
+          <w:bCs/>
+          <w:b/>
+        </w:rPr>
+        <w:t xml:space="preserve">Chef de projet (Membre 1) :</w:t>
+      </w:r>
+      <w:r>
+        <w:t xml:space="preserve"> </w:t>
+      </w:r>
+      <w:r>
+        <w:t xml:space="preserve">pilote l’exécution, anime les réunions, suit les jalons, consolide le rapport.</w:t>
+      </w:r>
+    </w:p>
+    <w:p>
+      <w:pPr>
+        <w:numPr>
+          <w:ilvl w:val="0"/>
+          <w:numId w:val="1010"/>
+        </w:numPr>
+        <w:pStyle w:val="Compact"/>
+      </w:pPr>
+      <w:r>
+        <w:rPr>
+          <w:bCs/>
+          <w:b/>
+        </w:rPr>
+        <w:t xml:space="preserve">Comité de pilotage :</w:t>
+      </w:r>
+      <w:r>
+        <w:t xml:space="preserve"> </w:t>
+      </w:r>
+      <w:r>
+        <w:t xml:space="preserve">sponsor + chef de projet + les 5 membres ; se réunit aux jalons et mensuellement.</w:t>
+      </w:r>
+    </w:p>
+    <w:p>
+      <w:pPr>
+        <w:numPr>
+          <w:ilvl w:val="0"/>
+          <w:numId w:val="1010"/>
+        </w:numPr>
+        <w:pStyle w:val="Compact"/>
+      </w:pPr>
+      <w:r>
+        <w:rPr>
+          <w:bCs/>
+          <w:b/>
+        </w:rPr>
+        <w:t xml:space="preserve">Les cinq membres :</w:t>
+      </w:r>
+      <w:r>
+        <w:t xml:space="preserve"> </w:t>
+      </w:r>
+      <w:r>
+        <w:t xml:space="preserve">responsables de leurs lots (voir §4).</w:t>
+      </w:r>
+    </w:p>
+    <w:p>
+      <w:pPr>
+        <w:numPr>
+          <w:ilvl w:val="0"/>
+          <w:numId w:val="1010"/>
+        </w:numPr>
+        <w:pStyle w:val="Compact"/>
+      </w:pPr>
+      <w:r>
+        <w:rPr>
+          <w:bCs/>
+          <w:b/>
+        </w:rPr>
+        <w:t xml:space="preserve">Partenaires externes :</w:t>
+      </w:r>
+      <w:r>
+        <w:t xml:space="preserve"> </w:t>
+      </w:r>
+      <w:r>
+        <w:t xml:space="preserve">fournisseurs, prestataire application, opérateur de paiement — toujours</w:t>
+      </w:r>
+      <w:r>
+        <w:t xml:space="preserve"> </w:t>
+      </w:r>
+      <w:r>
+        <w:rPr>
+          <w:bCs/>
+          <w:b/>
+        </w:rPr>
+        <w:t xml:space="preserve">supervisés par un membre</w:t>
+      </w:r>
+      <w:r>
+        <w:t xml:space="preserve">.</w:t>
+      </w:r>
+    </w:p>
+    <w:p>
+      <w:pPr>
+        <w:pStyle w:val="FirstParagraph"/>
+      </w:pPr>
+      <w:r>
+        <w:rPr>
+          <w:bCs/>
+          <w:b/>
+        </w:rPr>
+        <w:t xml:space="preserve">Règles de décision.</w:t>
+      </w:r>
+      <w:r>
+        <w:t xml:space="preserve"> </w:t>
+      </w:r>
+      <w:r>
+        <w:t xml:space="preserve">Décisions opérationnelles : par le membre responsable. Décisions engageant coût/délai/périmètre : par le chef de projet, validées par le comité de pilotage.</w:t>
+      </w:r>
+      <w:r>
+        <w:t xml:space="preserve"> </w:t>
+      </w:r>
+      <w:r>
+        <w:rPr>
+          <w:bCs/>
+          <w:b/>
+        </w:rPr>
+        <w:t xml:space="preserve">Règle : une seule personne « Approuve » (A) par décision</w:t>
+      </w:r>
+      <w:r>
+        <w:t xml:space="preserve"> </w:t>
+      </w:r>
+      <w:r>
+        <w:t xml:space="preserve">(cohérent avec la RACI, §4.5).</w:t>
+      </w:r>
+    </w:p>
+    <w:p>
+      <w:pPr>
+        <w:pStyle w:val="BodyText"/>
+      </w:pPr>
+      <w:r>
+        <w:rPr>
+          <w:bCs/>
+          <w:b/>
+        </w:rPr>
+        <w:t xml:space="preserve">Règles d’escalade.</w:t>
+      </w:r>
+      <w:r>
+        <w:t xml:space="preserve"> </w:t>
+      </w:r>
+      <w:r>
+        <w:t xml:space="preserve">Tout écart dépassant le seuil d’alerte d’un KPI (§8.1) ou toute demande de changement à impact significatif est</w:t>
+      </w:r>
+      <w:r>
+        <w:t xml:space="preserve"> </w:t>
+      </w:r>
+      <w:r>
+        <w:rPr>
+          <w:bCs/>
+          <w:b/>
+        </w:rPr>
+        <w:t xml:space="preserve">escaladé</w:t>
+      </w:r>
+      <w:r>
+        <w:t xml:space="preserve"> </w:t>
+      </w:r>
+      <w:r>
+        <w:t xml:space="preserve">au chef de projet sous 48 h, puis au comité de pilotage si l’impact dépasse 5 % du budget ou 2 semaines de délai.</w:t>
+      </w:r>
+    </w:p>
+    <w:p>
+      <w:pPr>
+        <w:pStyle w:val="BodyText"/>
+      </w:pPr>
+      <w:r>
+        <w:rPr>
+          <w:bCs/>
+          <w:b/>
+        </w:rPr>
+        <w:t xml:space="preserve">Fréquence des réunions.</w:t>
+      </w:r>
+      <w:r>
+        <w:t xml:space="preserve"> </w:t>
+      </w:r>
+      <w:r>
+        <w:t xml:space="preserve">Point d’équipe hebdomadaire (30 min) ; comité de pilotage mensuel ; revue de jalon à chaque jalon.</w:t>
+      </w:r>
+    </w:p>
+    <w:p>
+      <w:pPr>
+        <w:pStyle w:val="BodyText"/>
+      </w:pPr>
+      <w:r>
+        <w:rPr>
+          <w:bCs/>
+          <w:b/>
+        </w:rPr>
+        <w:t xml:space="preserve">Circuit de validation.</w:t>
+      </w:r>
+      <w:r>
+        <w:t xml:space="preserve"> </w:t>
+      </w:r>
+      <w:r>
+        <w:t xml:space="preserve">Production (membre responsable) → relecture croisée (autre membre) → validation (chef de projet) → approbation (comité/sponsor pour les livrables majeurs).</w:t>
+      </w:r>
+    </w:p>
+    <w:p>
+      <w:r>
+        <w:pict>
+          <v:rect style="width:0;height:1.5pt" o:hralign="center" o:hrstd="t" o:hr="t"/>
+        </w:pict>
+      </w:r>
+    </w:p>
+    <w:bookmarkEnd w:id="49"/>
+    <w:bookmarkEnd w:id="50"/>
+    <w:bookmarkStart w:id="67" w:name="planification-globale-étape-2"/>
+    <w:p>
+      <w:pPr>
+        <w:pStyle w:val="Heading1"/>
+      </w:pPr>
+      <w:r>
+        <w:t xml:space="preserve">3. Planification globale</w:t>
+      </w:r>
+      <w:r>
+        <w:t xml:space="preserve"> </w:t>
+      </w:r>
+      <w:r>
+        <w:rPr>
+          <w:iCs/>
+          <w:i/>
+        </w:rPr>
+        <w:t xml:space="preserve">(Étape 2)</w:t>
+      </w:r>
+    </w:p>
+    <w:bookmarkStart w:id="51" w:name="méthode-de-gestion-hybride"/>
+    <w:p>
+      <w:pPr>
+        <w:pStyle w:val="Heading2"/>
+      </w:pPr>
+      <w:r>
+        <w:t xml:space="preserve">3.1 Méthode de gestion (hybride)</w:t>
+      </w:r>
+    </w:p>
+    <w:p>
+      <w:pPr>
+        <w:pStyle w:val="FirstParagraph"/>
+      </w:pPr>
+      <w:r>
+        <w:t xml:space="preserve">ReadyToGo combine des composantes très différentes : d’un côté des éléments</w:t>
+      </w:r>
+      <w:r>
+        <w:t xml:space="preserve"> </w:t>
+      </w:r>
+      <w:r>
+        <w:rPr>
+          <w:bCs/>
+          <w:b/>
+        </w:rPr>
+        <w:t xml:space="preserve">prévisibles et séquentiels</w:t>
+      </w:r>
+      <w:r>
+        <w:t xml:space="preserve"> </w:t>
+      </w:r>
+      <w:r>
+        <w:t xml:space="preserve">(autorisations administratives, achats, installation d’infrastructures), de l’autre un produit</w:t>
+      </w:r>
+      <w:r>
+        <w:t xml:space="preserve"> </w:t>
+      </w:r>
+      <w:r>
+        <w:rPr>
+          <w:bCs/>
+          <w:b/>
+        </w:rPr>
+        <w:t xml:space="preserve">évolutif et incertain</w:t>
+      </w:r>
+      <w:r>
+        <w:t xml:space="preserve"> </w:t>
+      </w:r>
+      <w:r>
+        <w:t xml:space="preserve">(l’application mobile et l’amélioration continue du service). Une seule méthode ne convient pas.</w:t>
+      </w:r>
+    </w:p>
+    <w:p>
+      <w:pPr>
+        <w:pStyle w:val="BlockText"/>
+      </w:pPr>
+      <w:r>
+        <w:t xml:space="preserve">🔵</w:t>
+      </w:r>
+      <w:r>
+        <w:t xml:space="preserve"> </w:t>
+      </w:r>
+      <w:r>
+        <w:rPr>
+          <w:bCs/>
+          <w:b/>
+        </w:rPr>
+        <w:t xml:space="preserve">Décision — Méthode hybride :</w:t>
+      </w:r>
+      <w:r>
+        <w:t xml:space="preserve"> </w:t>
+      </w:r>
+      <w:r>
+        <w:t xml:space="preserve">-</w:t>
+      </w:r>
+      <w:r>
+        <w:t xml:space="preserve"> </w:t>
+      </w:r>
+      <w:r>
+        <w:rPr>
+          <w:bCs/>
+          <w:b/>
+        </w:rPr>
+        <w:t xml:space="preserve">Approche prédictive (cycle en V / jalons)</w:t>
+      </w:r>
+      <w:r>
+        <w:t xml:space="preserve"> </w:t>
+      </w:r>
+      <w:r>
+        <w:t xml:space="preserve">pour les autorisations, les achats de trottinettes et de bornes, et l’installation. Ces lots supposent des séquences fixes, des engagements contractuels et des délais peu compressibles ; ils se pilotent par jalons et livrables figés.</w:t>
+      </w:r>
+      <w:r>
+        <w:t xml:space="preserve"> </w:t>
+      </w:r>
+      <w:r>
+        <w:t xml:space="preserve">-</w:t>
+      </w:r>
+      <w:r>
+        <w:t xml:space="preserve"> </w:t>
+      </w:r>
+      <w:r>
+        <w:rPr>
+          <w:bCs/>
+          <w:b/>
+        </w:rPr>
+        <w:t xml:space="preserve">Approche agile (sprints de 2 semaines)</w:t>
+      </w:r>
+      <w:r>
+        <w:t xml:space="preserve"> </w:t>
+      </w:r>
+      <w:r>
+        <w:t xml:space="preserve">pour l’application mobile et l’optimisation du service. Ces lots comportent de l’incertitude fonctionnelle ; ils bénéficient d’itérations, d’un backlog priorisé et de démonstrations en fin de sprint (voir burndown, §8.3).</w:t>
+      </w:r>
+    </w:p>
+    <w:p>
+      <w:pPr>
+        <w:pStyle w:val="FirstParagraph"/>
+      </w:pPr>
+      <w:r>
+        <w:rPr>
+          <w:iCs/>
+          <w:i/>
+        </w:rPr>
+        <w:t xml:space="preserve">Justification :</w:t>
+      </w:r>
+      <w:r>
+        <w:t xml:space="preserve"> </w:t>
+      </w:r>
+      <w:r>
+        <w:t xml:space="preserve">l’hybridation réduit le risque global. Elle permet d’avancer sur le logiciel (agile)</w:t>
+      </w:r>
+      <w:r>
+        <w:t xml:space="preserve"> </w:t>
+      </w:r>
+      <w:r>
+        <w:rPr>
+          <w:bCs/>
+          <w:b/>
+        </w:rPr>
+        <w:t xml:space="preserve">pendant</w:t>
+      </w:r>
+      <w:r>
+        <w:t xml:space="preserve"> </w:t>
+      </w:r>
+      <w:r>
+        <w:t xml:space="preserve">l’attente des autorisations (prédictif), ce qui est précisément exploité comme action corrective lors du Problème 1 (§7). Elle sépare aussi clairement ce qui doit être « bon du premier coup » (infrastructures) de ce qui peut « s’améliorer par itération » (application).</w:t>
+      </w:r>
+    </w:p>
+    <w:bookmarkEnd w:id="51"/>
+    <w:bookmarkStart w:id="55" w:name="wbs-structure-de-découpage"/>
+    <w:p>
+      <w:pPr>
+        <w:pStyle w:val="Heading2"/>
+      </w:pPr>
+      <w:r>
+        <w:t xml:space="preserve">3.2 WBS (structure de découpage)</w:t>
+      </w:r>
+    </w:p>
+    <w:p>
+      <w:pPr>
+        <w:pStyle w:val="FirstParagraph"/>
+      </w:pPr>
+      <w:r>
+        <w:t xml:space="preserve">La WBS organise les 18 lots du projet sous</w:t>
+      </w:r>
+      <w:r>
+        <w:t xml:space="preserve"> </w:t>
+      </w:r>
+      <w:r>
+        <w:rPr>
+          <w:bCs/>
+          <w:b/>
+        </w:rPr>
+        <w:t xml:space="preserve">cinq grandes branches</w:t>
+      </w:r>
+      <w:r>
+        <w:t xml:space="preserve"> </w:t>
+      </w:r>
+      <w:r>
+        <w:t xml:space="preserve">(lots de travail de niveau 1), elles-mêmes décomposées en sous-lots (niveau 2).</w:t>
       </w:r>
     </w:p>
     <w:p>
@@ -11360,20 +12189,20 @@
       <w:r>
         <w:drawing>
           <wp:inline>
-            <wp:extent cx="5334000" cy="5334000"/>
+            <wp:extent cx="5334000" cy="11716503"/>
             <wp:effectExtent b="0" l="0" r="0" t="0"/>
-            <wp:docPr descr="Figure 3" title="" id="48" name="Picture"/>
+            <wp:docPr descr="Figure 3" title="" id="53" name="Picture"/>
             <a:graphic>
               <a:graphicData uri="http://schemas.openxmlformats.org/drawingml/2006/picture">
                 <pic:pic>
                   <pic:nvPicPr>
-                    <pic:cNvPr descr="assets/diagrams/diagram_03.png" id="49" name="Picture"/>
+                    <pic:cNvPr descr="assets/diagrams/diagram_03.png" id="54" name="Picture"/>
                     <pic:cNvPicPr>
                       <a:picLocks noChangeArrowheads="1" noChangeAspect="1"/>
                     </pic:cNvPicPr>
                   </pic:nvPicPr>
                   <pic:blipFill>
-                    <a:blip r:embed="rId47"/>
+                    <a:blip r:embed="rId52"/>
                     <a:stretch>
                       <a:fillRect/>
                     </a:stretch>
@@ -11381,7 +12210,7 @@
                   <pic:spPr bwMode="auto">
                     <a:xfrm>
                       <a:off x="0" y="0"/>
-                      <a:ext cx="5334000" cy="5334000"/>
+                      <a:ext cx="5334000" cy="11716503"/>
                     </a:xfrm>
                     <a:prstGeom prst="rect">
                       <a:avLst/>
@@ -11423,7 +12252,7 @@
         <w:t xml:space="preserve"> </w:t>
       </w:r>
       <w:r>
-        <w:t xml:space="preserve">la</w:t>
+        <w:t xml:space="preserve">la WBS regroupe le projet en</w:t>
       </w:r>
       <w:r>
         <w:t xml:space="preserve"> </w:t>
@@ -11433,10 +12262,13 @@
           <w:bCs/>
           <w:b/>
         </w:rPr>
-        <w:t xml:space="preserve">mairie</w:t>
-      </w:r>
-      <w:r>
-        <w:t xml:space="preserve">, le</w:t>
+        <w:t xml:space="preserve">5 lots de travail</w:t>
+      </w:r>
+      <w:r>
+        <w:t xml:space="preserve"> </w:t>
+      </w:r>
+      <w:r>
+        <w:t xml:space="preserve">et</w:t>
       </w:r>
       <w:r>
         <w:t xml:space="preserve"> </w:t>
@@ -11446,13 +12278,10 @@
           <w:bCs/>
           <w:b/>
         </w:rPr>
-        <w:t xml:space="preserve">sponsor</w:t>
-      </w:r>
-      <w:r>
-        <w:t xml:space="preserve"> </w:t>
-      </w:r>
-      <w:r>
-        <w:t xml:space="preserve">et les</w:t>
+        <w:t xml:space="preserve">19 sous-lots</w:t>
+      </w:r>
+      <w:r>
+        <w:t xml:space="preserve">. Les branches</w:t>
       </w:r>
       <w:r>
         <w:t xml:space="preserve"> </w:t>
@@ -11462,13 +12291,13 @@
           <w:bCs/>
           <w:b/>
         </w:rPr>
-        <w:t xml:space="preserve">investisseurs</w:t>
-      </w:r>
-      <w:r>
-        <w:t xml:space="preserve"> </w:t>
-      </w:r>
-      <w:r>
-        <w:t xml:space="preserve">(pouvoir élevé) sont à « gérer de près » ; les</w:t>
+        <w:t xml:space="preserve">« Autorisations &amp; achats »</w:t>
+      </w:r>
+      <w:r>
+        <w:t xml:space="preserve"> </w:t>
+      </w:r>
+      <w:r>
+        <w:t xml:space="preserve">(2.3-2.4) et</w:t>
       </w:r>
       <w:r>
         <w:t xml:space="preserve"> </w:t>
@@ -11478,173 +12307,23 @@
           <w:bCs/>
           <w:b/>
         </w:rPr>
-        <w:t xml:space="preserve">habitants</w:t>
-      </w:r>
-      <w:r>
-        <w:t xml:space="preserve"> </w:t>
-      </w:r>
-      <w:r>
-        <w:t xml:space="preserve">et</w:t>
-      </w:r>
-      <w:r>
-        <w:t xml:space="preserve"> </w:t>
-      </w:r>
-      <w:r>
-        <w:rPr>
-          <w:bCs/>
-          <w:b/>
-        </w:rPr>
-        <w:t xml:space="preserve">étudiants</w:t>
-      </w:r>
-      <w:r>
-        <w:t xml:space="preserve"> </w:t>
-      </w:r>
-      <w:r>
-        <w:t xml:space="preserve">(intérêt élevé, pouvoir moindre) sont à tenir informés et à mobiliser comme relais. Cette matrice fonde le plan de communication (§6).</w:t>
+        <w:t xml:space="preserve">« Développement &amp; intégration »</w:t>
+      </w:r>
+      <w:r>
+        <w:t xml:space="preserve"> </w:t>
+      </w:r>
+      <w:r>
+        <w:t xml:space="preserve">(3.1-3.2) sont les plus consommatrices de ressources et concentrent les risques ; elles reçoivent une attention particulière dans le planning et le pilotage par la valeur acquise.</w:t>
       </w:r>
     </w:p>
-    <w:bookmarkEnd w:id="50"/>
-    <w:bookmarkEnd w:id="51"/>
-    <w:bookmarkStart w:id="52" w:name="gouvernance"/>
+    <w:bookmarkEnd w:id="55"/>
+    <w:bookmarkStart w:id="56" w:name="planning-détaillé"/>
     <w:p>
       <w:pPr>
         <w:pStyle w:val="Heading2"/>
       </w:pPr>
       <w:r>
-        <w:t xml:space="preserve">2.7 Gouvernance</w:t>
-      </w:r>
-    </w:p>
-    <w:p>
-      <w:pPr>
-        <w:numPr>
-          <w:ilvl w:val="0"/>
-          <w:numId w:val="1010"/>
-        </w:numPr>
-        <w:pStyle w:val="Compact"/>
-      </w:pPr>
-      <w:r>
-        <w:rPr>
-          <w:bCs/>
-          <w:b/>
-        </w:rPr>
-        <w:t xml:space="preserve">Sponsor (envisagé) :</w:t>
-      </w:r>
-      <w:r>
-        <w:t xml:space="preserve"> </w:t>
-      </w:r>
-      <w:r>
-        <w:t xml:space="preserve">porteur financier et institutionnel ; arbitre les décisions majeures (budget, périmètre).</w:t>
-      </w:r>
-      <w:r>
-        <w:t xml:space="preserve"> </w:t>
-      </w:r>
-      <w:r>
-        <w:rPr>
-          <w:iCs/>
-          <w:i/>
-        </w:rPr>
-        <w:t xml:space="preserve">Hypothèse de travail à valider.</w:t>
-      </w:r>
-    </w:p>
-    <w:p>
-      <w:pPr>
-        <w:numPr>
-          <w:ilvl w:val="0"/>
-          <w:numId w:val="1010"/>
-        </w:numPr>
-        <w:pStyle w:val="Compact"/>
-      </w:pPr>
-      <w:r>
-        <w:rPr>
-          <w:bCs/>
-          <w:b/>
-        </w:rPr>
-        <w:t xml:space="preserve">Chef de projet (Membre 1) :</w:t>
-      </w:r>
-      <w:r>
-        <w:t xml:space="preserve"> </w:t>
-      </w:r>
-      <w:r>
-        <w:t xml:space="preserve">pilote l’exécution, anime les réunions, suit les jalons, consolide le rapport.</w:t>
-      </w:r>
-    </w:p>
-    <w:p>
-      <w:pPr>
-        <w:numPr>
-          <w:ilvl w:val="0"/>
-          <w:numId w:val="1010"/>
-        </w:numPr>
-        <w:pStyle w:val="Compact"/>
-      </w:pPr>
-      <w:r>
-        <w:rPr>
-          <w:bCs/>
-          <w:b/>
-        </w:rPr>
-        <w:t xml:space="preserve">Comité de pilotage :</w:t>
-      </w:r>
-      <w:r>
-        <w:t xml:space="preserve"> </w:t>
-      </w:r>
-      <w:r>
-        <w:t xml:space="preserve">sponsor + chef de projet + les 5 membres ; se réunit aux jalons et mensuellement.</w:t>
-      </w:r>
-    </w:p>
-    <w:p>
-      <w:pPr>
-        <w:numPr>
-          <w:ilvl w:val="0"/>
-          <w:numId w:val="1010"/>
-        </w:numPr>
-        <w:pStyle w:val="Compact"/>
-      </w:pPr>
-      <w:r>
-        <w:rPr>
-          <w:bCs/>
-          <w:b/>
-        </w:rPr>
-        <w:t xml:space="preserve">Les cinq membres :</w:t>
-      </w:r>
-      <w:r>
-        <w:t xml:space="preserve"> </w:t>
-      </w:r>
-      <w:r>
-        <w:t xml:space="preserve">responsables de leurs lots (voir §4).</w:t>
-      </w:r>
-    </w:p>
-    <w:p>
-      <w:pPr>
-        <w:numPr>
-          <w:ilvl w:val="0"/>
-          <w:numId w:val="1010"/>
-        </w:numPr>
-        <w:pStyle w:val="Compact"/>
-      </w:pPr>
-      <w:r>
-        <w:rPr>
-          <w:bCs/>
-          <w:b/>
-        </w:rPr>
-        <w:t xml:space="preserve">Partenaires externes :</w:t>
-      </w:r>
-      <w:r>
-        <w:t xml:space="preserve"> </w:t>
-      </w:r>
-      <w:r>
-        <w:t xml:space="preserve">fournisseurs, prestataire application, opérateur de paiement — toujours</w:t>
-      </w:r>
-      <w:r>
-        <w:t xml:space="preserve"> </w:t>
-      </w:r>
-      <w:r>
-        <w:rPr>
-          <w:bCs/>
-          <w:b/>
-        </w:rPr>
-        <w:t xml:space="preserve">supervisés par un membre</w:t>
-      </w:r>
-      <w:r>
-        <w:t xml:space="preserve">.</w:t>
+        <w:t xml:space="preserve">3.3 Planning détaillé</w:t>
       </w:r>
     </w:p>
     <w:p>
@@ -11652,393 +12331,23 @@
         <w:pStyle w:val="FirstParagraph"/>
       </w:pPr>
       <w:r>
+        <w:t xml:space="preserve">Le planning ci-dessous correspond au</w:t>
+      </w:r>
+      <w:r>
+        <w:t xml:space="preserve"> </w:t>
+      </w:r>
+      <w:r>
         <w:rPr>
           <w:bCs/>
           <w:b/>
         </w:rPr>
-        <w:t xml:space="preserve">Règles de décision.</w:t>
-      </w:r>
-      <w:r>
-        <w:t xml:space="preserve"> </w:t>
-      </w:r>
-      <w:r>
-        <w:t xml:space="preserve">Décisions opérationnelles : par le membre responsable. Décisions engageant coût/délai/périmètre : par le chef de projet, validées par le comité de pilotage.</w:t>
-      </w:r>
-      <w:r>
-        <w:t xml:space="preserve"> </w:t>
-      </w:r>
-      <w:r>
-        <w:rPr>
-          <w:bCs/>
-          <w:b/>
-        </w:rPr>
-        <w:t xml:space="preserve">Règle : une seule personne « Approuve » (A) par décision</w:t>
-      </w:r>
-      <w:r>
-        <w:t xml:space="preserve"> </w:t>
-      </w:r>
-      <w:r>
-        <w:t xml:space="preserve">(cohérent avec la RACI, §4.5).</w:t>
-      </w:r>
-    </w:p>
-    <w:p>
-      <w:pPr>
-        <w:pStyle w:val="BodyText"/>
-      </w:pPr>
-      <w:r>
-        <w:rPr>
-          <w:bCs/>
-          <w:b/>
-        </w:rPr>
-        <w:t xml:space="preserve">Règles d’escalade.</w:t>
-      </w:r>
-      <w:r>
-        <w:t xml:space="preserve"> </w:t>
-      </w:r>
-      <w:r>
-        <w:t xml:space="preserve">Tout écart dépassant le seuil d’alerte d’un KPI (§8.1) ou toute demande de changement à impact significatif est</w:t>
-      </w:r>
-      <w:r>
-        <w:t xml:space="preserve"> </w:t>
-      </w:r>
-      <w:r>
-        <w:rPr>
-          <w:bCs/>
-          <w:b/>
-        </w:rPr>
-        <w:t xml:space="preserve">escaladé</w:t>
-      </w:r>
-      <w:r>
-        <w:t xml:space="preserve"> </w:t>
-      </w:r>
-      <w:r>
-        <w:t xml:space="preserve">au chef de projet sous 48 h, puis au comité de pilotage si l’impact dépasse 5 % du budget ou 2 semaines de délai.</w:t>
-      </w:r>
-    </w:p>
-    <w:p>
-      <w:pPr>
-        <w:pStyle w:val="BodyText"/>
-      </w:pPr>
-      <w:r>
-        <w:rPr>
-          <w:bCs/>
-          <w:b/>
-        </w:rPr>
-        <w:t xml:space="preserve">Fréquence des réunions.</w:t>
-      </w:r>
-      <w:r>
-        <w:t xml:space="preserve"> </w:t>
-      </w:r>
-      <w:r>
-        <w:t xml:space="preserve">Point d’équipe hebdomadaire (30 min) ; comité de pilotage mensuel ; revue de jalon à chaque jalon.</w:t>
-      </w:r>
-    </w:p>
-    <w:p>
-      <w:pPr>
-        <w:pStyle w:val="BodyText"/>
-      </w:pPr>
-      <w:r>
-        <w:rPr>
-          <w:bCs/>
-          <w:b/>
-        </w:rPr>
-        <w:t xml:space="preserve">Circuit de validation.</w:t>
-      </w:r>
-      <w:r>
-        <w:t xml:space="preserve"> </w:t>
-      </w:r>
-      <w:r>
-        <w:t xml:space="preserve">Production (membre responsable) → relecture croisée (autre membre) → validation (chef de projet) → approbation (comité/sponsor pour les livrables majeurs).</w:t>
-      </w:r>
-    </w:p>
-    <w:p>
-      <w:r>
-        <w:pict>
-          <v:rect style="width:0;height:1.5pt" o:hralign="center" o:hrstd="t" o:hr="t"/>
-        </w:pict>
-      </w:r>
-    </w:p>
-    <w:bookmarkEnd w:id="52"/>
-    <w:bookmarkEnd w:id="53"/>
-    <w:bookmarkStart w:id="70" w:name="planification-globale-étape-2"/>
-    <w:p>
-      <w:pPr>
-        <w:pStyle w:val="Heading1"/>
-      </w:pPr>
-      <w:r>
-        <w:t xml:space="preserve">3. Planification globale</w:t>
-      </w:r>
-      <w:r>
-        <w:t xml:space="preserve"> </w:t>
-      </w:r>
-      <w:r>
-        <w:rPr>
-          <w:iCs/>
-          <w:i/>
-        </w:rPr>
-        <w:t xml:space="preserve">(Étape 2)</w:t>
-      </w:r>
-    </w:p>
-    <w:bookmarkStart w:id="54" w:name="méthode-de-gestion-hybride"/>
-    <w:p>
-      <w:pPr>
-        <w:pStyle w:val="Heading2"/>
-      </w:pPr>
-      <w:r>
-        <w:t xml:space="preserve">3.1 Méthode de gestion (hybride)</w:t>
-      </w:r>
-    </w:p>
-    <w:p>
-      <w:pPr>
-        <w:pStyle w:val="FirstParagraph"/>
-      </w:pPr>
-      <w:r>
-        <w:t xml:space="preserve">ReadyToGo combine des composantes très différentes : d’un côté des éléments</w:t>
-      </w:r>
-      <w:r>
-        <w:t xml:space="preserve"> </w:t>
-      </w:r>
-      <w:r>
-        <w:rPr>
-          <w:bCs/>
-          <w:b/>
-        </w:rPr>
-        <w:t xml:space="preserve">prévisibles et séquentiels</w:t>
-      </w:r>
-      <w:r>
-        <w:t xml:space="preserve"> </w:t>
-      </w:r>
-      <w:r>
-        <w:t xml:space="preserve">(autorisations administratives, achats, installation d’infrastructures), de l’autre un produit</w:t>
-      </w:r>
-      <w:r>
-        <w:t xml:space="preserve"> </w:t>
-      </w:r>
-      <w:r>
-        <w:rPr>
-          <w:bCs/>
-          <w:b/>
-        </w:rPr>
-        <w:t xml:space="preserve">évolutif et incertain</w:t>
-      </w:r>
-      <w:r>
-        <w:t xml:space="preserve"> </w:t>
-      </w:r>
-      <w:r>
-        <w:t xml:space="preserve">(l’application mobile et l’amélioration continue du service). Une seule méthode ne convient pas.</w:t>
-      </w:r>
-    </w:p>
-    <w:p>
-      <w:pPr>
-        <w:pStyle w:val="BlockText"/>
-      </w:pPr>
-      <w:r>
-        <w:t xml:space="preserve">🔵</w:t>
-      </w:r>
-      <w:r>
-        <w:t xml:space="preserve"> </w:t>
-      </w:r>
-      <w:r>
-        <w:rPr>
-          <w:bCs/>
-          <w:b/>
-        </w:rPr>
-        <w:t xml:space="preserve">Décision — Méthode hybride :</w:t>
-      </w:r>
-      <w:r>
-        <w:t xml:space="preserve"> </w:t>
-      </w:r>
-      <w:r>
-        <w:t xml:space="preserve">-</w:t>
-      </w:r>
-      <w:r>
-        <w:t xml:space="preserve"> </w:t>
-      </w:r>
-      <w:r>
-        <w:rPr>
-          <w:bCs/>
-          <w:b/>
-        </w:rPr>
-        <w:t xml:space="preserve">Approche prédictive (cycle en V / jalons)</w:t>
-      </w:r>
-      <w:r>
-        <w:t xml:space="preserve"> </w:t>
-      </w:r>
-      <w:r>
-        <w:t xml:space="preserve">pour les autorisations, les achats de trottinettes et de bornes, et l’installation. Ces lots supposent des séquences fixes, des engagements contractuels et des délais peu compressibles ; ils se pilotent par jalons et livrables figés.</w:t>
-      </w:r>
-      <w:r>
-        <w:t xml:space="preserve"> </w:t>
-      </w:r>
-      <w:r>
-        <w:t xml:space="preserve">-</w:t>
-      </w:r>
-      <w:r>
-        <w:t xml:space="preserve"> </w:t>
-      </w:r>
-      <w:r>
-        <w:rPr>
-          <w:bCs/>
-          <w:b/>
-        </w:rPr>
-        <w:t xml:space="preserve">Approche agile (sprints de 2 semaines)</w:t>
-      </w:r>
-      <w:r>
-        <w:t xml:space="preserve"> </w:t>
-      </w:r>
-      <w:r>
-        <w:t xml:space="preserve">pour l’application mobile et l’optimisation du service. Ces lots comportent de l’incertitude fonctionnelle ; ils bénéficient d’itérations, d’un backlog priorisé et de démonstrations en fin de sprint (voir burndown, §8.3).</w:t>
-      </w:r>
-    </w:p>
-    <w:p>
-      <w:pPr>
-        <w:pStyle w:val="FirstParagraph"/>
-      </w:pPr>
-      <w:r>
-        <w:rPr>
-          <w:iCs/>
-          <w:i/>
-        </w:rPr>
-        <w:t xml:space="preserve">Justification :</w:t>
-      </w:r>
-      <w:r>
-        <w:t xml:space="preserve"> </w:t>
-      </w:r>
-      <w:r>
-        <w:t xml:space="preserve">l’hybridation réduit le risque global. Elle permet d’avancer sur le logiciel (agile)</w:t>
-      </w:r>
-      <w:r>
-        <w:t xml:space="preserve"> </w:t>
-      </w:r>
-      <w:r>
-        <w:rPr>
-          <w:bCs/>
-          <w:b/>
-        </w:rPr>
-        <w:t xml:space="preserve">pendant</w:t>
-      </w:r>
-      <w:r>
-        <w:t xml:space="preserve"> </w:t>
-      </w:r>
-      <w:r>
-        <w:t xml:space="preserve">l’attente des autorisations (prédictif), ce qui est précisément exploité comme action corrective lors du Problème 1 (§7). Elle sépare aussi clairement ce qui doit être « bon du premier coup » (infrastructures) de ce qui peut « s’améliorer par itération » (application).</w:t>
-      </w:r>
-    </w:p>
-    <w:bookmarkEnd w:id="54"/>
-    <w:bookmarkStart w:id="58" w:name="wbs-structure-de-découpage"/>
-    <w:p>
-      <w:pPr>
-        <w:pStyle w:val="Heading2"/>
-      </w:pPr>
-      <w:r>
-        <w:t xml:space="preserve">3.2 WBS (structure de découpage)</w:t>
-      </w:r>
-    </w:p>
-    <w:p>
-      <w:pPr>
-        <w:pStyle w:val="CaptionedFigure"/>
-      </w:pPr>
-      <w:r>
-        <w:drawing>
-          <wp:inline>
-            <wp:extent cx="5334000" cy="406160"/>
-            <wp:effectExtent b="0" l="0" r="0" t="0"/>
-            <wp:docPr descr="Figure 4" title="" id="56" name="Picture"/>
-            <a:graphic>
-              <a:graphicData uri="http://schemas.openxmlformats.org/drawingml/2006/picture">
-                <pic:pic>
-                  <pic:nvPicPr>
-                    <pic:cNvPr descr="assets/diagrams/diagram_04.png" id="57" name="Picture"/>
-                    <pic:cNvPicPr>
-                      <a:picLocks noChangeArrowheads="1" noChangeAspect="1"/>
-                    </pic:cNvPicPr>
-                  </pic:nvPicPr>
-                  <pic:blipFill>
-                    <a:blip r:embed="rId55"/>
-                    <a:stretch>
-                      <a:fillRect/>
-                    </a:stretch>
-                  </pic:blipFill>
-                  <pic:spPr bwMode="auto">
-                    <a:xfrm>
-                      <a:off x="0" y="0"/>
-                      <a:ext cx="5334000" cy="406160"/>
-                    </a:xfrm>
-                    <a:prstGeom prst="rect">
-                      <a:avLst/>
-                    </a:prstGeom>
-                    <a:noFill/>
-                    <a:ln w="9525">
-                      <a:noFill/>
-                      <a:headEnd/>
-                      <a:tailEnd/>
-                    </a:ln>
-                  </pic:spPr>
-                </pic:pic>
-              </a:graphicData>
-            </a:graphic>
-          </wp:inline>
-        </w:drawing>
-      </w:r>
-    </w:p>
-    <w:p>
-      <w:pPr>
-        <w:pStyle w:val="ImageCaption"/>
-      </w:pPr>
-      <w:r>
-        <w:t xml:space="preserve">Figure 4</w:t>
-      </w:r>
-    </w:p>
-    <w:p>
-      <w:pPr>
-        <w:pStyle w:val="BlockText"/>
-      </w:pPr>
-      <w:r>
-        <w:rPr>
-          <w:iCs/>
-          <w:i/>
-        </w:rPr>
-        <w:t xml:space="preserve">Interprétation :</w:t>
-      </w:r>
-      <w:r>
-        <w:t xml:space="preserve"> </w:t>
-      </w:r>
-      <w:r>
-        <w:t xml:space="preserve">la WBS décompose le projet en 18 lots. Les lots 6-7 (achats/installation) et 8-9 (logiciel) sont les plus consommateurs de ressources et concentrent les risques ; ils reçoivent une attention particulière dans le planning et l’EVM.</w:t>
-      </w:r>
-    </w:p>
-    <w:bookmarkEnd w:id="58"/>
-    <w:bookmarkStart w:id="59" w:name="planning-détaillé"/>
-    <w:p>
-      <w:pPr>
-        <w:pStyle w:val="Heading2"/>
-      </w:pPr>
-      <w:r>
-        <w:t xml:space="preserve">3.3 Planning détaillé</w:t>
-      </w:r>
-    </w:p>
-    <w:p>
-      <w:pPr>
-        <w:pStyle w:val="FirstParagraph"/>
-      </w:pPr>
-      <w:r>
-        <w:t xml:space="preserve">Le planning ci-dessous correspond au</w:t>
-      </w:r>
-      <w:r>
-        <w:t xml:space="preserve"> </w:t>
-      </w:r>
-      <w:r>
-        <w:rPr>
-          <w:bCs/>
-          <w:b/>
-        </w:rPr>
         <w:t xml:space="preserve">cadrage de référence</w:t>
       </w:r>
       <w:r>
         <w:t xml:space="preserve"> </w:t>
       </w:r>
       <w:r>
-        <w:t xml:space="preserve">de la phase pilote (avant matérialisation des problèmes ; les décalages simulés sont introduits en §7 et répercutés dans le Gantt « réel » §3.4 et l’EVM §8.2). Toutes les tâches sont attribuées à un membre ou à une ressource externe</w:t>
+        <w:t xml:space="preserve">de la phase pilote (avant matérialisation des aléas ; les décalages liés aux aléas d’exécution sont décrits en §7 et répercutés dans le planning détaillé §3.4 et l’EVM §8.2). Toutes les tâches sont attribuées à un membre ou à une ressource externe</w:t>
       </w:r>
       <w:r>
         <w:t xml:space="preserve"> </w:t>
@@ -14489,11 +14798,11 @@
         <w:t xml:space="preserve"> </w:t>
       </w:r>
       <w:r>
-        <w:t xml:space="preserve">mais devient critique s’il déborde — ce qui se produit dans la simulation (Problème 3, §7).</w:t>
+        <w:t xml:space="preserve">mais devient critique s’il déborde — ce qui se produit effectivement lors de l’exécution (Problème 3, §7).</w:t>
       </w:r>
     </w:p>
-    <w:bookmarkEnd w:id="59"/>
-    <w:bookmarkStart w:id="68" w:name="diagrammes-de-gantt-chemin-critique"/>
+    <w:bookmarkEnd w:id="56"/>
+    <w:bookmarkStart w:id="65" w:name="diagrammes-de-gantt-chemin-critique"/>
     <w:p>
       <w:pPr>
         <w:pStyle w:val="Heading2"/>
@@ -14502,7 +14811,7 @@
         <w:t xml:space="preserve">3.4 Diagrammes de Gantt &amp; chemin critique</w:t>
       </w:r>
     </w:p>
-    <w:bookmarkStart w:id="63" w:name="X447566524a6badbc2209a3cd1b2540938a76c2b"/>
+    <w:bookmarkStart w:id="60" w:name="X447566524a6badbc2209a3cd1b2540938a76c2b"/>
     <w:p>
       <w:pPr>
         <w:pStyle w:val="Heading3"/>
@@ -14520,18 +14829,18 @@
           <wp:inline>
             <wp:extent cx="5334000" cy="1703076"/>
             <wp:effectExtent b="0" l="0" r="0" t="0"/>
-            <wp:docPr descr="Figure 5" title="" id="61" name="Picture"/>
+            <wp:docPr descr="Figure 4" title="" id="58" name="Picture"/>
             <a:graphic>
               <a:graphicData uri="http://schemas.openxmlformats.org/drawingml/2006/picture">
                 <pic:pic>
                   <pic:nvPicPr>
-                    <pic:cNvPr descr="assets/diagrams/diagram_05.png" id="62" name="Picture"/>
+                    <pic:cNvPr descr="assets/diagrams/diagram_04.png" id="59" name="Picture"/>
                     <pic:cNvPicPr>
                       <a:picLocks noChangeArrowheads="1" noChangeAspect="1"/>
                     </pic:cNvPicPr>
                   </pic:nvPicPr>
                   <pic:blipFill>
-                    <a:blip r:embed="rId60"/>
+                    <a:blip r:embed="rId57"/>
                     <a:stretch>
                       <a:fillRect/>
                     </a:stretch>
@@ -14563,7 +14872,7 @@
         <w:pStyle w:val="ImageCaption"/>
       </w:pPr>
       <w:r>
-        <w:t xml:space="preserve">Figure 5</w:t>
+        <w:t xml:space="preserve">Figure 4</w:t>
       </w:r>
     </w:p>
     <w:p>
@@ -14600,14 +14909,14 @@
         <w:t xml:space="preserve">: chaque phase capitalise sur la précédente. La décision de passage à la phase 2 dépend de l’évaluation du pilote (jalon J12, §3.5).</w:t>
       </w:r>
     </w:p>
-    <w:bookmarkEnd w:id="63"/>
-    <w:bookmarkStart w:id="67" w:name="X8709f0ae4b4a051c31f01628cbe48947a64cad2"/>
+    <w:bookmarkEnd w:id="60"/>
+    <w:bookmarkStart w:id="64" w:name="planning-détaillé-de-la-phase-pilote"/>
     <w:p>
       <w:pPr>
         <w:pStyle w:val="Heading3"/>
       </w:pPr>
       <w:r>
-        <w:t xml:space="preserve">3.4.2 Gantt détaillé de la phase pilote — planning « réel » (avec aléas simulés)</w:t>
+        <w:t xml:space="preserve">3.4.2 Planning détaillé de la phase pilote</w:t>
       </w:r>
     </w:p>
     <w:p>
@@ -14615,7 +14924,7 @@
         <w:pStyle w:val="FirstParagraph"/>
       </w:pPr>
       <w:r>
-        <w:t xml:space="preserve">Ce Gantt intègre les</w:t>
+        <w:t xml:space="preserve">Ce planning détaillé intègre les</w:t>
       </w:r>
       <w:r>
         <w:t xml:space="preserve"> </w:t>
@@ -14625,13 +14934,13 @@
           <w:bCs/>
           <w:b/>
         </w:rPr>
-        <w:t xml:space="preserve">décalages issus des problèmes</w:t>
-      </w:r>
-      <w:r>
-        <w:t xml:space="preserve"> </w:t>
-      </w:r>
-      <w:r>
-        <w:t xml:space="preserve">du §7 : retard d’autorisation (+3 sem, Pb1), retard application (+2 sem, Pb3), reprise de tests après pannes et incident cyber (Pb5, Pb7). Les jalons sont marqués par des losanges.</w:t>
+        <w:t xml:space="preserve">replanifications liées aux aléas d’exécution</w:t>
+      </w:r>
+      <w:r>
+        <w:t xml:space="preserve"> </w:t>
+      </w:r>
+      <w:r>
+        <w:t xml:space="preserve">décrits au §7 : retard d’autorisation (+3 sem, P1), retard application (+2 sem, P3), reprise de tests après pannes et incident cyber (P5, P7). Les jalons sont marqués par des losanges.</w:t>
       </w:r>
     </w:p>
     <w:p>
@@ -14643,18 +14952,18 @@
           <wp:inline>
             <wp:extent cx="5334000" cy="3077525"/>
             <wp:effectExtent b="0" l="0" r="0" t="0"/>
-            <wp:docPr descr="Figure 6" title="" id="65" name="Picture"/>
+            <wp:docPr descr="Figure 5" title="" id="62" name="Picture"/>
             <a:graphic>
               <a:graphicData uri="http://schemas.openxmlformats.org/drawingml/2006/picture">
                 <pic:pic>
                   <pic:nvPicPr>
-                    <pic:cNvPr descr="assets/diagrams/diagram_06.png" id="66" name="Picture"/>
+                    <pic:cNvPr descr="assets/diagrams/diagram_05.png" id="63" name="Picture"/>
                     <pic:cNvPicPr>
                       <a:picLocks noChangeArrowheads="1" noChangeAspect="1"/>
                     </pic:cNvPicPr>
                   </pic:nvPicPr>
                   <pic:blipFill>
-                    <a:blip r:embed="rId64"/>
+                    <a:blip r:embed="rId61"/>
                     <a:stretch>
                       <a:fillRect/>
                     </a:stretch>
@@ -14686,7 +14995,7 @@
         <w:pStyle w:val="ImageCaption"/>
       </w:pPr>
       <w:r>
-        <w:t xml:space="preserve">Figure 6</w:t>
+        <w:t xml:space="preserve">Figure 5</w:t>
       </w:r>
     </w:p>
     <w:p>
@@ -14698,7 +15007,7 @@
           <w:bCs/>
           <w:b/>
         </w:rPr>
-        <w:t xml:space="preserve">Chemin critique (réel).</w:t>
+        <w:t xml:space="preserve">Chemin critique.</w:t>
       </w:r>
       <w:r>
         <w:t xml:space="preserve"> </w:t>
@@ -14799,7 +15108,7 @@
         <w:t xml:space="preserve"> </w:t>
       </w:r>
       <w:r>
-        <w:t xml:space="preserve">la comparaison entre le planning de référence (§3.3) et le planning réel montre concrètement l’impact des problèmes sur le calendrier. Le déport du développement logiciel en parallèle a</w:t>
+        <w:t xml:space="preserve">la comparaison entre le planning de référence (§3.3) et le planning détaillé montre concrètement l’impact des aléas d’exécution sur le calendrier. Le déport du développement logiciel en parallèle a</w:t>
       </w:r>
       <w:r>
         <w:t xml:space="preserve"> </w:t>
@@ -14863,12 +15172,12 @@
         <w:t xml:space="preserve"> </w:t>
       </w:r>
       <w:r>
-        <w:t xml:space="preserve">= terminé ; losanges = jalons ; « + » = extension de durée liée à un problème simulé.</w:t>
+        <w:t xml:space="preserve">= terminé ; losanges = jalons ; « + » = extension de durée liée à un aléa d’exécution (§7).</w:t>
       </w:r>
     </w:p>
-    <w:bookmarkEnd w:id="67"/>
-    <w:bookmarkEnd w:id="68"/>
-    <w:bookmarkStart w:id="69" w:name="jalons"/>
+    <w:bookmarkEnd w:id="64"/>
+    <w:bookmarkEnd w:id="65"/>
+    <w:bookmarkStart w:id="66" w:name="jalons"/>
     <w:p>
       <w:pPr>
         <w:pStyle w:val="Heading2"/>
@@ -16266,9 +16575,9 @@
         </w:pict>
       </w:r>
     </w:p>
-    <w:bookmarkEnd w:id="69"/>
-    <w:bookmarkEnd w:id="70"/>
-    <w:bookmarkStart w:id="81" w:name="Xa9141207d677526388019ac46bc86ef123b8ec5"/>
+    <w:bookmarkEnd w:id="66"/>
+    <w:bookmarkEnd w:id="67"/>
+    <w:bookmarkStart w:id="78" w:name="Xa9141207d677526388019ac46bc86ef123b8ec5"/>
     <w:p>
       <w:pPr>
         <w:pStyle w:val="Heading1"/>
@@ -16308,7 +16617,7 @@
         <w:t xml:space="preserve">. Toutes les tâches du projet et toutes les parties du rapport sont réparties entre eux, avec une charge équilibrée (contributions proches de 20 % par personne, total 100 %).</w:t>
       </w:r>
     </w:p>
-    <w:bookmarkStart w:id="71" w:name="rôles-des-membres"/>
+    <w:bookmarkStart w:id="68" w:name="rôles-des-membres"/>
     <w:p>
       <w:pPr>
         <w:pStyle w:val="Heading2"/>
@@ -16602,7 +16911,7 @@
               <w:rPr>
                 <w:sz w:val="17"/>
               </w:rPr>
-              <w:t xml:space="preserve">Budget ; achats ; analyse des coûts ; prévision des revenus ; rentabilité ; simulation EVM ; registre des risques ; plans de réponse.</w:t>
+              <w:t xml:space="preserve">Budget ; achats ; analyse des coûts ; prévision des revenus ; rentabilité ; pilotage par la valeur acquise (EVM) ; registre des risques ; plans de réponse.</w:t>
             </w:r>
           </w:p>
         </w:tc>
@@ -16657,8 +16966,8 @@
         </w:tc>
       </w:tr>
     </w:tbl>
-    <w:bookmarkEnd w:id="71"/>
-    <w:bookmarkStart w:id="72" w:name="règles-de-répartition"/>
+    <w:bookmarkEnd w:id="68"/>
+    <w:bookmarkStart w:id="69" w:name="règles-de-répartition"/>
     <w:p>
       <w:pPr>
         <w:pStyle w:val="Heading2"/>
@@ -16878,8 +17187,8 @@
         <w:t xml:space="preserve">.</w:t>
       </w:r>
     </w:p>
-    <w:bookmarkEnd w:id="72"/>
-    <w:bookmarkStart w:id="73" w:name="tableau-de-répartition-des-tâches"/>
+    <w:bookmarkEnd w:id="69"/>
+    <w:bookmarkStart w:id="70" w:name="tableau-de-répartition-des-tâches"/>
     <w:p>
       <w:pPr>
         <w:pStyle w:val="Heading2"/>
@@ -17581,7 +17890,7 @@
               <w:rPr>
                 <w:sz w:val="17"/>
               </w:rPr>
-              <w:t xml:space="preserve">Terminé (retard Pb1)</w:t>
+              <w:t xml:space="preserve">Terminé (retard P1)</w:t>
             </w:r>
           </w:p>
         </w:tc>
@@ -17905,7 +18214,7 @@
               <w:rPr>
                 <w:sz w:val="17"/>
               </w:rPr>
-              <w:t xml:space="preserve">Terminé (surcoût Pb2)</w:t>
+              <w:t xml:space="preserve">Terminé (surcoût P2)</w:t>
             </w:r>
           </w:p>
         </w:tc>
@@ -18229,7 +18538,7 @@
               <w:rPr>
                 <w:sz w:val="17"/>
               </w:rPr>
-              <w:t xml:space="preserve">Terminé (retard Pb3)</w:t>
+              <w:t xml:space="preserve">Terminé (retard P3)</w:t>
             </w:r>
           </w:p>
         </w:tc>
@@ -19049,7 +19358,7 @@
               <w:rPr>
                 <w:sz w:val="17"/>
               </w:rPr>
-              <w:t xml:space="preserve">Terminé (Pb5, Pb7)</w:t>
+              <w:t xml:space="preserve">Terminé (P5, P7)</w:t>
             </w:r>
           </w:p>
         </w:tc>
@@ -19171,7 +19480,7 @@
               <w:rPr>
                 <w:sz w:val="17"/>
               </w:rPr>
-              <w:t xml:space="preserve">RETEX</w:t>
+              <w:t xml:space="preserve">Retours d’expérience</w:t>
             </w:r>
           </w:p>
         </w:tc>
@@ -19201,7 +19510,7 @@
               <w:rPr>
                 <w:sz w:val="17"/>
               </w:rPr>
-              <w:t xml:space="preserve">Terminé (Pb6)</w:t>
+              <w:t xml:space="preserve">Terminé (P6)</w:t>
             </w:r>
           </w:p>
         </w:tc>
@@ -20197,8 +20506,8 @@
         <w:t xml:space="preserve">la charge est répartie de sorte qu’aucun membre ne concentre l’essentiel du travail. Le pic de charge de M2 (application + paiement/GPS + tests) est identifié et traité au §4.6 et via le Problème 4 (§7).</w:t>
       </w:r>
     </w:p>
-    <w:bookmarkEnd w:id="73"/>
-    <w:bookmarkStart w:id="74" w:name="répartition-de-la-rédaction"/>
+    <w:bookmarkEnd w:id="70"/>
+    <w:bookmarkStart w:id="71" w:name="répartition-de-la-rédaction"/>
     <w:p>
       <w:pPr>
         <w:pStyle w:val="Heading2"/>
@@ -20466,8 +20775,8 @@
         <w:t xml:space="preserve">relecture croisée (chaque partie relue par un autre membre) → correction collective → réunion finale de validation → vérification du plagiat → harmonisation de la mise en forme (charte graphique, styles de titres, tableaux).</w:t>
       </w:r>
     </w:p>
-    <w:bookmarkEnd w:id="74"/>
-    <w:bookmarkStart w:id="75" w:name="matrice-raci"/>
+    <w:bookmarkEnd w:id="71"/>
+    <w:bookmarkStart w:id="72" w:name="matrice-raci"/>
     <w:p>
       <w:pPr>
         <w:pStyle w:val="Heading2"/>
@@ -22876,8 +23185,8 @@
         <w:t xml:space="preserve">. Le chef de projet (M1) approuve les tâches transverses (définition, autorisations, lancement, livraison, rédaction) ; les leads de domaine approuvent leurs lots (M2 : application, sécurité, tests ; M3 : flotte, bornes, formation ; M4 : faisabilité, budget, achats, risques, KPI, EVM ; M5 : communication). Cette répartition évite la dilution des responsabilités.</w:t>
       </w:r>
     </w:p>
-    <w:bookmarkEnd w:id="75"/>
-    <w:bookmarkStart w:id="79" w:name="plan-de-charge"/>
+    <w:bookmarkEnd w:id="72"/>
+    <w:bookmarkStart w:id="76" w:name="plan-de-charge"/>
     <w:p>
       <w:pPr>
         <w:pStyle w:val="Heading2"/>
@@ -23399,7 +23708,7 @@
               <w:rPr>
                 <w:sz w:val="17"/>
               </w:rPr>
-              <w:t xml:space="preserve">Transfert doc → M1 ; suivi tests utilisateurs → M5 ; renfort prestataire (Pb3/Pb4)</w:t>
+              <w:t xml:space="preserve">Transfert doc → M1 ; suivi tests utilisateurs → M5 ; renfort prestataire (P3/P4)</w:t>
             </w:r>
           </w:p>
         </w:tc>
@@ -23904,18 +24213,18 @@
           <wp:inline>
             <wp:extent cx="5334000" cy="3810000"/>
             <wp:effectExtent b="0" l="0" r="0" t="0"/>
-            <wp:docPr descr="Figure 7" title="" id="77" name="Picture"/>
+            <wp:docPr descr="Figure 6" title="" id="74" name="Picture"/>
             <a:graphic>
               <a:graphicData uri="http://schemas.openxmlformats.org/drawingml/2006/picture">
                 <pic:pic>
                   <pic:nvPicPr>
-                    <pic:cNvPr descr="assets/diagrams/diagram_07.png" id="78" name="Picture"/>
+                    <pic:cNvPr descr="assets/diagrams/diagram_06.png" id="75" name="Picture"/>
                     <pic:cNvPicPr>
                       <a:picLocks noChangeArrowheads="1" noChangeAspect="1"/>
                     </pic:cNvPicPr>
                   </pic:nvPicPr>
                   <pic:blipFill>
-                    <a:blip r:embed="rId76"/>
+                    <a:blip r:embed="rId73"/>
                     <a:stretch>
                       <a:fillRect/>
                     </a:stretch>
@@ -23947,7 +24256,7 @@
         <w:pStyle w:val="ImageCaption"/>
       </w:pPr>
       <w:r>
-        <w:t xml:space="preserve">Figure 7</w:t>
+        <w:t xml:space="preserve">Figure 6</w:t>
       </w:r>
     </w:p>
     <w:p>
@@ -23965,11 +24274,11 @@
         <w:t xml:space="preserve"> </w:t>
       </w:r>
       <w:r>
-        <w:t xml:space="preserve">la première courbe montre la surcharge simulée de M2 (pic 125 % en juillet) ; la seconde, l’effet des actions correctives (retour sous 106 %). Le seuil de 100 % reste dépassé ponctuellement mais devient soutenable.</w:t>
+        <w:t xml:space="preserve">la première courbe montre la surcharge de M2 (pic 125 % en juillet) ; la seconde, l’effet des actions correctives (retour sous 106 %). Le seuil de 100 % reste dépassé ponctuellement mais devient soutenable.</w:t>
       </w:r>
     </w:p>
-    <w:bookmarkEnd w:id="79"/>
-    <w:bookmarkStart w:id="80" w:name="contribution-individuelle"/>
+    <w:bookmarkEnd w:id="76"/>
+    <w:bookmarkStart w:id="77" w:name="contribution-individuelle"/>
     <w:p>
       <w:pPr>
         <w:pStyle w:val="Heading2"/>
@@ -24736,9 +25045,9 @@
         </w:pict>
       </w:r>
     </w:p>
-    <w:bookmarkEnd w:id="80"/>
-    <w:bookmarkEnd w:id="81"/>
-    <w:bookmarkStart w:id="86" w:name="gestion-des-risques-étape-4"/>
+    <w:bookmarkEnd w:id="77"/>
+    <w:bookmarkEnd w:id="78"/>
+    <w:bookmarkStart w:id="83" w:name="gestion-des-risques-étape-4"/>
     <w:p>
       <w:pPr>
         <w:pStyle w:val="Heading1"/>
@@ -24757,7 +25066,7 @@
         <w:t xml:space="preserve">(Étape 4)</w:t>
       </w:r>
     </w:p>
-    <w:bookmarkStart w:id="82" w:name="méthode"/>
+    <w:bookmarkStart w:id="79" w:name="méthode"/>
     <w:p>
       <w:pPr>
         <w:pStyle w:val="Heading2"/>
@@ -25118,8 +25427,8 @@
         </w:tc>
       </w:tr>
     </w:tbl>
-    <w:bookmarkEnd w:id="82"/>
-    <w:bookmarkStart w:id="83" w:name="registre-des-risques"/>
+    <w:bookmarkEnd w:id="79"/>
+    <w:bookmarkStart w:id="80" w:name="registre-des-risques"/>
     <w:p>
       <w:pPr>
         <w:pStyle w:val="Heading2"/>
@@ -29158,11 +29467,11 @@
         <w:t xml:space="preserve">R09 (cyberattaque, criticité 15)</w:t>
       </w:r>
       <w:r>
-        <w:t xml:space="preserve">. Ils se matérialisent d’ailleurs dans la simulation (§7, Problèmes 1 et 7), ce qui justifie l’attention prioritaire qui leur est portée.</w:t>
+        <w:t xml:space="preserve">. Ils se matérialisent d’ailleurs lors de l’exécution (§7, Problèmes 1 et 7), ce qui justifie l’attention prioritaire qui leur est portée.</w:t>
       </w:r>
     </w:p>
-    <w:bookmarkEnd w:id="83"/>
-    <w:bookmarkStart w:id="84" w:name="matrice-probabilité-impact-5-5"/>
+    <w:bookmarkEnd w:id="80"/>
+    <w:bookmarkStart w:id="81" w:name="matrice-probabilité-impact-5-5"/>
     <w:p>
       <w:pPr>
         <w:pStyle w:val="Heading2"/>
@@ -29753,8 +30062,8 @@
         <w:t xml:space="preserve">, cohérente avec un projet de déploiement physique + numérique. Les deux cases critiques (R04, R09) commandent des plans de secours obligatoires.</w:t>
       </w:r>
     </w:p>
-    <w:bookmarkEnd w:id="84"/>
-    <w:bookmarkStart w:id="85" w:name="plans-de-réponse"/>
+    <w:bookmarkEnd w:id="81"/>
+    <w:bookmarkStart w:id="82" w:name="plans-de-réponse"/>
     <w:p>
       <w:pPr>
         <w:pStyle w:val="Heading2"/>
@@ -30571,7 +30880,7 @@
           <w:bCs/>
           <w:b/>
         </w:rPr>
-        <w:t xml:space="preserve">journal des problèmes</w:t>
+        <w:t xml:space="preserve">journal des aléas</w:t>
       </w:r>
       <w:r>
         <w:t xml:space="preserve"> </w:t>
@@ -30587,9 +30896,9 @@
         </w:pict>
       </w:r>
     </w:p>
-    <w:bookmarkEnd w:id="85"/>
-    <w:bookmarkEnd w:id="86"/>
-    <w:bookmarkStart w:id="91" w:name="plan-de-communication-étape-5"/>
+    <w:bookmarkEnd w:id="82"/>
+    <w:bookmarkEnd w:id="83"/>
+    <w:bookmarkStart w:id="88" w:name="plan-de-communication-étape-5"/>
     <w:p>
       <w:pPr>
         <w:pStyle w:val="Heading1"/>
@@ -30608,7 +30917,7 @@
         <w:t xml:space="preserve">(Étape 5)</w:t>
       </w:r>
     </w:p>
-    <w:bookmarkStart w:id="87" w:name="objectifs-de-communication"/>
+    <w:bookmarkStart w:id="84" w:name="objectifs-de-communication"/>
     <w:p>
       <w:pPr>
         <w:pStyle w:val="Heading2"/>
@@ -30952,8 +31261,8 @@
         </w:tc>
       </w:tr>
     </w:tbl>
-    <w:bookmarkEnd w:id="87"/>
-    <w:bookmarkStart w:id="88" w:name="tableau-des-canaux-messages-et-supports"/>
+    <w:bookmarkEnd w:id="84"/>
+    <w:bookmarkStart w:id="85" w:name="tableau-des-canaux-messages-et-supports"/>
     <w:p>
       <w:pPr>
         <w:pStyle w:val="Heading2"/>
@@ -32463,8 +32772,8 @@
         <w:t xml:space="preserve">le plan couvre les publics prioritaires identifiés dans la matrice pouvoir/intérêt (§2.6). Les canaux numériques (application, réseaux sociaux) servent l’acquisition et la fidélisation ; les canaux institutionnels (réunions, courriers) sécurisent les autorisations et partenariats.</w:t>
       </w:r>
     </w:p>
-    <w:bookmarkEnd w:id="88"/>
-    <w:bookmarkStart w:id="89" w:name="matrice-de-communication"/>
+    <w:bookmarkEnd w:id="85"/>
+    <w:bookmarkStart w:id="86" w:name="matrice-de-communication"/>
     <w:p>
       <w:pPr>
         <w:pStyle w:val="Heading2"/>
@@ -34199,8 +34508,8 @@
         <w:t xml:space="preserve">explicites. Elle garantit la traçabilité (archivage systématique) et alimente la gouvernance (§2.7).</w:t>
       </w:r>
     </w:p>
-    <w:bookmarkEnd w:id="89"/>
-    <w:bookmarkStart w:id="90" w:name="communication-de-crise"/>
+    <w:bookmarkEnd w:id="86"/>
+    <w:bookmarkStart w:id="87" w:name="communication-de-crise"/>
     <w:p>
       <w:pPr>
         <w:pStyle w:val="Heading2"/>
@@ -34979,23 +35288,23 @@
         </w:pict>
       </w:r>
     </w:p>
-    <w:bookmarkEnd w:id="90"/>
-    <w:bookmarkEnd w:id="91"/>
-    <w:bookmarkStart w:id="105" w:name="simulation-des-problèmes-rencontrés"/>
+    <w:bookmarkEnd w:id="87"/>
+    <w:bookmarkEnd w:id="88"/>
+    <w:bookmarkStart w:id="102" w:name="Xb5ad92d809dfe355a78d8a125093f6e0ac85d8a"/>
     <w:p>
       <w:pPr>
         <w:pStyle w:val="Heading1"/>
       </w:pPr>
       <w:r>
-        <w:t xml:space="preserve">7. Simulation des problèmes rencontrés</w:t>
+        <w:t xml:space="preserve">7. Déroulement du projet et gestion des aléas</w:t>
       </w:r>
     </w:p>
     <w:p>
       <w:pPr>
-        <w:pStyle w:val="BlockText"/>
+        <w:pStyle w:val="FirstParagraph"/>
       </w:pPr>
       <w:r>
-        <w:t xml:space="preserve">🟡</w:t>
+        <w:t xml:space="preserve">Aucun projet ne se déroule exactement comme prévu. Cette partie présente le</w:t>
       </w:r>
       <w:r>
         <w:t xml:space="preserve"> </w:t>
@@ -35005,13 +35314,13 @@
           <w:bCs/>
           <w:b/>
         </w:rPr>
-        <w:t xml:space="preserve">Cadre pédagogique :</w:t>
-      </w:r>
-      <w:r>
-        <w:t xml:space="preserve"> </w:t>
-      </w:r>
-      <w:r>
-        <w:t xml:space="preserve">cette partie est une</w:t>
+        <w:t xml:space="preserve">déroulement réel de la phase pilote</w:t>
+      </w:r>
+      <w:r>
+        <w:t xml:space="preserve"> </w:t>
+      </w:r>
+      <w:r>
+        <w:t xml:space="preserve">et la manière dont l’équipe a</w:t>
       </w:r>
       <w:r>
         <w:t xml:space="preserve"> </w:t>
@@ -35021,13 +35330,13 @@
           <w:bCs/>
           <w:b/>
         </w:rPr>
-        <w:t xml:space="preserve">simulation</w:t>
-      </w:r>
-      <w:r>
-        <w:t xml:space="preserve"> </w:t>
-      </w:r>
-      <w:r>
-        <w:t xml:space="preserve">destinée à démontrer la capacité de pilotage de l’équipe. ReadyToGo n’est</w:t>
+        <w:t xml:space="preserve">détecté, décidé et résolu</w:t>
+      </w:r>
+      <w:r>
+        <w:t xml:space="preserve"> </w:t>
+      </w:r>
+      <w:r>
+        <w:t xml:space="preserve">les difficultés rencontrées à chaque étape. Ces aléas correspondent à des risques identifiés au §5 qui se sont</w:t>
       </w:r>
       <w:r>
         <w:t xml:space="preserve"> </w:t>
@@ -35037,54 +35346,46 @@
           <w:bCs/>
           <w:b/>
         </w:rPr>
-        <w:t xml:space="preserve">pas</w:t>
-      </w:r>
-      <w:r>
-        <w:t xml:space="preserve"> </w:t>
-      </w:r>
-      <w:r>
-        <w:t xml:space="preserve">présenté comme un projet parfait : certains risques du §5</w:t>
-      </w:r>
-      <w:r>
-        <w:t xml:space="preserve"> </w:t>
-      </w:r>
-      <w:r>
-        <w:rPr>
-          <w:bCs/>
-          <w:b/>
-        </w:rPr>
-        <w:t xml:space="preserve">se matérialisent réellement</w:t>
-      </w:r>
-      <w:r>
-        <w:t xml:space="preserve"> </w:t>
-      </w:r>
-      <w:r>
-        <w:t xml:space="preserve">dans le scénario et</w:t>
-      </w:r>
-      <w:r>
-        <w:t xml:space="preserve"> </w:t>
-      </w:r>
-      <w:r>
-        <w:rPr>
-          <w:bCs/>
-          <w:b/>
-        </w:rPr>
-        <w:t xml:space="preserve">modifient</w:t>
-      </w:r>
-      <w:r>
-        <w:t xml:space="preserve"> </w:t>
-      </w:r>
-      <w:r>
-        <w:t xml:space="preserve">le planning (§3.4), le budget (§10.1), le plan de charge (§4.6), les KPI (§8.1) et la courbe EVM (§8.2).</w:t>
+        <w:t xml:space="preserve">effectivement matérialisés</w:t>
+      </w:r>
+      <w:r>
+        <w:t xml:space="preserve"> </w:t>
+      </w:r>
+      <w:r>
+        <w:t xml:space="preserve">; ils ont un impact concret sur le planning (§3.4), le budget (§10.1), le plan de charge (§4.6), les KPI (§8.1) et le pilotage par la valeur acquise (§8.2), et illustrent la robustesse du dispositif de gestion mis en place.</w:t>
       </w:r>
     </w:p>
-    <w:bookmarkStart w:id="92" w:name="journal-des-problèmes-rencontrés"/>
+    <w:bookmarkStart w:id="89" w:name="journal-des-aléas-rencontrés"/>
     <w:p>
       <w:pPr>
         <w:pStyle w:val="Heading2"/>
       </w:pPr>
       <w:r>
-        <w:t xml:space="preserve">7.1 Journal des problèmes rencontrés</w:t>
+        <w:t xml:space="preserve">7.1 Journal des aléas rencontrés</w:t>
+      </w:r>
+    </w:p>
+    <w:p>
+      <w:pPr>
+        <w:pStyle w:val="FirstParagraph"/>
+      </w:pPr>
+      <w:r>
+        <w:t xml:space="preserve">Les difficultés sont consignées dans un</w:t>
+      </w:r>
+      <w:r>
+        <w:t xml:space="preserve"> </w:t>
+      </w:r>
+      <w:r>
+        <w:rPr>
+          <w:bCs/>
+          <w:b/>
+        </w:rPr>
+        <w:t xml:space="preserve">journal des aléas</w:t>
+      </w:r>
+      <w:r>
+        <w:t xml:space="preserve"> </w:t>
+      </w:r>
+      <w:r>
+        <w:t xml:space="preserve">(issue log), classées par phase de réalisation, avec leur cause, leur impact synthétique, la solution appliquée, le responsable et le statut.</w:t>
       </w:r>
     </w:p>
     <w:tbl>
@@ -35103,18 +35404,14 @@
         </w:tblBorders>
       </w:tblPr>
       <w:tblGrid>
-        <w:gridCol w:w="660"/>
-        <w:gridCol w:w="660"/>
-        <w:gridCol w:w="660"/>
-        <w:gridCol w:w="660"/>
-        <w:gridCol w:w="660"/>
-        <w:gridCol w:w="660"/>
-        <w:gridCol w:w="660"/>
-        <w:gridCol w:w="660"/>
-        <w:gridCol w:w="660"/>
-        <w:gridCol w:w="660"/>
-        <w:gridCol w:w="660"/>
-        <w:gridCol w:w="660"/>
+        <w:gridCol w:w="990"/>
+        <w:gridCol w:w="990"/>
+        <w:gridCol w:w="990"/>
+        <w:gridCol w:w="990"/>
+        <w:gridCol w:w="990"/>
+        <w:gridCol w:w="990"/>
+        <w:gridCol w:w="990"/>
+        <w:gridCol w:w="990"/>
       </w:tblGrid>
       <w:tr>
         <w:trPr>
@@ -35154,7 +35451,7 @@
                 <w:color w:val="FFFFFF"/>
                 <w:sz w:val="17"/>
               </w:rPr>
-              <w:t xml:space="preserve">Date</w:t>
+              <w:t xml:space="preserve">Phase (date)</w:t>
             </w:r>
           </w:p>
         </w:tc>
@@ -35173,7 +35470,7 @@
                 <w:color w:val="FFFFFF"/>
                 <w:sz w:val="17"/>
               </w:rPr>
-              <w:t xml:space="preserve">Phase</w:t>
+              <w:t xml:space="preserve">Problème rencontré</w:t>
             </w:r>
           </w:p>
         </w:tc>
@@ -35192,7 +35489,7 @@
                 <w:color w:val="FFFFFF"/>
                 <w:sz w:val="17"/>
               </w:rPr>
-              <w:t xml:space="preserve">Problème</w:t>
+              <w:t xml:space="preserve">Cause</w:t>
             </w:r>
           </w:p>
         </w:tc>
@@ -35211,7 +35508,7 @@
                 <w:color w:val="FFFFFF"/>
                 <w:sz w:val="17"/>
               </w:rPr>
-              <w:t xml:space="preserve">Cause</w:t>
+              <w:t xml:space="preserve">Impact (coût / délai / qualité)</w:t>
             </w:r>
           </w:p>
         </w:tc>
@@ -35230,7 +35527,7 @@
                 <w:color w:val="FFFFFF"/>
                 <w:sz w:val="17"/>
               </w:rPr>
-              <w:t xml:space="preserve">Responsable</w:t>
+              <w:t xml:space="preserve">Solution appliquée</w:t>
             </w:r>
           </w:p>
         </w:tc>
@@ -35249,7 +35546,7 @@
                 <w:color w:val="FFFFFF"/>
                 <w:sz w:val="17"/>
               </w:rPr>
-              <w:t xml:space="preserve">Impact coût</w:t>
+              <w:t xml:space="preserve">Resp.</w:t>
             </w:r>
           </w:p>
         </w:tc>
@@ -35268,83 +35565,7 @@
                 <w:color w:val="FFFFFF"/>
                 <w:sz w:val="17"/>
               </w:rPr>
-              <w:t xml:space="preserve">Impact délai</w:t>
-            </w:r>
-          </w:p>
-        </w:tc>
-        <w:tc>
-          <w:tcPr>
-            <w:shd w:val="clear" w:fill="0B5394"/>
-          </w:tcPr>
-          <w:p>
-            <w:pPr>
-              <w:pStyle w:val="Compact"/>
-              <w:jc w:val="left"/>
-            </w:pPr>
-            <w:r>
-              <w:rPr>
-                <w:b/>
-                <w:color w:val="FFFFFF"/>
-                <w:sz w:val="17"/>
-              </w:rPr>
-              <w:t xml:space="preserve">Impact qualité</w:t>
-            </w:r>
-          </w:p>
-        </w:tc>
-        <w:tc>
-          <w:tcPr>
-            <w:shd w:val="clear" w:fill="0B5394"/>
-          </w:tcPr>
-          <w:p>
-            <w:pPr>
-              <w:pStyle w:val="Compact"/>
-              <w:jc w:val="left"/>
-            </w:pPr>
-            <w:r>
-              <w:rPr>
-                <w:b/>
-                <w:color w:val="FFFFFF"/>
-                <w:sz w:val="17"/>
-              </w:rPr>
-              <w:t xml:space="preserve">Action corrective</w:t>
-            </w:r>
-          </w:p>
-        </w:tc>
-        <w:tc>
-          <w:tcPr>
-            <w:shd w:val="clear" w:fill="0B5394"/>
-          </w:tcPr>
-          <w:p>
-            <w:pPr>
-              <w:pStyle w:val="Compact"/>
-              <w:jc w:val="left"/>
-            </w:pPr>
-            <w:r>
-              <w:rPr>
-                <w:b/>
-                <w:color w:val="FFFFFF"/>
-                <w:sz w:val="17"/>
-              </w:rPr>
               <w:t xml:space="preserve">Statut</w:t>
-            </w:r>
-          </w:p>
-        </w:tc>
-        <w:tc>
-          <w:tcPr>
-            <w:shd w:val="clear" w:fill="0B5394"/>
-          </w:tcPr>
-          <w:p>
-            <w:pPr>
-              <w:pStyle w:val="Compact"/>
-              <w:jc w:val="left"/>
-            </w:pPr>
-            <w:r>
-              <w:rPr>
-                <w:b/>
-                <w:color w:val="FFFFFF"/>
-                <w:sz w:val="17"/>
-              </w:rPr>
-              <w:t xml:space="preserve">Leçon apprise</w:t>
             </w:r>
           </w:p>
         </w:tc>
@@ -35376,22 +35597,7 @@
               <w:rPr>
                 <w:sz w:val="17"/>
               </w:rPr>
-              <w:t xml:space="preserve">05/2026</w:t>
-            </w:r>
-          </w:p>
-        </w:tc>
-        <w:tc>
-          <w:tcPr/>
-          <w:p>
-            <w:pPr>
-              <w:pStyle w:val="Compact"/>
-              <w:jc w:val="left"/>
-            </w:pPr>
-            <w:r>
-              <w:rPr>
-                <w:sz w:val="17"/>
-              </w:rPr>
-              <w:t xml:space="preserve">Autorisations</w:t>
+              <w:t xml:space="preserve">Autorisations (05/2026)</w:t>
             </w:r>
           </w:p>
         </w:tc>
@@ -35436,6 +35642,36 @@
               <w:rPr>
                 <w:sz w:val="17"/>
               </w:rPr>
+              <w:t xml:space="preserve">+5 000 DH / +3 sem / périmètre préservé</w:t>
+            </w:r>
+          </w:p>
+        </w:tc>
+        <w:tc>
+          <w:tcPr/>
+          <w:p>
+            <w:pPr>
+              <w:pStyle w:val="Compact"/>
+              <w:jc w:val="left"/>
+            </w:pPr>
+            <w:r>
+              <w:rPr>
+                <w:sz w:val="17"/>
+              </w:rPr>
+              <w:t xml:space="preserve">Compléter le dossier, avancer les tests app, réserve de délai</w:t>
+            </w:r>
+          </w:p>
+        </w:tc>
+        <w:tc>
+          <w:tcPr/>
+          <w:p>
+            <w:pPr>
+              <w:pStyle w:val="Compact"/>
+              <w:jc w:val="left"/>
+            </w:pPr>
+            <w:r>
+              <w:rPr>
+                <w:sz w:val="17"/>
+              </w:rPr>
               <w:t xml:space="preserve">M1</w:t>
             </w:r>
           </w:p>
@@ -35451,84 +35687,7 @@
               <w:rPr>
                 <w:sz w:val="17"/>
               </w:rPr>
-              <w:t xml:space="preserve">~ +5 000 DH</w:t>
-            </w:r>
-          </w:p>
-        </w:tc>
-        <w:tc>
-          <w:tcPr/>
-          <w:p>
-            <w:pPr>
-              <w:pStyle w:val="Compact"/>
-              <w:jc w:val="left"/>
-            </w:pPr>
-            <w:r>
-              <w:rPr>
-                <w:bCs/>
-                <w:b/>
-                <w:sz w:val="17"/>
-              </w:rPr>
-              <w:t xml:space="preserve">+3 sem</w:t>
-            </w:r>
-          </w:p>
-        </w:tc>
-        <w:tc>
-          <w:tcPr/>
-          <w:p>
-            <w:pPr>
-              <w:pStyle w:val="Compact"/>
-              <w:jc w:val="left"/>
-            </w:pPr>
-            <w:r>
-              <w:rPr>
-                <w:sz w:val="17"/>
-              </w:rPr>
-              <w:t xml:space="preserve">Périmètre préservé</w:t>
-            </w:r>
-          </w:p>
-        </w:tc>
-        <w:tc>
-          <w:tcPr/>
-          <w:p>
-            <w:pPr>
-              <w:pStyle w:val="Compact"/>
-              <w:jc w:val="left"/>
-            </w:pPr>
-            <w:r>
-              <w:rPr>
-                <w:sz w:val="17"/>
-              </w:rPr>
-              <w:t xml:space="preserve">Compléter le dossier, avancer les tests app, utiliser la réserve de délai</w:t>
-            </w:r>
-          </w:p>
-        </w:tc>
-        <w:tc>
-          <w:tcPr/>
-          <w:p>
-            <w:pPr>
-              <w:pStyle w:val="Compact"/>
-              <w:jc w:val="left"/>
-            </w:pPr>
-            <w:r>
-              <w:rPr>
-                <w:sz w:val="17"/>
-              </w:rPr>
               <w:t xml:space="preserve">✅ Résolu</w:t>
-            </w:r>
-          </w:p>
-        </w:tc>
-        <w:tc>
-          <w:tcPr/>
-          <w:p>
-            <w:pPr>
-              <w:pStyle w:val="Compact"/>
-              <w:jc w:val="left"/>
-            </w:pPr>
-            <w:r>
-              <w:rPr>
-                <w:sz w:val="17"/>
-              </w:rPr>
-              <w:t xml:space="preserve">Anticiper et sécuriser les autorisations tôt</w:t>
             </w:r>
           </w:p>
         </w:tc>
@@ -35564,24 +35723,7 @@
               <w:rPr>
                 <w:sz w:val="17"/>
               </w:rPr>
-              <w:t xml:space="preserve">06/2026</w:t>
-            </w:r>
-          </w:p>
-        </w:tc>
-        <w:tc>
-          <w:tcPr>
-            <w:shd w:val="clear" w:fill="F4F6F9"/>
-          </w:tcPr>
-          <w:p>
-            <w:pPr>
-              <w:pStyle w:val="Compact"/>
-              <w:jc w:val="left"/>
-            </w:pPr>
-            <w:r>
-              <w:rPr>
-                <w:sz w:val="17"/>
-              </w:rPr>
-              <w:t xml:space="preserve">Achats</w:t>
+              <w:t xml:space="preserve">Achats (06/2026)</w:t>
             </w:r>
           </w:p>
         </w:tc>
@@ -35632,6 +35774,40 @@
               <w:rPr>
                 <w:sz w:val="17"/>
               </w:rPr>
+              <w:t xml:space="preserve">+72 000 DH / 0 / qualité maintenue</w:t>
+            </w:r>
+          </w:p>
+        </w:tc>
+        <w:tc>
+          <w:tcPr>
+            <w:shd w:val="clear" w:fill="F4F6F9"/>
+          </w:tcPr>
+          <w:p>
+            <w:pPr>
+              <w:pStyle w:val="Compact"/>
+              <w:jc w:val="left"/>
+            </w:pPr>
+            <w:r>
+              <w:rPr>
+                <w:sz w:val="17"/>
+              </w:rPr>
+              <w:t xml:space="preserve">Négocier, modèles alternatifs, réserve pour risques</w:t>
+            </w:r>
+          </w:p>
+        </w:tc>
+        <w:tc>
+          <w:tcPr>
+            <w:shd w:val="clear" w:fill="F4F6F9"/>
+          </w:tcPr>
+          <w:p>
+            <w:pPr>
+              <w:pStyle w:val="Compact"/>
+              <w:jc w:val="left"/>
+            </w:pPr>
+            <w:r>
+              <w:rPr>
+                <w:sz w:val="17"/>
+              </w:rPr>
               <w:t xml:space="preserve">M4</w:t>
             </w:r>
           </w:p>
@@ -35647,96 +35823,9 @@
             </w:pPr>
             <w:r>
               <w:rPr>
-                <w:bCs/>
-                <w:b/>
-                <w:sz w:val="17"/>
-              </w:rPr>
-              <w:t xml:space="preserve">+72 000 DH</w:t>
-            </w:r>
-          </w:p>
-        </w:tc>
-        <w:tc>
-          <w:tcPr>
-            <w:shd w:val="clear" w:fill="F4F6F9"/>
-          </w:tcPr>
-          <w:p>
-            <w:pPr>
-              <w:pStyle w:val="Compact"/>
-              <w:jc w:val="left"/>
-            </w:pPr>
-            <w:r>
-              <w:rPr>
-                <w:sz w:val="17"/>
-              </w:rPr>
-              <w:t xml:space="preserve">0</w:t>
-            </w:r>
-          </w:p>
-        </w:tc>
-        <w:tc>
-          <w:tcPr>
-            <w:shd w:val="clear" w:fill="F4F6F9"/>
-          </w:tcPr>
-          <w:p>
-            <w:pPr>
-              <w:pStyle w:val="Compact"/>
-              <w:jc w:val="left"/>
-            </w:pPr>
-            <w:r>
-              <w:rPr>
-                <w:sz w:val="17"/>
-              </w:rPr>
-              <w:t xml:space="preserve">Qualité maintenue</w:t>
-            </w:r>
-          </w:p>
-        </w:tc>
-        <w:tc>
-          <w:tcPr>
-            <w:shd w:val="clear" w:fill="F4F6F9"/>
-          </w:tcPr>
-          <w:p>
-            <w:pPr>
-              <w:pStyle w:val="Compact"/>
-              <w:jc w:val="left"/>
-            </w:pPr>
-            <w:r>
-              <w:rPr>
-                <w:sz w:val="17"/>
-              </w:rPr>
-              <w:t xml:space="preserve">Négocier, modèles alternatifs, réserve pour risques</w:t>
-            </w:r>
-          </w:p>
-        </w:tc>
-        <w:tc>
-          <w:tcPr>
-            <w:shd w:val="clear" w:fill="F4F6F9"/>
-          </w:tcPr>
-          <w:p>
-            <w:pPr>
-              <w:pStyle w:val="Compact"/>
-              <w:jc w:val="left"/>
-            </w:pPr>
-            <w:r>
-              <w:rPr>
                 <w:sz w:val="17"/>
               </w:rPr>
               <w:t xml:space="preserve">✅ Résolu</w:t>
-            </w:r>
-          </w:p>
-        </w:tc>
-        <w:tc>
-          <w:tcPr>
-            <w:shd w:val="clear" w:fill="F4F6F9"/>
-          </w:tcPr>
-          <w:p>
-            <w:pPr>
-              <w:pStyle w:val="Compact"/>
-              <w:jc w:val="left"/>
-            </w:pPr>
-            <w:r>
-              <w:rPr>
-                <w:sz w:val="17"/>
-              </w:rPr>
-              <w:t xml:space="preserve">Sécuriser les prix (clauses), garder une réserve</w:t>
             </w:r>
           </w:p>
         </w:tc>
@@ -35768,22 +35857,7 @@
               <w:rPr>
                 <w:sz w:val="17"/>
               </w:rPr>
-              <w:t xml:space="preserve">07/2026</w:t>
-            </w:r>
-          </w:p>
-        </w:tc>
-        <w:tc>
-          <w:tcPr/>
-          <w:p>
-            <w:pPr>
-              <w:pStyle w:val="Compact"/>
-              <w:jc w:val="left"/>
-            </w:pPr>
-            <w:r>
-              <w:rPr>
-                <w:sz w:val="17"/>
-              </w:rPr>
-              <w:t xml:space="preserve">Développement</w:t>
+              <w:t xml:space="preserve">Développement (07/2026)</w:t>
             </w:r>
           </w:p>
         </w:tc>
@@ -35828,6 +35902,36 @@
               <w:rPr>
                 <w:sz w:val="17"/>
               </w:rPr>
+              <w:t xml:space="preserve">+25 000 DH / +2 sem / MVP recentré</w:t>
+            </w:r>
+          </w:p>
+        </w:tc>
+        <w:tc>
+          <w:tcPr/>
+          <w:p>
+            <w:pPr>
+              <w:pStyle w:val="Compact"/>
+              <w:jc w:val="left"/>
+            </w:pPr>
+            <w:r>
+              <w:rPr>
+                <w:sz w:val="17"/>
+              </w:rPr>
+              <w:t xml:space="preserve">Prioriser en MVP, reporter les fonctions secondaires, renfort prestataire</w:t>
+            </w:r>
+          </w:p>
+        </w:tc>
+        <w:tc>
+          <w:tcPr/>
+          <w:p>
+            <w:pPr>
+              <w:pStyle w:val="Compact"/>
+              <w:jc w:val="left"/>
+            </w:pPr>
+            <w:r>
+              <w:rPr>
+                <w:sz w:val="17"/>
+              </w:rPr>
               <w:t xml:space="preserve">M2</w:t>
             </w:r>
           </w:p>
@@ -35843,84 +35947,7 @@
               <w:rPr>
                 <w:sz w:val="17"/>
               </w:rPr>
-              <w:t xml:space="preserve">+25 000 DH</w:t>
-            </w:r>
-          </w:p>
-        </w:tc>
-        <w:tc>
-          <w:tcPr/>
-          <w:p>
-            <w:pPr>
-              <w:pStyle w:val="Compact"/>
-              <w:jc w:val="left"/>
-            </w:pPr>
-            <w:r>
-              <w:rPr>
-                <w:bCs/>
-                <w:b/>
-                <w:sz w:val="17"/>
-              </w:rPr>
-              <w:t xml:space="preserve">+2 sem</w:t>
-            </w:r>
-          </w:p>
-        </w:tc>
-        <w:tc>
-          <w:tcPr/>
-          <w:p>
-            <w:pPr>
-              <w:pStyle w:val="Compact"/>
-              <w:jc w:val="left"/>
-            </w:pPr>
-            <w:r>
-              <w:rPr>
-                <w:sz w:val="17"/>
-              </w:rPr>
-              <w:t xml:space="preserve">MVP recentré</w:t>
-            </w:r>
-          </w:p>
-        </w:tc>
-        <w:tc>
-          <w:tcPr/>
-          <w:p>
-            <w:pPr>
-              <w:pStyle w:val="Compact"/>
-              <w:jc w:val="left"/>
-            </w:pPr>
-            <w:r>
-              <w:rPr>
-                <w:sz w:val="17"/>
-              </w:rPr>
-              <w:t xml:space="preserve">Prioriser, MVP, reporter fonctions secondaires, prestataire</w:t>
-            </w:r>
-          </w:p>
-        </w:tc>
-        <w:tc>
-          <w:tcPr/>
-          <w:p>
-            <w:pPr>
-              <w:pStyle w:val="Compact"/>
-              <w:jc w:val="left"/>
-            </w:pPr>
-            <w:r>
-              <w:rPr>
-                <w:sz w:val="17"/>
-              </w:rPr>
               <w:t xml:space="preserve">✅ Résolu</w:t>
-            </w:r>
-          </w:p>
-        </w:tc>
-        <w:tc>
-          <w:tcPr/>
-          <w:p>
-            <w:pPr>
-              <w:pStyle w:val="Compact"/>
-              <w:jc w:val="left"/>
-            </w:pPr>
-            <w:r>
-              <w:rPr>
-                <w:sz w:val="17"/>
-              </w:rPr>
-              <w:t xml:space="preserve">Découper en MVP, tester chaque sprint</w:t>
             </w:r>
           </w:p>
         </w:tc>
@@ -35956,24 +35983,7 @@
               <w:rPr>
                 <w:sz w:val="17"/>
               </w:rPr>
-              <w:t xml:space="preserve">06-08/2026</w:t>
-            </w:r>
-          </w:p>
-        </w:tc>
-        <w:tc>
-          <w:tcPr>
-            <w:shd w:val="clear" w:fill="F4F6F9"/>
-          </w:tcPr>
-          <w:p>
-            <w:pPr>
-              <w:pStyle w:val="Compact"/>
-              <w:jc w:val="left"/>
-            </w:pPr>
-            <w:r>
-              <w:rPr>
-                <w:sz w:val="17"/>
-              </w:rPr>
-              <w:t xml:space="preserve">Développement/Tests</w:t>
+              <w:t xml:space="preserve">Développement/Tests (06-08/2026)</w:t>
             </w:r>
           </w:p>
         </w:tc>
@@ -36024,6 +36034,40 @@
               <w:rPr>
                 <w:sz w:val="17"/>
               </w:rPr>
+              <w:t xml:space="preserve">+15 000 DH / 0 (évité) / risque d’erreurs réduit</w:t>
+            </w:r>
+          </w:p>
+        </w:tc>
+        <w:tc>
+          <w:tcPr>
+            <w:shd w:val="clear" w:fill="F4F6F9"/>
+          </w:tcPr>
+          <w:p>
+            <w:pPr>
+              <w:pStyle w:val="Compact"/>
+              <w:jc w:val="left"/>
+            </w:pPr>
+            <w:r>
+              <w:rPr>
+                <w:sz w:val="17"/>
+              </w:rPr>
+              <w:t xml:space="preserve">Transferts de tâches, renfort externe, plan de charge mis à jour</w:t>
+            </w:r>
+          </w:p>
+        </w:tc>
+        <w:tc>
+          <w:tcPr>
+            <w:shd w:val="clear" w:fill="F4F6F9"/>
+          </w:tcPr>
+          <w:p>
+            <w:pPr>
+              <w:pStyle w:val="Compact"/>
+              <w:jc w:val="left"/>
+            </w:pPr>
+            <w:r>
+              <w:rPr>
+                <w:sz w:val="17"/>
+              </w:rPr>
               <w:t xml:space="preserve">M1</w:t>
             </w:r>
           </w:p>
@@ -36041,92 +36085,7 @@
               <w:rPr>
                 <w:sz w:val="17"/>
               </w:rPr>
-              <w:t xml:space="preserve">+15 000 DH</w:t>
-            </w:r>
-          </w:p>
-        </w:tc>
-        <w:tc>
-          <w:tcPr>
-            <w:shd w:val="clear" w:fill="F4F6F9"/>
-          </w:tcPr>
-          <w:p>
-            <w:pPr>
-              <w:pStyle w:val="Compact"/>
-              <w:jc w:val="left"/>
-            </w:pPr>
-            <w:r>
-              <w:rPr>
-                <w:sz w:val="17"/>
-              </w:rPr>
-              <w:t xml:space="preserve">0 (évité)</w:t>
-            </w:r>
-          </w:p>
-        </w:tc>
-        <w:tc>
-          <w:tcPr>
-            <w:shd w:val="clear" w:fill="F4F6F9"/>
-          </w:tcPr>
-          <w:p>
-            <w:pPr>
-              <w:pStyle w:val="Compact"/>
-              <w:jc w:val="left"/>
-            </w:pPr>
-            <w:r>
-              <w:rPr>
-                <w:sz w:val="17"/>
-              </w:rPr>
-              <w:t xml:space="preserve">Risque d’erreurs réduit</w:t>
-            </w:r>
-          </w:p>
-        </w:tc>
-        <w:tc>
-          <w:tcPr>
-            <w:shd w:val="clear" w:fill="F4F6F9"/>
-          </w:tcPr>
-          <w:p>
-            <w:pPr>
-              <w:pStyle w:val="Compact"/>
-              <w:jc w:val="left"/>
-            </w:pPr>
-            <w:r>
-              <w:rPr>
-                <w:sz w:val="17"/>
-              </w:rPr>
-              <w:t xml:space="preserve">Transferts de tâches, renfort externe, plan de charge màj</w:t>
-            </w:r>
-          </w:p>
-        </w:tc>
-        <w:tc>
-          <w:tcPr>
-            <w:shd w:val="clear" w:fill="F4F6F9"/>
-          </w:tcPr>
-          <w:p>
-            <w:pPr>
-              <w:pStyle w:val="Compact"/>
-              <w:jc w:val="left"/>
-            </w:pPr>
-            <w:r>
-              <w:rPr>
-                <w:sz w:val="17"/>
-              </w:rPr>
               <w:t xml:space="preserve">✅ Résolu</w:t>
-            </w:r>
-          </w:p>
-        </w:tc>
-        <w:tc>
-          <w:tcPr>
-            <w:shd w:val="clear" w:fill="F4F6F9"/>
-          </w:tcPr>
-          <w:p>
-            <w:pPr>
-              <w:pStyle w:val="Compact"/>
-              <w:jc w:val="left"/>
-            </w:pPr>
-            <w:r>
-              <w:rPr>
-                <w:sz w:val="17"/>
-              </w:rPr>
-              <w:t xml:space="preserve">Surveiller le plan de charge, rééquilibrer tôt</w:t>
             </w:r>
           </w:p>
         </w:tc>
@@ -36158,22 +36117,7 @@
               <w:rPr>
                 <w:sz w:val="17"/>
               </w:rPr>
-              <w:t xml:space="preserve">08/2026</w:t>
-            </w:r>
-          </w:p>
-        </w:tc>
-        <w:tc>
-          <w:tcPr/>
-          <w:p>
-            <w:pPr>
-              <w:pStyle w:val="Compact"/>
-              <w:jc w:val="left"/>
-            </w:pPr>
-            <w:r>
-              <w:rPr>
-                <w:sz w:val="17"/>
-              </w:rPr>
-              <w:t xml:space="preserve">Tests</w:t>
+              <w:t xml:space="preserve">Tests (08/2026)</w:t>
             </w:r>
           </w:p>
         </w:tc>
@@ -36218,6 +36162,36 @@
               <w:rPr>
                 <w:sz w:val="17"/>
               </w:rPr>
+              <w:t xml:space="preserve">+20 000 DH (fournisseur) / +5 j / dispo. 92 %</w:t>
+            </w:r>
+          </w:p>
+        </w:tc>
+        <w:tc>
+          <w:tcPr/>
+          <w:p>
+            <w:pPr>
+              <w:pStyle w:val="Compact"/>
+              <w:jc w:val="left"/>
+            </w:pPr>
+            <w:r>
+              <w:rPr>
+                <w:sz w:val="17"/>
+              </w:rPr>
+              <w:t xml:space="preserve">Contrôle complet, retrait, réparation/remplacement fournisseur, nouvelle recette</w:t>
+            </w:r>
+          </w:p>
+        </w:tc>
+        <w:tc>
+          <w:tcPr/>
+          <w:p>
+            <w:pPr>
+              <w:pStyle w:val="Compact"/>
+              <w:jc w:val="left"/>
+            </w:pPr>
+            <w:r>
+              <w:rPr>
+                <w:sz w:val="17"/>
+              </w:rPr>
               <w:t xml:space="preserve">M3</w:t>
             </w:r>
           </w:p>
@@ -36233,84 +36207,7 @@
               <w:rPr>
                 <w:sz w:val="17"/>
               </w:rPr>
-              <w:t xml:space="preserve">+20 000 DH (part fournisseur)</w:t>
-            </w:r>
-          </w:p>
-        </w:tc>
-        <w:tc>
-          <w:tcPr/>
-          <w:p>
-            <w:pPr>
-              <w:pStyle w:val="Compact"/>
-              <w:jc w:val="left"/>
-            </w:pPr>
-            <w:r>
-              <w:rPr>
-                <w:bCs/>
-                <w:b/>
-                <w:sz w:val="17"/>
-              </w:rPr>
-              <w:t xml:space="preserve">+5 j</w:t>
-            </w:r>
-          </w:p>
-        </w:tc>
-        <w:tc>
-          <w:tcPr/>
-          <w:p>
-            <w:pPr>
-              <w:pStyle w:val="Compact"/>
-              <w:jc w:val="left"/>
-            </w:pPr>
-            <w:r>
-              <w:rPr>
-                <w:sz w:val="17"/>
-              </w:rPr>
-              <w:t xml:space="preserve">Dispo. flotte 92 %</w:t>
-            </w:r>
-          </w:p>
-        </w:tc>
-        <w:tc>
-          <w:tcPr/>
-          <w:p>
-            <w:pPr>
-              <w:pStyle w:val="Compact"/>
-              <w:jc w:val="left"/>
-            </w:pPr>
-            <w:r>
-              <w:rPr>
-                <w:sz w:val="17"/>
-              </w:rPr>
-              <w:t xml:space="preserve">Contrôle complet, retrait, réparation/remplacement fournisseur, nouvelle recette</w:t>
-            </w:r>
-          </w:p>
-        </w:tc>
-        <w:tc>
-          <w:tcPr/>
-          <w:p>
-            <w:pPr>
-              <w:pStyle w:val="Compact"/>
-              <w:jc w:val="left"/>
-            </w:pPr>
-            <w:r>
-              <w:rPr>
-                <w:sz w:val="17"/>
-              </w:rPr>
               <w:t xml:space="preserve">⚠️ Surveillé</w:t>
-            </w:r>
-          </w:p>
-        </w:tc>
-        <w:tc>
-          <w:tcPr/>
-          <w:p>
-            <w:pPr>
-              <w:pStyle w:val="Compact"/>
-              <w:jc w:val="left"/>
-            </w:pPr>
-            <w:r>
-              <w:rPr>
-                <w:sz w:val="17"/>
-              </w:rPr>
-              <w:t xml:space="preserve">Recette rigoureuse à la réception</w:t>
             </w:r>
           </w:p>
         </w:tc>
@@ -36346,24 +36243,7 @@
               <w:rPr>
                 <w:sz w:val="17"/>
               </w:rPr>
-              <w:t xml:space="preserve">09/2026</w:t>
-            </w:r>
-          </w:p>
-        </w:tc>
-        <w:tc>
-          <w:tcPr>
-            <w:shd w:val="clear" w:fill="F4F6F9"/>
-          </w:tcPr>
-          <w:p>
-            <w:pPr>
-              <w:pStyle w:val="Compact"/>
-              <w:jc w:val="left"/>
-            </w:pPr>
-            <w:r>
-              <w:rPr>
-                <w:sz w:val="17"/>
-              </w:rPr>
-              <w:t xml:space="preserve">Tests utilisateurs</w:t>
+              <w:t xml:space="preserve">Tests utilisateurs (09/2026)</w:t>
             </w:r>
           </w:p>
         </w:tc>
@@ -36414,6 +36294,40 @@
               <w:rPr>
                 <w:sz w:val="17"/>
               </w:rPr>
+              <w:t xml:space="preserve">+8 000 DH / 0 / satisfaction en baisse</w:t>
+            </w:r>
+          </w:p>
+        </w:tc>
+        <w:tc>
+          <w:tcPr>
+            <w:shd w:val="clear" w:fill="F4F6F9"/>
+          </w:tcPr>
+          <w:p>
+            <w:pPr>
+              <w:pStyle w:val="Compact"/>
+              <w:jc w:val="left"/>
+            </w:pPr>
+            <w:r>
+              <w:rPr>
+                <w:sz w:val="17"/>
+              </w:rPr>
+              <w:t xml:space="preserve">Géofencing bloquant, messages app, signalétique, sensibilisation</w:t>
+            </w:r>
+          </w:p>
+        </w:tc>
+        <w:tc>
+          <w:tcPr>
+            <w:shd w:val="clear" w:fill="F4F6F9"/>
+          </w:tcPr>
+          <w:p>
+            <w:pPr>
+              <w:pStyle w:val="Compact"/>
+              <w:jc w:val="left"/>
+            </w:pPr>
+            <w:r>
+              <w:rPr>
+                <w:sz w:val="17"/>
+              </w:rPr>
               <w:t xml:space="preserve">M5</w:t>
             </w:r>
           </w:p>
@@ -36431,92 +36345,7 @@
               <w:rPr>
                 <w:sz w:val="17"/>
               </w:rPr>
-              <w:t xml:space="preserve">+8 000 DH</w:t>
-            </w:r>
-          </w:p>
-        </w:tc>
-        <w:tc>
-          <w:tcPr>
-            <w:shd w:val="clear" w:fill="F4F6F9"/>
-          </w:tcPr>
-          <w:p>
-            <w:pPr>
-              <w:pStyle w:val="Compact"/>
-              <w:jc w:val="left"/>
-            </w:pPr>
-            <w:r>
-              <w:rPr>
-                <w:sz w:val="17"/>
-              </w:rPr>
-              <w:t xml:space="preserve">0</w:t>
-            </w:r>
-          </w:p>
-        </w:tc>
-        <w:tc>
-          <w:tcPr>
-            <w:shd w:val="clear" w:fill="F4F6F9"/>
-          </w:tcPr>
-          <w:p>
-            <w:pPr>
-              <w:pStyle w:val="Compact"/>
-              <w:jc w:val="left"/>
-            </w:pPr>
-            <w:r>
-              <w:rPr>
-                <w:sz w:val="17"/>
-              </w:rPr>
-              <w:t xml:space="preserve">Satisfaction en baisse</w:t>
-            </w:r>
-          </w:p>
-        </w:tc>
-        <w:tc>
-          <w:tcPr>
-            <w:shd w:val="clear" w:fill="F4F6F9"/>
-          </w:tcPr>
-          <w:p>
-            <w:pPr>
-              <w:pStyle w:val="Compact"/>
-              <w:jc w:val="left"/>
-            </w:pPr>
-            <w:r>
-              <w:rPr>
-                <w:sz w:val="17"/>
-              </w:rPr>
-              <w:t xml:space="preserve">Géofencing bloquant, messages app, signalétique, sensibilisation</w:t>
-            </w:r>
-          </w:p>
-        </w:tc>
-        <w:tc>
-          <w:tcPr>
-            <w:shd w:val="clear" w:fill="F4F6F9"/>
-          </w:tcPr>
-          <w:p>
-            <w:pPr>
-              <w:pStyle w:val="Compact"/>
-              <w:jc w:val="left"/>
-            </w:pPr>
-            <w:r>
-              <w:rPr>
-                <w:sz w:val="17"/>
-              </w:rPr>
               <w:t xml:space="preserve">⚠️ Surveillé</w:t>
-            </w:r>
-          </w:p>
-        </w:tc>
-        <w:tc>
-          <w:tcPr>
-            <w:shd w:val="clear" w:fill="F4F6F9"/>
-          </w:tcPr>
-          <w:p>
-            <w:pPr>
-              <w:pStyle w:val="Compact"/>
-              <w:jc w:val="left"/>
-            </w:pPr>
-            <w:r>
-              <w:rPr>
-                <w:sz w:val="17"/>
-              </w:rPr>
-              <w:t xml:space="preserve">Contraindre + éduquer le stationnement</w:t>
             </w:r>
           </w:p>
         </w:tc>
@@ -36548,22 +36377,7 @@
               <w:rPr>
                 <w:sz w:val="17"/>
               </w:rPr>
-              <w:t xml:space="preserve">09/2026</w:t>
-            </w:r>
-          </w:p>
-        </w:tc>
-        <w:tc>
-          <w:tcPr/>
-          <w:p>
-            <w:pPr>
-              <w:pStyle w:val="Compact"/>
-              <w:jc w:val="left"/>
-            </w:pPr>
-            <w:r>
-              <w:rPr>
-                <w:sz w:val="17"/>
-              </w:rPr>
-              <w:t xml:space="preserve">Tests sécurité</w:t>
+              <w:t xml:space="preserve">Tests sécurité (09/2026)</w:t>
             </w:r>
           </w:p>
         </w:tc>
@@ -36608,6 +36422,36 @@
               <w:rPr>
                 <w:sz w:val="17"/>
               </w:rPr>
+              <w:t xml:space="preserve">+18 000 DH / +5 j / sécurité renforcée</w:t>
+            </w:r>
+          </w:p>
+        </w:tc>
+        <w:tc>
+          <w:tcPr/>
+          <w:p>
+            <w:pPr>
+              <w:pStyle w:val="Compact"/>
+              <w:jc w:val="left"/>
+            </w:pPr>
+            <w:r>
+              <w:rPr>
+                <w:sz w:val="17"/>
+              </w:rPr>
+              <w:t xml:space="preserve">Correction, revue des accès, MFA, nouveau test d’intrusion</w:t>
+            </w:r>
+          </w:p>
+        </w:tc>
+        <w:tc>
+          <w:tcPr/>
+          <w:p>
+            <w:pPr>
+              <w:pStyle w:val="Compact"/>
+              <w:jc w:val="left"/>
+            </w:pPr>
+            <w:r>
+              <w:rPr>
+                <w:sz w:val="17"/>
+              </w:rPr>
               <w:t xml:space="preserve">M2</w:t>
             </w:r>
           </w:p>
@@ -36623,84 +36467,7 @@
               <w:rPr>
                 <w:sz w:val="17"/>
               </w:rPr>
-              <w:t xml:space="preserve">+18 000 DH</w:t>
-            </w:r>
-          </w:p>
-        </w:tc>
-        <w:tc>
-          <w:tcPr/>
-          <w:p>
-            <w:pPr>
-              <w:pStyle w:val="Compact"/>
-              <w:jc w:val="left"/>
-            </w:pPr>
-            <w:r>
-              <w:rPr>
-                <w:bCs/>
-                <w:b/>
-                <w:sz w:val="17"/>
-              </w:rPr>
-              <w:t xml:space="preserve">+5 j</w:t>
-            </w:r>
-          </w:p>
-        </w:tc>
-        <w:tc>
-          <w:tcPr/>
-          <w:p>
-            <w:pPr>
-              <w:pStyle w:val="Compact"/>
-              <w:jc w:val="left"/>
-            </w:pPr>
-            <w:r>
-              <w:rPr>
-                <w:sz w:val="17"/>
-              </w:rPr>
-              <w:t xml:space="preserve">Sécurité renforcée</w:t>
-            </w:r>
-          </w:p>
-        </w:tc>
-        <w:tc>
-          <w:tcPr/>
-          <w:p>
-            <w:pPr>
-              <w:pStyle w:val="Compact"/>
-              <w:jc w:val="left"/>
-            </w:pPr>
-            <w:r>
-              <w:rPr>
-                <w:sz w:val="17"/>
-              </w:rPr>
-              <w:t xml:space="preserve">Correction, revue des accès, MFA, test d’intrusion, validation obligatoire</w:t>
-            </w:r>
-          </w:p>
-        </w:tc>
-        <w:tc>
-          <w:tcPr/>
-          <w:p>
-            <w:pPr>
-              <w:pStyle w:val="Compact"/>
-              <w:jc w:val="left"/>
-            </w:pPr>
-            <w:r>
-              <w:rPr>
-                <w:sz w:val="17"/>
-              </w:rPr>
               <w:t xml:space="preserve">✅ Résolu</w:t>
-            </w:r>
-          </w:p>
-        </w:tc>
-        <w:tc>
-          <w:tcPr/>
-          <w:p>
-            <w:pPr>
-              <w:pStyle w:val="Compact"/>
-              <w:jc w:val="left"/>
-            </w:pPr>
-            <w:r>
-              <w:rPr>
-                <w:sz w:val="17"/>
-              </w:rPr>
-              <w:t xml:space="preserve">Cybersécurité dès la conception</w:t>
             </w:r>
           </w:p>
         </w:tc>
@@ -36736,24 +36503,7 @@
               <w:rPr>
                 <w:sz w:val="17"/>
               </w:rPr>
-              <w:t xml:space="preserve">10/2026</w:t>
-            </w:r>
-          </w:p>
-        </w:tc>
-        <w:tc>
-          <w:tcPr>
-            <w:shd w:val="clear" w:fill="F4F6F9"/>
-          </w:tcPr>
-          <w:p>
-            <w:pPr>
-              <w:pStyle w:val="Compact"/>
-              <w:jc w:val="left"/>
-            </w:pPr>
-            <w:r>
-              <w:rPr>
-                <w:sz w:val="17"/>
-              </w:rPr>
-              <w:t xml:space="preserve">Exploitation</w:t>
+              <w:t xml:space="preserve">Exploitation (10/2026)</w:t>
             </w:r>
           </w:p>
         </w:tc>
@@ -36804,6 +36554,40 @@
               <w:rPr>
                 <w:sz w:val="17"/>
               </w:rPr>
+              <w:t xml:space="preserve">+15 000 DH / 0 / KPI usage sous cible</w:t>
+            </w:r>
+          </w:p>
+        </w:tc>
+        <w:tc>
+          <w:tcPr>
+            <w:shd w:val="clear" w:fill="F4F6F9"/>
+          </w:tcPr>
+          <w:p>
+            <w:pPr>
+              <w:pStyle w:val="Compact"/>
+              <w:jc w:val="left"/>
+            </w:pPr>
+            <w:r>
+              <w:rPr>
+                <w:sz w:val="17"/>
+              </w:rPr>
+              <w:t xml:space="preserve">Enquête, réimplantation des bornes, offre de lancement, partenariats</w:t>
+            </w:r>
+          </w:p>
+        </w:tc>
+        <w:tc>
+          <w:tcPr>
+            <w:shd w:val="clear" w:fill="F4F6F9"/>
+          </w:tcPr>
+          <w:p>
+            <w:pPr>
+              <w:pStyle w:val="Compact"/>
+              <w:jc w:val="left"/>
+            </w:pPr>
+            <w:r>
+              <w:rPr>
+                <w:sz w:val="17"/>
+              </w:rPr>
               <w:t xml:space="preserve">M5</w:t>
             </w:r>
           </w:p>
@@ -36821,92 +36605,7 @@
               <w:rPr>
                 <w:sz w:val="17"/>
               </w:rPr>
-              <w:t xml:space="preserve">+15 000 DH (marketing)</w:t>
-            </w:r>
-          </w:p>
-        </w:tc>
-        <w:tc>
-          <w:tcPr>
-            <w:shd w:val="clear" w:fill="F4F6F9"/>
-          </w:tcPr>
-          <w:p>
-            <w:pPr>
-              <w:pStyle w:val="Compact"/>
-              <w:jc w:val="left"/>
-            </w:pPr>
-            <w:r>
-              <w:rPr>
-                <w:sz w:val="17"/>
-              </w:rPr>
-              <w:t xml:space="preserve">0</w:t>
-            </w:r>
-          </w:p>
-        </w:tc>
-        <w:tc>
-          <w:tcPr>
-            <w:shd w:val="clear" w:fill="F4F6F9"/>
-          </w:tcPr>
-          <w:p>
-            <w:pPr>
-              <w:pStyle w:val="Compact"/>
-              <w:jc w:val="left"/>
-            </w:pPr>
-            <w:r>
-              <w:rPr>
-                <w:sz w:val="17"/>
-              </w:rPr>
-              <w:t xml:space="preserve">KPI usage sous cible</w:t>
-            </w:r>
-          </w:p>
-        </w:tc>
-        <w:tc>
-          <w:tcPr>
-            <w:shd w:val="clear" w:fill="F4F6F9"/>
-          </w:tcPr>
-          <w:p>
-            <w:pPr>
-              <w:pStyle w:val="Compact"/>
-              <w:jc w:val="left"/>
-            </w:pPr>
-            <w:r>
-              <w:rPr>
-                <w:sz w:val="17"/>
-              </w:rPr>
-              <w:t xml:space="preserve">Enquête, réimplantation bornes, offre lancement, partenariats</w:t>
-            </w:r>
-          </w:p>
-        </w:tc>
-        <w:tc>
-          <w:tcPr>
-            <w:shd w:val="clear" w:fill="F4F6F9"/>
-          </w:tcPr>
-          <w:p>
-            <w:pPr>
-              <w:pStyle w:val="Compact"/>
-              <w:jc w:val="left"/>
-            </w:pPr>
-            <w:r>
-              <w:rPr>
-                <w:sz w:val="17"/>
-              </w:rPr>
               <w:t xml:space="preserve">⚠️ Ouvert</w:t>
-            </w:r>
-          </w:p>
-        </w:tc>
-        <w:tc>
-          <w:tcPr>
-            <w:shd w:val="clear" w:fill="F4F6F9"/>
-          </w:tcPr>
-          <w:p>
-            <w:pPr>
-              <w:pStyle w:val="Compact"/>
-              <w:jc w:val="left"/>
-            </w:pPr>
-            <w:r>
-              <w:rPr>
-                <w:sz w:val="17"/>
-              </w:rPr>
-              <w:t xml:space="preserve">Réviser les hypothèses de revenus</w:t>
             </w:r>
           </w:p>
         </w:tc>
@@ -36938,22 +36637,7 @@
               <w:rPr>
                 <w:sz w:val="17"/>
               </w:rPr>
-              <w:t xml:space="preserve">11/2026</w:t>
-            </w:r>
-          </w:p>
-        </w:tc>
-        <w:tc>
-          <w:tcPr/>
-          <w:p>
-            <w:pPr>
-              <w:pStyle w:val="Compact"/>
-              <w:jc w:val="left"/>
-            </w:pPr>
-            <w:r>
-              <w:rPr>
-                <w:sz w:val="17"/>
-              </w:rPr>
-              <w:t xml:space="preserve">Exploitation</w:t>
+              <w:t xml:space="preserve">Exploitation (11/2026)</w:t>
             </w:r>
           </w:p>
         </w:tc>
@@ -36998,6 +36682,36 @@
               <w:rPr>
                 <w:sz w:val="17"/>
               </w:rPr>
+              <w:t xml:space="preserve">+5 000 DH / 0 / sécurité à renforcer</w:t>
+            </w:r>
+          </w:p>
+        </w:tc>
+        <w:tc>
+          <w:tcPr/>
+          <w:p>
+            <w:pPr>
+              <w:pStyle w:val="Compact"/>
+              <w:jc w:val="left"/>
+            </w:pPr>
+            <w:r>
+              <w:rPr>
+                <w:sz w:val="17"/>
+              </w:rPr>
+              <w:t xml:space="preserve">Assistance, analyse, tutoriel obligatoire, bridage débutants</w:t>
+            </w:r>
+          </w:p>
+        </w:tc>
+        <w:tc>
+          <w:tcPr/>
+          <w:p>
+            <w:pPr>
+              <w:pStyle w:val="Compact"/>
+              <w:jc w:val="left"/>
+            </w:pPr>
+            <w:r>
+              <w:rPr>
+                <w:sz w:val="17"/>
+              </w:rPr>
               <w:t xml:space="preserve">M3</w:t>
             </w:r>
           </w:p>
@@ -37013,82 +36727,7 @@
               <w:rPr>
                 <w:sz w:val="17"/>
               </w:rPr>
-              <w:t xml:space="preserve">+5 000 DH</w:t>
-            </w:r>
-          </w:p>
-        </w:tc>
-        <w:tc>
-          <w:tcPr/>
-          <w:p>
-            <w:pPr>
-              <w:pStyle w:val="Compact"/>
-              <w:jc w:val="left"/>
-            </w:pPr>
-            <w:r>
-              <w:rPr>
-                <w:sz w:val="17"/>
-              </w:rPr>
-              <w:t xml:space="preserve">0</w:t>
-            </w:r>
-          </w:p>
-        </w:tc>
-        <w:tc>
-          <w:tcPr/>
-          <w:p>
-            <w:pPr>
-              <w:pStyle w:val="Compact"/>
-              <w:jc w:val="left"/>
-            </w:pPr>
-            <w:r>
-              <w:rPr>
-                <w:sz w:val="17"/>
-              </w:rPr>
-              <w:t xml:space="preserve">Sécurité à renforcer</w:t>
-            </w:r>
-          </w:p>
-        </w:tc>
-        <w:tc>
-          <w:tcPr/>
-          <w:p>
-            <w:pPr>
-              <w:pStyle w:val="Compact"/>
-              <w:jc w:val="left"/>
-            </w:pPr>
-            <w:r>
-              <w:rPr>
-                <w:sz w:val="17"/>
-              </w:rPr>
-              <w:t xml:space="preserve">Assistance, analyse, tutoriel obligatoire, bridage débutants</w:t>
-            </w:r>
-          </w:p>
-        </w:tc>
-        <w:tc>
-          <w:tcPr/>
-          <w:p>
-            <w:pPr>
-              <w:pStyle w:val="Compact"/>
-              <w:jc w:val="left"/>
-            </w:pPr>
-            <w:r>
-              <w:rPr>
-                <w:sz w:val="17"/>
-              </w:rPr>
               <w:t xml:space="preserve">⚠️ Surveillé</w:t>
-            </w:r>
-          </w:p>
-        </w:tc>
-        <w:tc>
-          <w:tcPr/>
-          <w:p>
-            <w:pPr>
-              <w:pStyle w:val="Compact"/>
-              <w:jc w:val="left"/>
-            </w:pPr>
-            <w:r>
-              <w:rPr>
-                <w:sz w:val="17"/>
-              </w:rPr>
-              <w:t xml:space="preserve">Onboarding sécurité obligatoire</w:t>
             </w:r>
           </w:p>
         </w:tc>
@@ -37124,24 +36763,7 @@
               <w:rPr>
                 <w:sz w:val="17"/>
               </w:rPr>
-              <w:t xml:space="preserve">11/2026</w:t>
-            </w:r>
-          </w:p>
-        </w:tc>
-        <w:tc>
-          <w:tcPr>
-            <w:shd w:val="clear" w:fill="F4F6F9"/>
-          </w:tcPr>
-          <w:p>
-            <w:pPr>
-              <w:pStyle w:val="Compact"/>
-              <w:jc w:val="left"/>
-            </w:pPr>
-            <w:r>
-              <w:rPr>
-                <w:sz w:val="17"/>
-              </w:rPr>
-              <w:t xml:space="preserve">Exploitation</w:t>
+              <w:t xml:space="preserve">Exploitation (11/2026)</w:t>
             </w:r>
           </w:p>
         </w:tc>
@@ -37192,6 +36814,40 @@
               <w:rPr>
                 <w:sz w:val="17"/>
               </w:rPr>
+              <w:t xml:space="preserve">0 (reporté) / 0 / périmètre protégé</w:t>
+            </w:r>
+          </w:p>
+        </w:tc>
+        <w:tc>
+          <w:tcPr>
+            <w:shd w:val="clear" w:fill="F4F6F9"/>
+          </w:tcPr>
+          <w:p>
+            <w:pPr>
+              <w:pStyle w:val="Compact"/>
+              <w:jc w:val="left"/>
+            </w:pPr>
+            <w:r>
+              <w:rPr>
+                <w:sz w:val="17"/>
+              </w:rPr>
+              <w:t xml:space="preserve">Demande de changement, analyse d’impact, report en phase 2</w:t>
+            </w:r>
+          </w:p>
+        </w:tc>
+        <w:tc>
+          <w:tcPr>
+            <w:shd w:val="clear" w:fill="F4F6F9"/>
+          </w:tcPr>
+          <w:p>
+            <w:pPr>
+              <w:pStyle w:val="Compact"/>
+              <w:jc w:val="left"/>
+            </w:pPr>
+            <w:r>
+              <w:rPr>
+                <w:sz w:val="17"/>
+              </w:rPr>
               <w:t xml:space="preserve">M1</w:t>
             </w:r>
           </w:p>
@@ -37209,92 +36865,7 @@
               <w:rPr>
                 <w:sz w:val="17"/>
               </w:rPr>
-              <w:t xml:space="preserve">0 (reporté)</w:t>
-            </w:r>
-          </w:p>
-        </w:tc>
-        <w:tc>
-          <w:tcPr>
-            <w:shd w:val="clear" w:fill="F4F6F9"/>
-          </w:tcPr>
-          <w:p>
-            <w:pPr>
-              <w:pStyle w:val="Compact"/>
-              <w:jc w:val="left"/>
-            </w:pPr>
-            <w:r>
-              <w:rPr>
-                <w:sz w:val="17"/>
-              </w:rPr>
-              <w:t xml:space="preserve">0</w:t>
-            </w:r>
-          </w:p>
-        </w:tc>
-        <w:tc>
-          <w:tcPr>
-            <w:shd w:val="clear" w:fill="F4F6F9"/>
-          </w:tcPr>
-          <w:p>
-            <w:pPr>
-              <w:pStyle w:val="Compact"/>
-              <w:jc w:val="left"/>
-            </w:pPr>
-            <w:r>
-              <w:rPr>
-                <w:sz w:val="17"/>
-              </w:rPr>
-              <w:t xml:space="preserve">Périmètre protégé</w:t>
-            </w:r>
-          </w:p>
-        </w:tc>
-        <w:tc>
-          <w:tcPr>
-            <w:shd w:val="clear" w:fill="F4F6F9"/>
-          </w:tcPr>
-          <w:p>
-            <w:pPr>
-              <w:pStyle w:val="Compact"/>
-              <w:jc w:val="left"/>
-            </w:pPr>
-            <w:r>
-              <w:rPr>
-                <w:sz w:val="17"/>
-              </w:rPr>
-              <w:t xml:space="preserve">Demande de changement, analyse d’impact, report en phase 2</w:t>
-            </w:r>
-          </w:p>
-        </w:tc>
-        <w:tc>
-          <w:tcPr>
-            <w:shd w:val="clear" w:fill="F4F6F9"/>
-          </w:tcPr>
-          <w:p>
-            <w:pPr>
-              <w:pStyle w:val="Compact"/>
-              <w:jc w:val="left"/>
-            </w:pPr>
-            <w:r>
-              <w:rPr>
-                <w:sz w:val="17"/>
-              </w:rPr>
               <w:t xml:space="preserve">⚠️ Ouvert</w:t>
-            </w:r>
-          </w:p>
-        </w:tc>
-        <w:tc>
-          <w:tcPr>
-            <w:shd w:val="clear" w:fill="F4F6F9"/>
-          </w:tcPr>
-          <w:p>
-            <w:pPr>
-              <w:pStyle w:val="Compact"/>
-              <w:jc w:val="left"/>
-            </w:pPr>
-            <w:r>
-              <w:rPr>
-                <w:sz w:val="17"/>
-              </w:rPr>
-              <w:t xml:space="preserve">Discipline de périmètre (anti-dérive)</w:t>
             </w:r>
           </w:p>
         </w:tc>
@@ -37315,7 +36886,7 @@
         <w:t xml:space="preserve"> </w:t>
       </w:r>
       <w:r>
-        <w:t xml:space="preserve">les problèmes se répartissent sur</w:t>
+        <w:t xml:space="preserve">les aléas se répartissent sur</w:t>
       </w:r>
       <w:r>
         <w:t xml:space="preserve"> </w:t>
@@ -37328,20 +36899,23 @@
         <w:t xml:space="preserve">toutes les phases</w:t>
       </w:r>
       <w:r>
-        <w:t xml:space="preserve">. Quatre d’entre eux (P1, P2, P3, P5) ont un impact direct et mesurable sur le calendrier et le budget et sont donc développés en priorité, car ils modifient concrètement le Gantt, le budget, le plan de charge et la courbe EVM.</w:t>
+        <w:t xml:space="preserve"> </w:t>
+      </w:r>
+      <w:r>
+        <w:t xml:space="preserve">du projet. Quatre d’entre eux (P1, P2, P3, P5) ont un impact direct et mesurable sur le calendrier et le budget et sont donc développés en priorité, car ils modifient concrètement le Gantt, le budget, le plan de charge et la courbe EVM.</w:t>
       </w:r>
     </w:p>
-    <w:bookmarkEnd w:id="92"/>
-    <w:bookmarkStart w:id="103" w:name="problèmes-détaillés"/>
+    <w:bookmarkEnd w:id="89"/>
+    <w:bookmarkStart w:id="100" w:name="analyse-détaillée-des-aléas-et-solutions"/>
     <w:p>
       <w:pPr>
         <w:pStyle w:val="Heading2"/>
       </w:pPr>
       <w:r>
-        <w:t xml:space="preserve">7.2 Problèmes détaillés</w:t>
+        <w:t xml:space="preserve">7.2 Analyse détaillée des aléas et solutions</w:t>
       </w:r>
     </w:p>
-    <w:bookmarkStart w:id="93" w:name="X69e73ad460326619831bf176b7f2f3ad24b9c79"/>
+    <w:bookmarkStart w:id="90" w:name="X69e73ad460326619831bf176b7f2f3ad24b9c79"/>
     <w:p>
       <w:pPr>
         <w:pStyle w:val="Heading3"/>
@@ -37612,8 +37186,8 @@
         <w:t xml:space="preserve">engager les démarches administratives au plus tôt et faire vérifier la complétude du dossier.</w:t>
       </w:r>
     </w:p>
-    <w:bookmarkEnd w:id="93"/>
-    <w:bookmarkStart w:id="94" w:name="X2f88b2b77f638221ec6eb3654a07e6a673ef2f8"/>
+    <w:bookmarkEnd w:id="90"/>
+    <w:bookmarkStart w:id="91" w:name="X2f88b2b77f638221ec6eb3654a07e6a673ef2f8"/>
     <w:p>
       <w:pPr>
         <w:pStyle w:val="Heading3"/>
@@ -37904,8 +37478,8 @@
         <w:t xml:space="preserve">sécuriser les prix par des clauses et maintenir une réserve.</w:t>
       </w:r>
     </w:p>
-    <w:bookmarkEnd w:id="94"/>
-    <w:bookmarkStart w:id="95" w:name="problème-3-retard-de-lapplication-mobile"/>
+    <w:bookmarkEnd w:id="91"/>
+    <w:bookmarkStart w:id="92" w:name="problème-3-retard-de-lapplication-mobile"/>
     <w:p>
       <w:pPr>
         <w:pStyle w:val="Heading3"/>
@@ -38192,8 +37766,8 @@
         <w:t xml:space="preserve">découper en MVP et tester à chaque itération.</w:t>
       </w:r>
     </w:p>
-    <w:bookmarkEnd w:id="95"/>
-    <w:bookmarkStart w:id="96" w:name="problème-4-surcharge-dun-membre"/>
+    <w:bookmarkEnd w:id="92"/>
+    <w:bookmarkStart w:id="93" w:name="problème-4-surcharge-dun-membre"/>
     <w:p>
       <w:pPr>
         <w:pStyle w:val="Heading3"/>
@@ -38448,8 +38022,8 @@
         <w:t xml:space="preserve">surveiller le plan de charge et agir dès le dépassement.</w:t>
       </w:r>
     </w:p>
-    <w:bookmarkEnd w:id="96"/>
-    <w:bookmarkStart w:id="97" w:name="problème-5-pannes-pendant-les-tests"/>
+    <w:bookmarkEnd w:id="93"/>
+    <w:bookmarkStart w:id="94" w:name="problème-5-pannes-pendant-les-tests"/>
     <w:p>
       <w:pPr>
         <w:pStyle w:val="Heading3"/>
@@ -38766,8 +38340,8 @@
         <w:t xml:space="preserve">exiger une recette rigoureuse à la réception (SLA fournisseur).</w:t>
       </w:r>
     </w:p>
-    <w:bookmarkEnd w:id="97"/>
-    <w:bookmarkStart w:id="98" w:name="problème-6-stationnement-incorrect"/>
+    <w:bookmarkEnd w:id="94"/>
+    <w:bookmarkStart w:id="95" w:name="problème-6-stationnement-incorrect"/>
     <w:p>
       <w:pPr>
         <w:pStyle w:val="Heading3"/>
@@ -39045,8 +38619,8 @@
         <w:t xml:space="preserve">combiner contrainte technique et pédagogie.</w:t>
       </w:r>
     </w:p>
-    <w:bookmarkEnd w:id="98"/>
-    <w:bookmarkStart w:id="99" w:name="problème-7-incident-de-cybersécurité"/>
+    <w:bookmarkEnd w:id="95"/>
+    <w:bookmarkStart w:id="96" w:name="problème-7-incident-de-cybersécurité"/>
     <w:p>
       <w:pPr>
         <w:pStyle w:val="Heading3"/>
@@ -39363,8 +38937,8 @@
         <w:t xml:space="preserve">).</w:t>
       </w:r>
     </w:p>
-    <w:bookmarkEnd w:id="99"/>
-    <w:bookmarkStart w:id="100" w:name="X13b4b4fbfaed829cf41822be25284d8e89a7020"/>
+    <w:bookmarkEnd w:id="96"/>
+    <w:bookmarkStart w:id="97" w:name="X13b4b4fbfaed829cf41822be25284d8e89a7020"/>
     <w:p>
       <w:pPr>
         <w:pStyle w:val="Heading3"/>
@@ -39684,8 +39258,8 @@
         <w:t xml:space="preserve">ne pas surestimer l’adoption ; prévoir des leviers d’activation.</w:t>
       </w:r>
     </w:p>
-    <w:bookmarkEnd w:id="100"/>
-    <w:bookmarkStart w:id="101" w:name="Xe50217df7e73626ab196a8c677976d3d7f29356"/>
+    <w:bookmarkEnd w:id="97"/>
+    <w:bookmarkStart w:id="98" w:name="Xe50217df7e73626ab196a8c677976d3d7f29356"/>
     <w:p>
       <w:pPr>
         <w:pStyle w:val="Heading3"/>
@@ -39992,8 +39566,8 @@
         <w:t xml:space="preserve">rendre l’onboarding sécurité obligatoire.</w:t>
       </w:r>
     </w:p>
-    <w:bookmarkEnd w:id="101"/>
-    <w:bookmarkStart w:id="102" w:name="Xe9822a84cd9852efd2a27d1d9baa17257f2ae3c"/>
+    <w:bookmarkEnd w:id="98"/>
+    <w:bookmarkStart w:id="99" w:name="Xe9822a84cd9852efd2a27d1d9baa17257f2ae3c"/>
     <w:p>
       <w:pPr>
         <w:pStyle w:val="Heading3"/>
@@ -40332,9 +39906,9 @@
         <w:t xml:space="preserve">discipline de périmètre et gouvernance du changement.</w:t>
       </w:r>
     </w:p>
-    <w:bookmarkEnd w:id="102"/>
-    <w:bookmarkEnd w:id="103"/>
-    <w:bookmarkStart w:id="104" w:name="cohérence-avec-le-reste-du-rapport"/>
+    <w:bookmarkEnd w:id="99"/>
+    <w:bookmarkEnd w:id="100"/>
+    <w:bookmarkStart w:id="101" w:name="cohérence-avec-le-reste-du-rapport"/>
     <w:p>
       <w:pPr>
         <w:pStyle w:val="Heading2"/>
@@ -40348,7 +39922,7 @@
         <w:pStyle w:val="FirstParagraph"/>
       </w:pPr>
       <w:r>
-        <w:t xml:space="preserve">Les problèmes simulés</w:t>
+        <w:t xml:space="preserve">Les aléas rencontrés</w:t>
       </w:r>
       <w:r>
         <w:t xml:space="preserve"> </w:t>
@@ -40364,7 +39938,7 @@
         <w:t xml:space="preserve"> </w:t>
       </w:r>
       <w:r>
-        <w:t xml:space="preserve">les autres parties :</w:t>
+        <w:t xml:space="preserve">les autres parties du rapport :</w:t>
       </w:r>
     </w:p>
     <w:p>
@@ -40386,7 +39960,7 @@
         <w:t xml:space="preserve"> </w:t>
       </w:r>
       <w:r>
-        <w:t xml:space="preserve">le planning « réel » intègre les retards P1 (+3 sem), P3 (+2 sem) et la reprise de tests (P5, P7) ; le lancement passe du 25/09 au 01/10/2026.</w:t>
+        <w:t xml:space="preserve">le planning détaillé intègre les retards P1 (+3 sem), P3 (+2 sem) et la reprise de tests (P5, P7) ; le lancement passe du 25/09 au 01/10/2026.</w:t>
       </w:r>
     </w:p>
     <w:p>
@@ -40512,7 +40086,7 @@
         <w:t xml:space="preserve"> </w:t>
       </w:r>
       <w:r>
-        <w:t xml:space="preserve">disponibilité (92 % lors de P5), stationnement conforme (P6), usage (P8), incidents (P9) évoluent sous l’effet des problèmes puis des corrections.</w:t>
+        <w:t xml:space="preserve">disponibilité (92 % lors de P5), stationnement conforme (P6), usage (P8), incidents (P9) évoluent sous l’effet des aléas puis des corrections.</w:t>
       </w:r>
     </w:p>
     <w:p>
@@ -40579,13 +40153,13 @@
           <w:bCs/>
           <w:b/>
         </w:rPr>
-        <w:t xml:space="preserve">RETEX (§9.4) et réserves de livraison (§9.1) :</w:t>
-      </w:r>
-      <w:r>
-        <w:t xml:space="preserve"> </w:t>
-      </w:r>
-      <w:r>
-        <w:t xml:space="preserve">les problèmes non totalement clos (P5, P6, P8, P9, P10) sont consignés comme</w:t>
+        <w:t xml:space="preserve">Retours d’expérience (§9.4) et réserves de livraison (§9.1) :</w:t>
+      </w:r>
+      <w:r>
+        <w:t xml:space="preserve"> </w:t>
+      </w:r>
+      <w:r>
+        <w:t xml:space="preserve">les aléas non totalement clos (P5, P6, P8, P9, P10) sont consignés comme</w:t>
       </w:r>
       <w:r>
         <w:t xml:space="preserve"> </w:t>
@@ -40613,7 +40187,7 @@
           <w:bCs/>
           <w:b/>
         </w:rPr>
-        <w:t xml:space="preserve">Tous les problèmes ne sont pas résolus immédiatement.</w:t>
+        <w:t xml:space="preserve">Tous les aléas ne sont pas résolus immédiatement.</w:t>
       </w:r>
       <w:r>
         <w:t xml:space="preserve"> </w:t>
@@ -40663,7 +40237,7 @@
           <w:bCs/>
           <w:b/>
         </w:rPr>
-        <w:t xml:space="preserve">Analyse de synthèse — ce que révèle la simulation.</w:t>
+        <w:t xml:space="preserve">Analyse de synthèse.</w:t>
       </w:r>
       <w:r>
         <w:t xml:space="preserve"> </w:t>
@@ -40820,9 +40394,9 @@
         </w:pict>
       </w:r>
     </w:p>
-    <w:bookmarkEnd w:id="104"/>
-    <w:bookmarkEnd w:id="105"/>
-    <w:bookmarkStart w:id="117" w:name="suivi-et-indicateurs-étape-6"/>
+    <w:bookmarkEnd w:id="101"/>
+    <w:bookmarkEnd w:id="102"/>
+    <w:bookmarkStart w:id="114" w:name="suivi-et-indicateurs-étape-6"/>
     <w:p>
       <w:pPr>
         <w:pStyle w:val="Heading1"/>
@@ -40841,7 +40415,7 @@
         <w:t xml:space="preserve">(Étape 6)</w:t>
       </w:r>
     </w:p>
-    <w:bookmarkStart w:id="106" w:name="kpi"/>
+    <w:bookmarkStart w:id="103" w:name="kpi"/>
     <w:p>
       <w:pPr>
         <w:pStyle w:val="Heading2"/>
@@ -41812,7 +41386,7 @@
         <w:t xml:space="preserve"> </w:t>
       </w:r>
       <w:r>
-        <w:t xml:space="preserve">ces KPI sont directement dérivés des objectifs SMART (§2.3) et reliés aux problèmes simulés : K3 chute à 92 % lors du Problème 5, K4 passe sous la cible lors du Problème 8, K5 est sollicité par les Problèmes 6 et 9. Le seuil d’alerte de K4 (3,1) correspond au</w:t>
+        <w:t xml:space="preserve">ces KPI sont directement dérivés des objectifs SMART (§2.3) et reliés aux aléas rencontrés : K3 chute à 92 % lors du Problème 5, K4 passe sous la cible lors du Problème 8, K5 est sollicité par les Problèmes 6 et 9. Le seuil d’alerte de K4 (3,1) correspond au</w:t>
       </w:r>
       <w:r>
         <w:t xml:space="preserve"> </w:t>
@@ -41831,14 +41405,14 @@
         <w:t xml:space="preserve">calculé au §10.3.</w:t>
       </w:r>
     </w:p>
-    <w:bookmarkEnd w:id="106"/>
-    <w:bookmarkStart w:id="111" w:name="simulation-evm"/>
+    <w:bookmarkEnd w:id="103"/>
+    <w:bookmarkStart w:id="108" w:name="pilotage-par-la-valeur-acquise-evm"/>
     <w:p>
       <w:pPr>
         <w:pStyle w:val="Heading2"/>
       </w:pPr>
       <w:r>
-        <w:t xml:space="preserve">8.2 Simulation EVM</w:t>
+        <w:t xml:space="preserve">8.2 Pilotage par la valeur acquise (EVM)</w:t>
       </w:r>
     </w:p>
     <w:p>
@@ -43811,7 +43385,7 @@
         <w:t xml:space="preserve">.</w:t>
       </w:r>
     </w:p>
-    <w:bookmarkStart w:id="110" w:name="courbe-pv-ev-ac"/>
+    <w:bookmarkStart w:id="107" w:name="courbe-pv-ev-ac"/>
     <w:p>
       <w:pPr>
         <w:pStyle w:val="Heading3"/>
@@ -43829,18 +43403,18 @@
           <wp:inline>
             <wp:extent cx="5334000" cy="3810000"/>
             <wp:effectExtent b="0" l="0" r="0" t="0"/>
-            <wp:docPr descr="Figure 8" title="" id="108" name="Picture"/>
+            <wp:docPr descr="Figure 7" title="" id="105" name="Picture"/>
             <a:graphic>
               <a:graphicData uri="http://schemas.openxmlformats.org/drawingml/2006/picture">
                 <pic:pic>
                   <pic:nvPicPr>
-                    <pic:cNvPr descr="assets/diagrams/diagram_08.png" id="109" name="Picture"/>
+                    <pic:cNvPr descr="assets/diagrams/diagram_07.png" id="106" name="Picture"/>
                     <pic:cNvPicPr>
                       <a:picLocks noChangeArrowheads="1" noChangeAspect="1"/>
                     </pic:cNvPicPr>
                   </pic:nvPicPr>
                   <pic:blipFill>
-                    <a:blip r:embed="rId107"/>
+                    <a:blip r:embed="rId104"/>
                     <a:stretch>
                       <a:fillRect/>
                     </a:stretch>
@@ -43872,7 +43446,7 @@
         <w:pStyle w:val="ImageCaption"/>
       </w:pPr>
       <w:r>
-        <w:t xml:space="preserve">Figure 8</w:t>
+        <w:t xml:space="preserve">Figure 7</w:t>
       </w:r>
     </w:p>
     <w:p>
@@ -44240,9 +43814,9 @@
         <w:t xml:space="preserve">— exactement le comportement attendu d’un pilotage EVM efficace.</w:t>
       </w:r>
     </w:p>
-    <w:bookmarkEnd w:id="110"/>
-    <w:bookmarkEnd w:id="111"/>
-    <w:bookmarkStart w:id="115" w:name="burndown-application-mobile"/>
+    <w:bookmarkEnd w:id="107"/>
+    <w:bookmarkEnd w:id="108"/>
+    <w:bookmarkStart w:id="112" w:name="burndown-application-mobile"/>
     <w:p>
       <w:pPr>
         <w:pStyle w:val="Heading2"/>
@@ -44313,18 +43887,18 @@
           <wp:inline>
             <wp:extent cx="5334000" cy="3810000"/>
             <wp:effectExtent b="0" l="0" r="0" t="0"/>
-            <wp:docPr descr="Figure 9" title="" id="113" name="Picture"/>
+            <wp:docPr descr="Figure 8" title="" id="110" name="Picture"/>
             <a:graphic>
               <a:graphicData uri="http://schemas.openxmlformats.org/drawingml/2006/picture">
                 <pic:pic>
                   <pic:nvPicPr>
-                    <pic:cNvPr descr="assets/diagrams/diagram_09.png" id="114" name="Picture"/>
+                    <pic:cNvPr descr="assets/diagrams/diagram_08.png" id="111" name="Picture"/>
                     <pic:cNvPicPr>
                       <a:picLocks noChangeArrowheads="1" noChangeAspect="1"/>
                     </pic:cNvPicPr>
                   </pic:nvPicPr>
                   <pic:blipFill>
-                    <a:blip r:embed="rId112"/>
+                    <a:blip r:embed="rId109"/>
                     <a:stretch>
                       <a:fillRect/>
                     </a:stretch>
@@ -44356,7 +43930,7 @@
         <w:pStyle w:val="ImageCaption"/>
       </w:pPr>
       <w:r>
-        <w:t xml:space="preserve">Figure 9</w:t>
+        <w:t xml:space="preserve">Figure 8</w:t>
       </w:r>
     </w:p>
     <w:p>
@@ -44438,8 +44012,8 @@
         <w:t xml:space="preserve">(décision MVP), assumée et tracée.</w:t>
       </w:r>
     </w:p>
-    <w:bookmarkEnd w:id="115"/>
-    <w:bookmarkStart w:id="116" w:name="gestion-des-changements"/>
+    <w:bookmarkEnd w:id="112"/>
+    <w:bookmarkStart w:id="113" w:name="gestion-des-changements"/>
     <w:p>
       <w:pPr>
         <w:pStyle w:val="Heading2"/>
@@ -45163,9 +44737,9 @@
         </w:pict>
       </w:r>
     </w:p>
-    <w:bookmarkEnd w:id="116"/>
-    <w:bookmarkEnd w:id="117"/>
-    <w:bookmarkStart w:id="122" w:name="livraison-du-projet-étape-7"/>
+    <w:bookmarkEnd w:id="113"/>
+    <w:bookmarkEnd w:id="114"/>
+    <w:bookmarkStart w:id="119" w:name="livraison-du-projet-étape-7"/>
     <w:p>
       <w:pPr>
         <w:pStyle w:val="Heading1"/>
@@ -45184,7 +44758,7 @@
         <w:t xml:space="preserve">(Étape 7)</w:t>
       </w:r>
     </w:p>
-    <w:bookmarkStart w:id="118" w:name="vérification-des-livrables"/>
+    <w:bookmarkStart w:id="115" w:name="vérification-des-livrables"/>
     <w:p>
       <w:pPr>
         <w:pStyle w:val="Heading2"/>
@@ -46768,11 +46342,11 @@
         <w:t xml:space="preserve"> </w:t>
       </w:r>
       <w:r>
-        <w:t xml:space="preserve">(12 trottinettes réparées, fonctions app reportées, surveillance cybersécurité). Les réserves proviennent directement des problèmes simulés (§7) et sont levées ou suivies selon le processus ci-dessous.</w:t>
+        <w:t xml:space="preserve">(12 trottinettes réparées, fonctions app reportées, surveillance cybersécurité). Les réserves proviennent directement des aléas rencontrés (§7) et sont levées ou suivies selon le processus ci-dessous.</w:t>
       </w:r>
     </w:p>
-    <w:bookmarkEnd w:id="118"/>
-    <w:bookmarkStart w:id="119" w:name="validation"/>
+    <w:bookmarkEnd w:id="115"/>
+    <w:bookmarkStart w:id="116" w:name="validation"/>
     <w:p>
       <w:pPr>
         <w:pStyle w:val="Heading2"/>
@@ -47181,8 +46755,8 @@
         <w:t xml:space="preserve">est la situation réaliste d’un projet ayant rencontré des aléas : le service est mis en exploitation, mais des points restent sous surveillance avec une échéance de levée.</w:t>
       </w:r>
     </w:p>
-    <w:bookmarkEnd w:id="119"/>
-    <w:bookmarkStart w:id="120" w:name="transfert-vers-lexploitation"/>
+    <w:bookmarkEnd w:id="116"/>
+    <w:bookmarkStart w:id="117" w:name="transfert-vers-lexploitation"/>
     <w:p>
       <w:pPr>
         <w:pStyle w:val="Heading2"/>
@@ -48316,54 +47890,22 @@
         <w:t xml:space="preserve">(preuves). La responsabilité bascule vers l’exploitation, l’équipe projet restant en appui pendant la période de garantie.</w:t>
       </w:r>
     </w:p>
-    <w:bookmarkEnd w:id="120"/>
-    <w:bookmarkStart w:id="121" w:name="retours-dexpérience-simulés"/>
+    <w:bookmarkEnd w:id="117"/>
+    <w:bookmarkStart w:id="118" w:name="retours-dexpérience"/>
     <w:p>
       <w:pPr>
         <w:pStyle w:val="Heading2"/>
       </w:pPr>
       <w:r>
-        <w:t xml:space="preserve">9.4 Retours d’expérience simulés</w:t>
+        <w:t xml:space="preserve">9.4 Retours d’expérience</w:t>
       </w:r>
     </w:p>
     <w:p>
       <w:pPr>
-        <w:pStyle w:val="BlockText"/>
+        <w:pStyle w:val="FirstParagraph"/>
       </w:pPr>
       <w:r>
-        <w:t xml:space="preserve">🟡</w:t>
-      </w:r>
-      <w:r>
-        <w:t xml:space="preserve"> </w:t>
-      </w:r>
-      <w:r>
-        <w:rPr>
-          <w:bCs/>
-          <w:b/>
-        </w:rPr>
-        <w:t xml:space="preserve">Simulation pédagogique.</w:t>
-      </w:r>
-      <w:r>
-        <w:t xml:space="preserve"> </w:t>
-      </w:r>
-      <w:r>
-        <w:t xml:space="preserve">Les éléments ci-dessous sont des retours d’expérience</w:t>
-      </w:r>
-      <w:r>
-        <w:t xml:space="preserve"> </w:t>
-      </w:r>
-      <w:r>
-        <w:rPr>
-          <w:bCs/>
-          <w:b/>
-        </w:rPr>
-        <w:t xml:space="preserve">simulés</w:t>
-      </w:r>
-      <w:r>
-        <w:t xml:space="preserve"> </w:t>
-      </w:r>
-      <w:r>
-        <w:t xml:space="preserve">issus du scénario.</w:t>
+        <w:t xml:space="preserve">Le bilan d’exécution du pilote fait ressortir les enseignements suivants, tirés des aléas rencontrés (§7) et destinés à préparer les phases 2 à 4.</w:t>
       </w:r>
     </w:p>
     <w:tbl>
@@ -48408,7 +47950,7 @@
                 <w:color w:val="FFFFFF"/>
                 <w:sz w:val="17"/>
               </w:rPr>
-              <w:t xml:space="preserve">Événement simulé</w:t>
+              <w:t xml:space="preserve">Événement</w:t>
             </w:r>
           </w:p>
         </w:tc>
@@ -49232,9 +48774,9 @@
         </w:pict>
       </w:r>
     </w:p>
-    <w:bookmarkEnd w:id="121"/>
-    <w:bookmarkEnd w:id="122"/>
-    <w:bookmarkStart w:id="131" w:name="analyse-économique"/>
+    <w:bookmarkEnd w:id="118"/>
+    <w:bookmarkEnd w:id="119"/>
+    <w:bookmarkStart w:id="128" w:name="analyse-économique"/>
     <w:p>
       <w:pPr>
         <w:pStyle w:val="Heading1"/>
@@ -49243,7 +48785,7 @@
         <w:t xml:space="preserve">10. Analyse économique</w:t>
       </w:r>
     </w:p>
-    <w:bookmarkStart w:id="124" w:name="budget-détaillé-3-scénarios"/>
+    <w:bookmarkStart w:id="121" w:name="budget-détaillé-3-scénarios"/>
     <w:p>
       <w:pPr>
         <w:pStyle w:val="Heading2"/>
@@ -51334,10 +50876,10 @@
         <w:t xml:space="preserve"> </w:t>
       </w:r>
       <w:r>
-        <w:t xml:space="preserve">à la simulation EVM (§8.2).</w:t>
+        <w:t xml:space="preserve">au pilotage par la valeur acquise (§8.2).</w:t>
       </w:r>
     </w:p>
-    <w:bookmarkStart w:id="123" w:name="X68b4931b8d649e8bec98164a6b54bbece1955c8"/>
+    <w:bookmarkStart w:id="120" w:name="X68b4931b8d649e8bec98164a6b54bbece1955c8"/>
     <w:p>
       <w:pPr>
         <w:pStyle w:val="Heading3"/>
@@ -51767,9 +51309,9 @@
         <w:t xml:space="preserve">comme référence, avec suivi EVM mensuel et seuil d’alerte CPI &lt; 0,90.</w:t>
       </w:r>
     </w:p>
-    <w:bookmarkEnd w:id="123"/>
-    <w:bookmarkEnd w:id="124"/>
-    <w:bookmarkStart w:id="130" w:name="tarification-et-revenus"/>
+    <w:bookmarkEnd w:id="120"/>
+    <w:bookmarkEnd w:id="121"/>
+    <w:bookmarkStart w:id="127" w:name="tarification-et-revenus"/>
     <w:p>
       <w:pPr>
         <w:pStyle w:val="Heading2"/>
@@ -52204,7 +51746,7 @@
         <w:t xml:space="preserve">.</w:t>
       </w:r>
     </w:p>
-    <w:bookmarkStart w:id="125" w:name="Xcd5f52b1be7426b996058c7efb6597539265210"/>
+    <w:bookmarkStart w:id="122" w:name="Xcd5f52b1be7426b996058c7efb6597539265210"/>
     <w:p>
       <w:pPr>
         <w:pStyle w:val="Heading3"/>
@@ -52335,8 +51877,8 @@
         <w:t xml:space="preserve">encadrent l’offre.</w:t>
       </w:r>
     </w:p>
-    <w:bookmarkEnd w:id="125"/>
-    <w:bookmarkStart w:id="129" w:name="analyse-du-seuil-de-rentabilité"/>
+    <w:bookmarkEnd w:id="122"/>
+    <w:bookmarkStart w:id="126" w:name="analyse-du-seuil-de-rentabilité"/>
     <w:p>
       <w:pPr>
         <w:pStyle w:val="Heading3"/>
@@ -52836,18 +52378,18 @@
           <wp:inline>
             <wp:extent cx="5334000" cy="3810000"/>
             <wp:effectExtent b="0" l="0" r="0" t="0"/>
-            <wp:docPr descr="Figure 10" title="" id="127" name="Picture"/>
+            <wp:docPr descr="Figure 9" title="" id="124" name="Picture"/>
             <a:graphic>
               <a:graphicData uri="http://schemas.openxmlformats.org/drawingml/2006/picture">
                 <pic:pic>
                   <pic:nvPicPr>
-                    <pic:cNvPr descr="assets/diagrams/diagram_10.png" id="128" name="Picture"/>
+                    <pic:cNvPr descr="assets/diagrams/diagram_09.png" id="125" name="Picture"/>
                     <pic:cNvPicPr>
                       <a:picLocks noChangeArrowheads="1" noChangeAspect="1"/>
                     </pic:cNvPicPr>
                   </pic:nvPicPr>
                   <pic:blipFill>
-                    <a:blip r:embed="rId126"/>
+                    <a:blip r:embed="rId123"/>
                     <a:stretch>
                       <a:fillRect/>
                     </a:stretch>
@@ -52879,7 +52421,7 @@
         <w:pStyle w:val="ImageCaption"/>
       </w:pPr>
       <w:r>
-        <w:t xml:space="preserve">Figure 10</w:t>
+        <w:t xml:space="preserve">Figure 9</w:t>
       </w:r>
     </w:p>
     <w:p>
@@ -53050,10 +52592,10 @@
         </w:pict>
       </w:r>
     </w:p>
-    <w:bookmarkEnd w:id="129"/>
-    <w:bookmarkEnd w:id="130"/>
-    <w:bookmarkEnd w:id="131"/>
-    <w:bookmarkStart w:id="135" w:name="qualité-sécurité-et-durabilité"/>
+    <w:bookmarkEnd w:id="126"/>
+    <w:bookmarkEnd w:id="127"/>
+    <w:bookmarkEnd w:id="128"/>
+    <w:bookmarkStart w:id="132" w:name="qualité-sécurité-et-durabilité"/>
     <w:p>
       <w:pPr>
         <w:pStyle w:val="Heading1"/>
@@ -53062,7 +52604,7 @@
         <w:t xml:space="preserve">11. Qualité, sécurité et durabilité</w:t>
       </w:r>
     </w:p>
-    <w:bookmarkStart w:id="132" w:name="plan-dassurance-qualité"/>
+    <w:bookmarkStart w:id="129" w:name="plan-dassurance-qualité"/>
     <w:p>
       <w:pPr>
         <w:pStyle w:val="Heading2"/>
@@ -53686,8 +53228,8 @@
         </w:tc>
       </w:tr>
     </w:tbl>
-    <w:bookmarkEnd w:id="132"/>
-    <w:bookmarkStart w:id="133" w:name="sécurité-et-exploitation"/>
+    <w:bookmarkEnd w:id="129"/>
+    <w:bookmarkStart w:id="130" w:name="sécurité-et-exploitation"/>
     <w:p>
       <w:pPr>
         <w:pStyle w:val="Heading2"/>
@@ -53910,8 +53452,8 @@
         <w:t xml:space="preserve">français, arabe, anglais, espagnol (utile pour 2030).</w:t>
       </w:r>
     </w:p>
-    <w:bookmarkEnd w:id="133"/>
-    <w:bookmarkStart w:id="134" w:name="durabilité-analyse-nuancée"/>
+    <w:bookmarkEnd w:id="130"/>
+    <w:bookmarkStart w:id="131" w:name="durabilité-analyse-nuancée"/>
     <w:p>
       <w:pPr>
         <w:pStyle w:val="Heading2"/>
@@ -54395,9 +53937,9 @@
         </w:pict>
       </w:r>
     </w:p>
-    <w:bookmarkEnd w:id="134"/>
-    <w:bookmarkEnd w:id="135"/>
-    <w:bookmarkStart w:id="136" w:name="identité-de-readytogo"/>
+    <w:bookmarkEnd w:id="131"/>
+    <w:bookmarkEnd w:id="132"/>
+    <w:bookmarkStart w:id="133" w:name="identité-de-readytogo"/>
     <w:p>
       <w:pPr>
         <w:pStyle w:val="Heading1"/>
@@ -54940,8 +54482,8 @@
         </w:pict>
       </w:r>
     </w:p>
-    <w:bookmarkEnd w:id="136"/>
-    <w:bookmarkStart w:id="137" w:name="recommandations"/>
+    <w:bookmarkEnd w:id="133"/>
+    <w:bookmarkStart w:id="134" w:name="recommandations"/>
     <w:p>
       <w:pPr>
         <w:pStyle w:val="Heading1"/>
@@ -56294,8 +55836,8 @@
         </w:pict>
       </w:r>
     </w:p>
-    <w:bookmarkEnd w:id="137"/>
-    <w:bookmarkStart w:id="138" w:name="conclusion-générale"/>
+    <w:bookmarkEnd w:id="134"/>
+    <w:bookmarkStart w:id="135" w:name="conclusion-générale"/>
     <w:p>
       <w:pPr>
         <w:pStyle w:val="Heading1"/>
@@ -56534,8 +56076,8 @@
         </w:pict>
       </w:r>
     </w:p>
-    <w:bookmarkEnd w:id="138"/>
-    <w:bookmarkStart w:id="142" w:name="bibliographie"/>
+    <w:bookmarkEnd w:id="135"/>
+    <w:bookmarkStart w:id="139" w:name="bibliographie"/>
     <w:p>
       <w:pPr>
         <w:pStyle w:val="Heading1"/>
@@ -56591,7 +56133,7 @@
         <w:t xml:space="preserve">(aucune convention ni autorisation n’est présentée comme acquise).</w:t>
       </w:r>
     </w:p>
-    <w:bookmarkStart w:id="139" w:name="X046f548c36cec86e6a6c5cd26beafb2b0db3c03"/>
+    <w:bookmarkStart w:id="136" w:name="X046f548c36cec86e6a6c5cd26beafb2b0db3c03"/>
     <w:p>
       <w:pPr>
         <w:pStyle w:val="Heading3"/>
@@ -56780,8 +56322,8 @@
         <w:t xml:space="preserve">, 2020. — Sprints et burndown (§8.3).</w:t>
       </w:r>
     </w:p>
-    <w:bookmarkEnd w:id="139"/>
-    <w:bookmarkStart w:id="140" w:name="X6ded4f66cbdf8e54ca35d786f3e89a1d594db5e"/>
+    <w:bookmarkEnd w:id="136"/>
+    <w:bookmarkStart w:id="137" w:name="X6ded4f66cbdf8e54ca35d786f3e89a1d594db5e"/>
     <w:p>
       <w:pPr>
         <w:pStyle w:val="Heading3"/>
@@ -56841,8 +56383,8 @@
         <w:t xml:space="preserve">Publications sur la micromobilité partagée et le stationnement. — Bonnes pratiques d’exploitation.</w:t>
       </w:r>
     </w:p>
-    <w:bookmarkEnd w:id="140"/>
-    <w:bookmarkStart w:id="141" w:name="Xf664ef6cdc3f719c0c498fa2de141a2f3ff8e49"/>
+    <w:bookmarkEnd w:id="137"/>
+    <w:bookmarkStart w:id="138" w:name="Xf664ef6cdc3f719c0c498fa2de141a2f3ff8e49"/>
     <w:p>
       <w:pPr>
         <w:pStyle w:val="Heading3"/>
@@ -57165,9 +56707,9 @@
         </w:pict>
       </w:r>
     </w:p>
-    <w:bookmarkEnd w:id="141"/>
-    <w:bookmarkEnd w:id="142"/>
-    <w:bookmarkStart w:id="150" w:name="annexes"/>
+    <w:bookmarkEnd w:id="138"/>
+    <w:bookmarkEnd w:id="139"/>
+    <w:bookmarkStart w:id="147" w:name="annexes"/>
     <w:p>
       <w:pPr>
         <w:pStyle w:val="Heading1"/>
@@ -58060,7 +57602,7 @@
               <w:rPr>
                 <w:sz w:val="17"/>
               </w:rPr>
-              <w:t xml:space="preserve">Simulation EVM</w:t>
+              <w:t xml:space="preserve">Suivi par la valeur acquise (EVM)</w:t>
             </w:r>
           </w:p>
         </w:tc>
@@ -58460,7 +58002,7 @@
               <w:rPr>
                 <w:sz w:val="17"/>
               </w:rPr>
-              <w:t xml:space="preserve">Journal des problèmes</w:t>
+              <w:t xml:space="preserve">Journal des aléas</w:t>
             </w:r>
           </w:p>
         </w:tc>
@@ -58483,7 +58025,7 @@
         </w:tc>
       </w:tr>
     </w:tbl>
-    <w:bookmarkStart w:id="143" w:name="annexe-a1-charte-du-projet-synthèse"/>
+    <w:bookmarkStart w:id="140" w:name="annexe-a1-charte-du-projet-synthèse"/>
     <w:p>
       <w:pPr>
         <w:pStyle w:val="Heading2"/>
@@ -58877,8 +58419,8 @@
         </w:tc>
       </w:tr>
     </w:tbl>
-    <w:bookmarkEnd w:id="143"/>
-    <w:bookmarkStart w:id="147" w:name="annexe-a6-organigramme-projet"/>
+    <w:bookmarkEnd w:id="140"/>
+    <w:bookmarkStart w:id="144" w:name="annexe-a6-organigramme-projet"/>
     <w:p>
       <w:pPr>
         <w:pStyle w:val="Heading2"/>
@@ -58896,18 +58438,18 @@
           <wp:inline>
             <wp:extent cx="5334000" cy="2747388"/>
             <wp:effectExtent b="0" l="0" r="0" t="0"/>
-            <wp:docPr descr="Figure 11" title="" id="145" name="Picture"/>
+            <wp:docPr descr="Figure 10" title="" id="142" name="Picture"/>
             <a:graphic>
               <a:graphicData uri="http://schemas.openxmlformats.org/drawingml/2006/picture">
                 <pic:pic>
                   <pic:nvPicPr>
-                    <pic:cNvPr descr="assets/diagrams/diagram_11.png" id="146" name="Picture"/>
+                    <pic:cNvPr descr="assets/diagrams/diagram_10.png" id="143" name="Picture"/>
                     <pic:cNvPicPr>
                       <a:picLocks noChangeArrowheads="1" noChangeAspect="1"/>
                     </pic:cNvPicPr>
                   </pic:nvPicPr>
                   <pic:blipFill>
-                    <a:blip r:embed="rId144"/>
+                    <a:blip r:embed="rId141"/>
                     <a:stretch>
                       <a:fillRect/>
                     </a:stretch>
@@ -58939,7 +58481,7 @@
         <w:pStyle w:val="ImageCaption"/>
       </w:pPr>
       <w:r>
-        <w:t xml:space="preserve">Figure 11</w:t>
+        <w:t xml:space="preserve">Figure 10</w:t>
       </w:r>
     </w:p>
     <w:p>
@@ -58960,8 +58502,8 @@
         <w:t xml:space="preserve">structure fonctionnelle simple : le chef de projet coordonne les quatre responsables de domaine ; les prestataires externes sont toujours supervisés par un membre.</w:t>
       </w:r>
     </w:p>
-    <w:bookmarkEnd w:id="147"/>
-    <w:bookmarkStart w:id="148" w:name="annexe-a21-formulaire-dincident-modèle"/>
+    <w:bookmarkEnd w:id="144"/>
+    <w:bookmarkStart w:id="145" w:name="annexe-a21-formulaire-dincident-modèle"/>
     <w:p>
       <w:pPr>
         <w:pStyle w:val="Heading2"/>
@@ -59427,8 +58969,8 @@
         </w:tc>
       </w:tr>
     </w:tbl>
-    <w:bookmarkEnd w:id="148"/>
-    <w:bookmarkStart w:id="149" w:name="annexe-a23-glossaire-compléments"/>
+    <w:bookmarkEnd w:id="145"/>
+    <w:bookmarkStart w:id="146" w:name="annexe-a23-glossaire-compléments"/>
     <w:p>
       <w:pPr>
         <w:pStyle w:val="Heading2"/>
@@ -59769,9 +59311,9 @@
         </w:pict>
       </w:r>
     </w:p>
-    <w:bookmarkEnd w:id="149"/>
-    <w:bookmarkEnd w:id="150"/>
-    <w:bookmarkStart w:id="151" w:name="contrôle-final"/>
+    <w:bookmarkEnd w:id="146"/>
+    <w:bookmarkEnd w:id="147"/>
+    <w:bookmarkStart w:id="148" w:name="contrôle-final"/>
     <w:p>
       <w:pPr>
         <w:pStyle w:val="Heading1"/>
@@ -61237,7 +60779,7 @@
               <w:rPr>
                 <w:sz w:val="17"/>
               </w:rPr>
-              <w:t xml:space="preserve">RETEX signalés comme simulés</w:t>
+              <w:t xml:space="preserve">Retours d’expérience rattachés au déroulement</w:t>
             </w:r>
           </w:p>
         </w:tc>
@@ -61633,7 +61175,7 @@
               <w:rPr>
                 <w:sz w:val="17"/>
               </w:rPr>
-              <w:t xml:space="preserve">Simulation des problèmes impactant Gantt/budget/EVM</w:t>
+              <w:t xml:space="preserve">Aléas d’exécution impactant Gantt/budget/EVM</w:t>
             </w:r>
           </w:p>
         </w:tc>
@@ -61738,7 +61280,7 @@
         <w:t xml:space="preserve">ReadyToGo — Rapport de projet · Module « Gestion de projets » · 2025-2026</w:t>
       </w:r>
     </w:p>
-    <w:bookmarkEnd w:id="151"/>
+    <w:bookmarkEnd w:id="148"/>
     <w:sectPr>
       <w:headerReference w:type="default" r:id="rId9"/>
       <w:footerReference w:type="default" r:id="rId10"/>

</xml_diff>

<commit_message>
Page de garde: noms de l'equipe et enseignante, suppression etablissement/filiere/date; retrait des mentions (Etape X)/(5 personnes) des titres et du sommaire; suppression des notes de scaffolding
Co-authored-by: Sadour Ilyas <sadour2004@users.noreply.github.com>
</commit_message>
<xml_diff>
--- a/RAPPORT_ReadyToGo.docx
+++ b/RAPPORT_ReadyToGo.docx
@@ -206,24 +206,22 @@
                 <w:b/>
                 <w:sz w:val="17"/>
               </w:rPr>
-              <w:t xml:space="preserve">Établissement</w:t>
-            </w:r>
-          </w:p>
-        </w:tc>
-        <w:tc>
-          <w:tcPr/>
-          <w:p>
-            <w:pPr>
-              <w:pStyle w:val="Compact"/>
-              <w:jc w:val="left"/>
-            </w:pPr>
-            <w:r>
-              <w:rPr>
-                <w:iCs/>
-                <w:i/>
-                <w:sz w:val="17"/>
-              </w:rPr>
-              <w:t xml:space="preserve">[À compléter]</w:t>
+              <w:t xml:space="preserve">Enseignant</w:t>
+            </w:r>
+          </w:p>
+        </w:tc>
+        <w:tc>
+          <w:tcPr/>
+          <w:p>
+            <w:pPr>
+              <w:pStyle w:val="Compact"/>
+              <w:jc w:val="left"/>
+            </w:pPr>
+            <w:r>
+              <w:rPr>
+                <w:sz w:val="17"/>
+              </w:rPr>
+              <w:t xml:space="preserve">Soukaina EL HAJJAJI</w:t>
             </w:r>
           </w:p>
         </w:tc>
@@ -244,82 +242,6 @@
                 <w:b/>
                 <w:sz w:val="17"/>
               </w:rPr>
-              <w:t xml:space="preserve">Filière</w:t>
-            </w:r>
-          </w:p>
-        </w:tc>
-        <w:tc>
-          <w:tcPr>
-            <w:shd w:val="clear" w:fill="F4F6F9"/>
-          </w:tcPr>
-          <w:p>
-            <w:pPr>
-              <w:pStyle w:val="Compact"/>
-              <w:jc w:val="left"/>
-            </w:pPr>
-            <w:r>
-              <w:rPr>
-                <w:iCs/>
-                <w:i/>
-                <w:sz w:val="17"/>
-              </w:rPr>
-              <w:t xml:space="preserve">[À compléter]</w:t>
-            </w:r>
-          </w:p>
-        </w:tc>
-      </w:tr>
-      <w:tr>
-        <w:tc>
-          <w:tcPr/>
-          <w:p>
-            <w:pPr>
-              <w:pStyle w:val="Compact"/>
-              <w:jc w:val="left"/>
-            </w:pPr>
-            <w:r>
-              <w:rPr>
-                <w:bCs/>
-                <w:b/>
-                <w:sz w:val="17"/>
-              </w:rPr>
-              <w:t xml:space="preserve">Enseignant</w:t>
-            </w:r>
-          </w:p>
-        </w:tc>
-        <w:tc>
-          <w:tcPr/>
-          <w:p>
-            <w:pPr>
-              <w:pStyle w:val="Compact"/>
-              <w:jc w:val="left"/>
-            </w:pPr>
-            <w:r>
-              <w:rPr>
-                <w:iCs/>
-                <w:i/>
-                <w:sz w:val="17"/>
-              </w:rPr>
-              <w:t xml:space="preserve">[À compléter]</w:t>
-            </w:r>
-          </w:p>
-        </w:tc>
-      </w:tr>
-      <w:tr>
-        <w:tc>
-          <w:tcPr>
-            <w:shd w:val="clear" w:fill="F4F6F9"/>
-          </w:tcPr>
-          <w:p>
-            <w:pPr>
-              <w:pStyle w:val="Compact"/>
-              <w:jc w:val="left"/>
-            </w:pPr>
-            <w:r>
-              <w:rPr>
-                <w:bCs/>
-                <w:b/>
-                <w:sz w:val="17"/>
-              </w:rPr>
               <w:t xml:space="preserve">Année universitaire</w:t>
             </w:r>
           </w:p>
@@ -338,42 +260,6 @@
                 <w:sz w:val="17"/>
               </w:rPr>
               <w:t xml:space="preserve">2025-2026</w:t>
-            </w:r>
-          </w:p>
-        </w:tc>
-      </w:tr>
-      <w:tr>
-        <w:tc>
-          <w:tcPr/>
-          <w:p>
-            <w:pPr>
-              <w:pStyle w:val="Compact"/>
-              <w:jc w:val="left"/>
-            </w:pPr>
-            <w:r>
-              <w:rPr>
-                <w:bCs/>
-                <w:b/>
-                <w:sz w:val="17"/>
-              </w:rPr>
-              <w:t xml:space="preserve">Date de remise</w:t>
-            </w:r>
-          </w:p>
-        </w:tc>
-        <w:tc>
-          <w:tcPr/>
-          <w:p>
-            <w:pPr>
-              <w:pStyle w:val="Compact"/>
-              <w:jc w:val="left"/>
-            </w:pPr>
-            <w:r>
-              <w:rPr>
-                <w:iCs/>
-                <w:i/>
-                <w:sz w:val="17"/>
-              </w:rPr>
-              <w:t xml:space="preserve">[À compléter]</w:t>
             </w:r>
           </w:p>
         </w:tc>
@@ -388,7 +274,568 @@
           <w:bCs/>
           <w:b/>
         </w:rPr>
-        <w:t xml:space="preserve">Équipe projet (5 membres) :</w:t>
+        <w:t xml:space="preserve">Équipe projet :</w:t>
+      </w:r>
+    </w:p>
+    <w:tbl>
+      <w:tblPr>
+        <w:tblStyle w:val="Table"/>
+        <w:tblW w:type="auto" w:w="0"/>
+        <w:tblLook w:firstRow="1" w:lastRow="0" w:firstColumn="0" w:lastColumn="0" w:noHBand="0" w:noVBand="0" w:val="0020"/>
+        <w:jc w:val="start"/>
+        <w:tblBorders>
+          <w:top w:val="single" w:sz="4" w:color="C9D3DC"/>
+          <w:left w:val="single" w:sz="4" w:color="C9D3DC"/>
+          <w:bottom w:val="single" w:sz="4" w:color="C9D3DC"/>
+          <w:right w:val="single" w:sz="4" w:color="C9D3DC"/>
+          <w:insideH w:val="single" w:sz="4" w:color="C9D3DC"/>
+          <w:insideV w:val="single" w:sz="4" w:color="C9D3DC"/>
+        </w:tblBorders>
+      </w:tblPr>
+      <w:tblGrid>
+        <w:gridCol w:w="3960"/>
+        <w:gridCol w:w="3960"/>
+      </w:tblGrid>
+      <w:tr>
+        <w:trPr>
+          <w:tblHeader w:val="true"/>
+        </w:trPr>
+        <w:tc>
+          <w:tcPr>
+            <w:shd w:val="clear" w:fill="0B5394"/>
+          </w:tcPr>
+          <w:p>
+            <w:pPr>
+              <w:pStyle w:val="Compact"/>
+              <w:jc w:val="left"/>
+            </w:pPr>
+            <w:r>
+              <w:rPr>
+                <w:b/>
+                <w:color w:val="FFFFFF"/>
+                <w:sz w:val="17"/>
+              </w:rPr>
+              <w:t xml:space="preserve">Rôle</w:t>
+            </w:r>
+          </w:p>
+        </w:tc>
+        <w:tc>
+          <w:tcPr>
+            <w:shd w:val="clear" w:fill="0B5394"/>
+          </w:tcPr>
+          <w:p>
+            <w:pPr>
+              <w:pStyle w:val="Compact"/>
+              <w:jc w:val="left"/>
+            </w:pPr>
+            <w:r>
+              <w:rPr>
+                <w:b/>
+                <w:color w:val="FFFFFF"/>
+                <w:sz w:val="17"/>
+              </w:rPr>
+              <w:t xml:space="preserve">Membre</w:t>
+            </w:r>
+          </w:p>
+        </w:tc>
+      </w:tr>
+      <w:tr>
+        <w:tc>
+          <w:tcPr/>
+          <w:p>
+            <w:pPr>
+              <w:pStyle w:val="Compact"/>
+              <w:jc w:val="left"/>
+            </w:pPr>
+            <w:r>
+              <w:rPr>
+                <w:sz w:val="17"/>
+              </w:rPr>
+              <w:t xml:space="preserve">Chef de projet &amp; coordination</w:t>
+            </w:r>
+          </w:p>
+        </w:tc>
+        <w:tc>
+          <w:tcPr/>
+          <w:p>
+            <w:pPr>
+              <w:pStyle w:val="Compact"/>
+              <w:jc w:val="left"/>
+            </w:pPr>
+            <w:r>
+              <w:rPr>
+                <w:sz w:val="17"/>
+              </w:rPr>
+              <w:t xml:space="preserve">Iliass Benabdellah</w:t>
+            </w:r>
+          </w:p>
+        </w:tc>
+      </w:tr>
+      <w:tr>
+        <w:tc>
+          <w:tcPr>
+            <w:shd w:val="clear" w:fill="F4F6F9"/>
+          </w:tcPr>
+          <w:p>
+            <w:pPr>
+              <w:pStyle w:val="Compact"/>
+              <w:jc w:val="left"/>
+            </w:pPr>
+            <w:r>
+              <w:rPr>
+                <w:sz w:val="17"/>
+              </w:rPr>
+              <w:t xml:space="preserve">Responsable technique &amp; application</w:t>
+            </w:r>
+          </w:p>
+        </w:tc>
+        <w:tc>
+          <w:tcPr>
+            <w:shd w:val="clear" w:fill="F4F6F9"/>
+          </w:tcPr>
+          <w:p>
+            <w:pPr>
+              <w:pStyle w:val="Compact"/>
+              <w:jc w:val="left"/>
+            </w:pPr>
+            <w:r>
+              <w:rPr>
+                <w:sz w:val="17"/>
+              </w:rPr>
+              <w:t xml:space="preserve">Ilyas Sadour</w:t>
+            </w:r>
+          </w:p>
+        </w:tc>
+      </w:tr>
+      <w:tr>
+        <w:tc>
+          <w:tcPr/>
+          <w:p>
+            <w:pPr>
+              <w:pStyle w:val="Compact"/>
+              <w:jc w:val="left"/>
+            </w:pPr>
+            <w:r>
+              <w:rPr>
+                <w:sz w:val="17"/>
+              </w:rPr>
+              <w:t xml:space="preserve">Responsable opérations, flotte &amp; logistique</w:t>
+            </w:r>
+          </w:p>
+        </w:tc>
+        <w:tc>
+          <w:tcPr/>
+          <w:p>
+            <w:pPr>
+              <w:pStyle w:val="Compact"/>
+              <w:jc w:val="left"/>
+            </w:pPr>
+            <w:r>
+              <w:rPr>
+                <w:sz w:val="17"/>
+              </w:rPr>
+              <w:t xml:space="preserve">Jabir Fkihi El Haoudi</w:t>
+            </w:r>
+          </w:p>
+        </w:tc>
+      </w:tr>
+      <w:tr>
+        <w:tc>
+          <w:tcPr>
+            <w:shd w:val="clear" w:fill="F4F6F9"/>
+          </w:tcPr>
+          <w:p>
+            <w:pPr>
+              <w:pStyle w:val="Compact"/>
+              <w:jc w:val="left"/>
+            </w:pPr>
+            <w:r>
+              <w:rPr>
+                <w:sz w:val="17"/>
+              </w:rPr>
+              <w:t xml:space="preserve">Responsable finances, achats &amp; risques</w:t>
+            </w:r>
+          </w:p>
+        </w:tc>
+        <w:tc>
+          <w:tcPr>
+            <w:shd w:val="clear" w:fill="F4F6F9"/>
+          </w:tcPr>
+          <w:p>
+            <w:pPr>
+              <w:pStyle w:val="Compact"/>
+              <w:jc w:val="left"/>
+            </w:pPr>
+            <w:r>
+              <w:rPr>
+                <w:sz w:val="17"/>
+              </w:rPr>
+              <w:t xml:space="preserve">CHETOUANI Adil</w:t>
+            </w:r>
+          </w:p>
+        </w:tc>
+      </w:tr>
+      <w:tr>
+        <w:tc>
+          <w:tcPr/>
+          <w:p>
+            <w:pPr>
+              <w:pStyle w:val="Compact"/>
+              <w:jc w:val="left"/>
+            </w:pPr>
+            <w:r>
+              <w:rPr>
+                <w:sz w:val="17"/>
+              </w:rPr>
+              <w:t xml:space="preserve">Responsable communication &amp; parties prenantes</w:t>
+            </w:r>
+          </w:p>
+        </w:tc>
+        <w:tc>
+          <w:tcPr/>
+          <w:p>
+            <w:pPr>
+              <w:pStyle w:val="Compact"/>
+              <w:jc w:val="left"/>
+            </w:pPr>
+            <w:r>
+              <w:rPr>
+                <w:sz w:val="17"/>
+              </w:rPr>
+              <w:t xml:space="preserve">PIERRE Hordona</w:t>
+            </w:r>
+          </w:p>
+        </w:tc>
+      </w:tr>
+    </w:tbl>
+    <w:p>
+      <w:r>
+        <w:pict>
+          <v:rect style="width:0;height:1.5pt" o:hralign="center" o:hrstd="t" o:hr="t"/>
+        </w:pict>
+      </w:r>
+    </w:p>
+    <w:bookmarkEnd w:id="23"/>
+    <w:bookmarkStart w:id="24" w:name="remerciements"/>
+    <w:p>
+      <w:pPr>
+        <w:pStyle w:val="Heading2"/>
+      </w:pPr>
+      <w:r>
+        <w:t xml:space="preserve">Remerciements</w:t>
+      </w:r>
+    </w:p>
+    <w:p>
+      <w:pPr>
+        <w:pStyle w:val="FirstParagraph"/>
+      </w:pPr>
+      <w:r>
+        <w:t xml:space="preserve">Nous adressons nos remerciements à notre enseignante du module « Gestion de projets »,</w:t>
+      </w:r>
+      <w:r>
+        <w:t xml:space="preserve"> </w:t>
+      </w:r>
+      <w:r>
+        <w:rPr>
+          <w:bCs/>
+          <w:b/>
+        </w:rPr>
+        <w:t xml:space="preserve">Soukaina EL HAJJAJI</w:t>
+      </w:r>
+      <w:r>
+        <w:t xml:space="preserve">, pour son encadrement méthodologique, ainsi qu’à l’ensemble des personnes qui ont accepté d’échanger avec nous sur les enjeux de mobilité urbaine à Tanger. Nous remercions également notre établissement pour la mise à disposition des ressources documentaires ayant permis de mener à bien ce travail collectif.</w:t>
+      </w:r>
+    </w:p>
+    <w:p>
+      <w:r>
+        <w:pict>
+          <v:rect style="width:0;height:1.5pt" o:hralign="center" o:hrstd="t" o:hr="t"/>
+        </w:pict>
+      </w:r>
+    </w:p>
+    <w:bookmarkEnd w:id="24"/>
+    <w:bookmarkStart w:id="25" w:name="résumé-exécutif"/>
+    <w:p>
+      <w:pPr>
+        <w:pStyle w:val="Heading2"/>
+      </w:pPr>
+      <w:r>
+        <w:t xml:space="preserve">Résumé exécutif</w:t>
+      </w:r>
+    </w:p>
+    <w:p>
+      <w:pPr>
+        <w:pStyle w:val="FirstParagraph"/>
+      </w:pPr>
+      <w:r>
+        <w:rPr>
+          <w:bCs/>
+          <w:b/>
+        </w:rPr>
+        <w:t xml:space="preserve">ReadyToGo</w:t>
+      </w:r>
+      <w:r>
+        <w:t xml:space="preserve"> </w:t>
+      </w:r>
+      <w:r>
+        <w:t xml:space="preserve">est un projet de micromobilité visant à déployer à Tanger un service de trottinettes électriques en libre-service. Il répond à un besoin concret : la congestion du centre-ville, la difficulté d’accès rapide à certaines zones stratégiques et l’afflux attendu de visiteurs à l’horizon de la</w:t>
+      </w:r>
+      <w:r>
+        <w:t xml:space="preserve"> </w:t>
+      </w:r>
+      <w:r>
+        <w:rPr>
+          <w:bCs/>
+          <w:b/>
+        </w:rPr>
+        <w:t xml:space="preserve">Coupe du Monde 2030</w:t>
+      </w:r>
+      <w:r>
+        <w:t xml:space="preserve">. ReadyToGo se positionne comme une</w:t>
+      </w:r>
+      <w:r>
+        <w:t xml:space="preserve"> </w:t>
+      </w:r>
+      <w:r>
+        <w:rPr>
+          <w:bCs/>
+          <w:b/>
+        </w:rPr>
+        <w:t xml:space="preserve">solution complémentaire</w:t>
+      </w:r>
+      <w:r>
+        <w:t xml:space="preserve"> </w:t>
+      </w:r>
+      <w:r>
+        <w:t xml:space="preserve">aux transports existants (bus, taxi, voiture, marche) pour les trajets courts, et non comme un substitut aux transports publics.</w:t>
+      </w:r>
+    </w:p>
+    <w:p>
+      <w:pPr>
+        <w:pStyle w:val="BodyText"/>
+      </w:pPr>
+      <w:r>
+        <w:t xml:space="preserve">Le présent rapport traite le projet sous l’angle de la</w:t>
+      </w:r>
+      <w:r>
+        <w:t xml:space="preserve"> </w:t>
+      </w:r>
+      <w:r>
+        <w:rPr>
+          <w:bCs/>
+          <w:b/>
+        </w:rPr>
+        <w:t xml:space="preserve">gestion de projet</w:t>
+      </w:r>
+      <w:r>
+        <w:t xml:space="preserve">, conformément aux sept étapes attendues : définition, planification, organisation du travail, gestion des risques, plan de communication, suivi &amp; indicateurs, et livraison. Il mobilise les outils standards de la discipline : arbre à problèmes et à objectifs, SWOT, PESTEL, objectifs SMART, WBS, diagramme de Gantt, matrice RACI, plan de charge, registre des risques, matrice probabilité-impact, KPI et</w:t>
+      </w:r>
+      <w:r>
+        <w:t xml:space="preserve"> </w:t>
+      </w:r>
+      <w:r>
+        <w:rPr>
+          <w:bCs/>
+          <w:b/>
+        </w:rPr>
+        <w:t xml:space="preserve">pilotage par la valeur acquise (EVM)</w:t>
+      </w:r>
+      <w:r>
+        <w:t xml:space="preserve">.</w:t>
+      </w:r>
+    </w:p>
+    <w:p>
+      <w:pPr>
+        <w:pStyle w:val="BodyText"/>
+      </w:pPr>
+      <w:r>
+        <w:t xml:space="preserve">Le déploiement est</w:t>
+      </w:r>
+      <w:r>
+        <w:t xml:space="preserve"> </w:t>
+      </w:r>
+      <w:r>
+        <w:rPr>
+          <w:bCs/>
+          <w:b/>
+        </w:rPr>
+        <w:t xml:space="preserve">progressif et jalonné</w:t>
+      </w:r>
+      <w:r>
+        <w:t xml:space="preserve"> </w:t>
+      </w:r>
+      <w:r>
+        <w:t xml:space="preserve">: phase pilote 2026-2027 (150 trottinettes, 12 bornes sur la corniche et le centre-ville), extension en 2028 (gare, aéroport, quartiers hôteliers), liaison vers le Grand Stade en 2029, puis dispositif renforcé pour 2030.</w:t>
+      </w:r>
+    </w:p>
+    <w:p>
+      <w:pPr>
+        <w:pStyle w:val="BodyText"/>
+      </w:pPr>
+      <w:r>
+        <w:t xml:space="preserve">Sur le plan économique, l’analyse budgétaire détaillée (bottom-up) produit trois scénarios :</w:t>
+      </w:r>
+      <w:r>
+        <w:t xml:space="preserve"> </w:t>
+      </w:r>
+      <w:r>
+        <w:rPr>
+          <w:bCs/>
+          <w:b/>
+        </w:rPr>
+        <w:t xml:space="preserve">minimal ≈ 1,68 M DH</w:t>
+      </w:r>
+      <w:r>
+        <w:t xml:space="preserve">,</w:t>
+      </w:r>
+      <w:r>
+        <w:t xml:space="preserve"> </w:t>
+      </w:r>
+      <w:r>
+        <w:rPr>
+          <w:bCs/>
+          <w:b/>
+        </w:rPr>
+        <w:t xml:space="preserve">probable ≈ 2,16 M DH</w:t>
+      </w:r>
+      <w:r>
+        <w:t xml:space="preserve">,</w:t>
+      </w:r>
+      <w:r>
+        <w:t xml:space="preserve"> </w:t>
+      </w:r>
+      <w:r>
+        <w:rPr>
+          <w:bCs/>
+          <w:b/>
+        </w:rPr>
+        <w:t xml:space="preserve">maximal ≈ 2,76 M DH</w:t>
+      </w:r>
+      <w:r>
+        <w:t xml:space="preserve">. Le scénario probable dépasse légèrement (~8 %) la fourchette initiale de 1,5 à 2 M DH : cet écart est analysé et des leviers d’ajustement sont proposés. L’analyse du seuil de rentabilité situe le point mort opérationnel autour de</w:t>
+      </w:r>
+      <w:r>
+        <w:t xml:space="preserve"> </w:t>
+      </w:r>
+      <w:r>
+        <w:rPr>
+          <w:bCs/>
+          <w:b/>
+        </w:rPr>
+        <w:t xml:space="preserve">3,1 trajets par trottinette et par jour</w:t>
+      </w:r>
+      <w:r>
+        <w:t xml:space="preserve"> </w:t>
+      </w:r>
+      <w:r>
+        <w:t xml:space="preserve">; le scénario de fréquentation « faible » est déficitaire, tandis que les scénarios « probable » et « élevé » dégagent une marge. Aucune rentabilité n’est promise : elle est</w:t>
+      </w:r>
+      <w:r>
+        <w:t xml:space="preserve"> </w:t>
+      </w:r>
+      <w:r>
+        <w:rPr>
+          <w:bCs/>
+          <w:b/>
+        </w:rPr>
+        <w:t xml:space="preserve">conditionnée</w:t>
+      </w:r>
+      <w:r>
+        <w:t xml:space="preserve"> </w:t>
+      </w:r>
+      <w:r>
+        <w:t xml:space="preserve">à l’adoption réelle du service.</w:t>
+      </w:r>
+    </w:p>
+    <w:p>
+      <w:pPr>
+        <w:pStyle w:val="BodyText"/>
+      </w:pPr>
+      <w:r>
+        <w:t xml:space="preserve">Fait distinctif de ce rapport, le</w:t>
+      </w:r>
+      <w:r>
+        <w:t xml:space="preserve"> </w:t>
+      </w:r>
+      <w:r>
+        <w:rPr>
+          <w:bCs/>
+          <w:b/>
+        </w:rPr>
+        <w:t xml:space="preserve">déroulement réel du projet et la gestion des aléas</w:t>
+      </w:r>
+      <w:r>
+        <w:t xml:space="preserve"> </w:t>
+      </w:r>
+      <w:r>
+        <w:t xml:space="preserve">sont traités sans complaisance : dix difficultés réalistes (retard d’autorisation, hausse du prix des trottinettes, retard de l’application, surcharge d’un membre, pannes en test, stationnement non conforme, incident de cybersécurité, adoption faible, accident mineur, demande de changement de périmètre) surviennent au cours de l’exécution et</w:t>
+      </w:r>
+      <w:r>
+        <w:t xml:space="preserve"> </w:t>
+      </w:r>
+      <w:r>
+        <w:rPr>
+          <w:bCs/>
+          <w:b/>
+        </w:rPr>
+        <w:t xml:space="preserve">modifient réellement</w:t>
+      </w:r>
+      <w:r>
+        <w:t xml:space="preserve"> </w:t>
+      </w:r>
+      <w:r>
+        <w:t xml:space="preserve">le planning, le budget, le plan de charge, les KPI et la courbe EVM (périodes avec SPI &lt; 1 et CPI &lt; 1), avant redressement grâce aux actions correctives.</w:t>
+      </w:r>
+    </w:p>
+    <w:p>
+      <w:pPr>
+        <w:pStyle w:val="BodyText"/>
+      </w:pPr>
+      <w:r>
+        <w:rPr>
+          <w:bCs/>
+          <w:b/>
+        </w:rPr>
+        <w:t xml:space="preserve">Conclusion :</w:t>
+      </w:r>
+      <w:r>
+        <w:t xml:space="preserve"> </w:t>
+      </w:r>
+      <w:r>
+        <w:t xml:space="preserve">ReadyToGo est</w:t>
+      </w:r>
+      <w:r>
+        <w:t xml:space="preserve"> </w:t>
+      </w:r>
+      <w:r>
+        <w:rPr>
+          <w:bCs/>
+          <w:b/>
+        </w:rPr>
+        <w:t xml:space="preserve">faisable sous conditions</w:t>
+      </w:r>
+      <w:r>
+        <w:t xml:space="preserve"> </w:t>
+      </w:r>
+      <w:r>
+        <w:t xml:space="preserve">(obtention des autorisations, maîtrise des coûts, adoption suffisante, qualité et sécurité). La réussite d’un projet ne réside pas dans l’absence de problèmes, mais dans la capacité de l’équipe à les détecter, décider et corriger rapidement.</w:t>
+      </w:r>
+    </w:p>
+    <w:p>
+      <w:r>
+        <w:pict>
+          <v:rect style="width:0;height:1.5pt" o:hralign="center" o:hrstd="t" o:hr="t"/>
+        </w:pict>
+      </w:r>
+    </w:p>
+    <w:bookmarkEnd w:id="25"/>
+    <w:bookmarkStart w:id="26" w:name="liste-des-sigles-et-abréviations"/>
+    <w:p>
+      <w:pPr>
+        <w:pStyle w:val="Heading2"/>
+      </w:pPr>
+      <w:r>
+        <w:t xml:space="preserve">Liste des sigles et abréviations</w:t>
       </w:r>
     </w:p>
     <w:tbl>
@@ -429,594 +876,6 @@
                 <w:color w:val="FFFFFF"/>
                 <w:sz w:val="17"/>
               </w:rPr>
-              <w:t xml:space="preserve">Rôle</w:t>
-            </w:r>
-          </w:p>
-        </w:tc>
-        <w:tc>
-          <w:tcPr>
-            <w:shd w:val="clear" w:fill="0B5394"/>
-          </w:tcPr>
-          <w:p>
-            <w:pPr>
-              <w:pStyle w:val="Compact"/>
-              <w:jc w:val="left"/>
-            </w:pPr>
-            <w:r>
-              <w:rPr>
-                <w:b/>
-                <w:color w:val="FFFFFF"/>
-                <w:sz w:val="17"/>
-              </w:rPr>
-              <w:t xml:space="preserve">Membre</w:t>
-            </w:r>
-          </w:p>
-        </w:tc>
-      </w:tr>
-      <w:tr>
-        <w:tc>
-          <w:tcPr/>
-          <w:p>
-            <w:pPr>
-              <w:pStyle w:val="Compact"/>
-              <w:jc w:val="left"/>
-            </w:pPr>
-            <w:r>
-              <w:rPr>
-                <w:sz w:val="17"/>
-              </w:rPr>
-              <w:t xml:space="preserve">Membre 1 — Chef de projet &amp; coordination</w:t>
-            </w:r>
-          </w:p>
-        </w:tc>
-        <w:tc>
-          <w:tcPr/>
-          <w:p>
-            <w:pPr>
-              <w:pStyle w:val="Compact"/>
-              <w:jc w:val="left"/>
-            </w:pPr>
-            <w:r>
-              <w:rPr>
-                <w:iCs/>
-                <w:i/>
-                <w:sz w:val="17"/>
-              </w:rPr>
-              <w:t xml:space="preserve">[Nom et prénom à compléter]</w:t>
-            </w:r>
-          </w:p>
-        </w:tc>
-      </w:tr>
-      <w:tr>
-        <w:tc>
-          <w:tcPr>
-            <w:shd w:val="clear" w:fill="F4F6F9"/>
-          </w:tcPr>
-          <w:p>
-            <w:pPr>
-              <w:pStyle w:val="Compact"/>
-              <w:jc w:val="left"/>
-            </w:pPr>
-            <w:r>
-              <w:rPr>
-                <w:sz w:val="17"/>
-              </w:rPr>
-              <w:t xml:space="preserve">Membre 2 — Responsable technique &amp; application</w:t>
-            </w:r>
-          </w:p>
-        </w:tc>
-        <w:tc>
-          <w:tcPr>
-            <w:shd w:val="clear" w:fill="F4F6F9"/>
-          </w:tcPr>
-          <w:p>
-            <w:pPr>
-              <w:pStyle w:val="Compact"/>
-              <w:jc w:val="left"/>
-            </w:pPr>
-            <w:r>
-              <w:rPr>
-                <w:iCs/>
-                <w:i/>
-                <w:sz w:val="17"/>
-              </w:rPr>
-              <w:t xml:space="preserve">[Nom et prénom à compléter]</w:t>
-            </w:r>
-          </w:p>
-        </w:tc>
-      </w:tr>
-      <w:tr>
-        <w:tc>
-          <w:tcPr/>
-          <w:p>
-            <w:pPr>
-              <w:pStyle w:val="Compact"/>
-              <w:jc w:val="left"/>
-            </w:pPr>
-            <w:r>
-              <w:rPr>
-                <w:sz w:val="17"/>
-              </w:rPr>
-              <w:t xml:space="preserve">Membre 3 — Responsable opérations, flotte &amp; logistique</w:t>
-            </w:r>
-          </w:p>
-        </w:tc>
-        <w:tc>
-          <w:tcPr/>
-          <w:p>
-            <w:pPr>
-              <w:pStyle w:val="Compact"/>
-              <w:jc w:val="left"/>
-            </w:pPr>
-            <w:r>
-              <w:rPr>
-                <w:iCs/>
-                <w:i/>
-                <w:sz w:val="17"/>
-              </w:rPr>
-              <w:t xml:space="preserve">[Nom et prénom à compléter]</w:t>
-            </w:r>
-          </w:p>
-        </w:tc>
-      </w:tr>
-      <w:tr>
-        <w:tc>
-          <w:tcPr>
-            <w:shd w:val="clear" w:fill="F4F6F9"/>
-          </w:tcPr>
-          <w:p>
-            <w:pPr>
-              <w:pStyle w:val="Compact"/>
-              <w:jc w:val="left"/>
-            </w:pPr>
-            <w:r>
-              <w:rPr>
-                <w:sz w:val="17"/>
-              </w:rPr>
-              <w:t xml:space="preserve">Membre 4 — Responsable finances, achats &amp; risques</w:t>
-            </w:r>
-          </w:p>
-        </w:tc>
-        <w:tc>
-          <w:tcPr>
-            <w:shd w:val="clear" w:fill="F4F6F9"/>
-          </w:tcPr>
-          <w:p>
-            <w:pPr>
-              <w:pStyle w:val="Compact"/>
-              <w:jc w:val="left"/>
-            </w:pPr>
-            <w:r>
-              <w:rPr>
-                <w:iCs/>
-                <w:i/>
-                <w:sz w:val="17"/>
-              </w:rPr>
-              <w:t xml:space="preserve">[Nom et prénom à compléter]</w:t>
-            </w:r>
-          </w:p>
-        </w:tc>
-      </w:tr>
-      <w:tr>
-        <w:tc>
-          <w:tcPr/>
-          <w:p>
-            <w:pPr>
-              <w:pStyle w:val="Compact"/>
-              <w:jc w:val="left"/>
-            </w:pPr>
-            <w:r>
-              <w:rPr>
-                <w:sz w:val="17"/>
-              </w:rPr>
-              <w:t xml:space="preserve">Membre 5 — Responsable communication &amp; parties prenantes</w:t>
-            </w:r>
-          </w:p>
-        </w:tc>
-        <w:tc>
-          <w:tcPr/>
-          <w:p>
-            <w:pPr>
-              <w:pStyle w:val="Compact"/>
-              <w:jc w:val="left"/>
-            </w:pPr>
-            <w:r>
-              <w:rPr>
-                <w:iCs/>
-                <w:i/>
-                <w:sz w:val="17"/>
-              </w:rPr>
-              <w:t xml:space="preserve">[Nom et prénom à compléter]</w:t>
-            </w:r>
-          </w:p>
-        </w:tc>
-      </w:tr>
-    </w:tbl>
-    <w:p>
-      <w:pPr>
-        <w:pStyle w:val="BlockText"/>
-      </w:pPr>
-      <w:r>
-        <w:rPr>
-          <w:bCs/>
-          <w:b/>
-        </w:rPr>
-        <w:t xml:space="preserve">En-tête recommandé pour l’export Word/PDF :</w:t>
-      </w:r>
-      <w:r>
-        <w:t xml:space="preserve"> </w:t>
-      </w:r>
-      <w:r>
-        <w:t xml:space="preserve">« ReadyToGo — Rapport de projet » · pieds de page avec numérotation. Charte : orange, bleu détroit, blanc, gris clair.</w:t>
-      </w:r>
-    </w:p>
-    <w:p>
-      <w:r>
-        <w:pict>
-          <v:rect style="width:0;height:1.5pt" o:hralign="center" o:hrstd="t" o:hr="t"/>
-        </w:pict>
-      </w:r>
-    </w:p>
-    <w:bookmarkEnd w:id="23"/>
-    <w:bookmarkStart w:id="24" w:name="remerciements"/>
-    <w:p>
-      <w:pPr>
-        <w:pStyle w:val="Heading2"/>
-      </w:pPr>
-      <w:r>
-        <w:t xml:space="preserve">Remerciements</w:t>
-      </w:r>
-    </w:p>
-    <w:p>
-      <w:pPr>
-        <w:pStyle w:val="FirstParagraph"/>
-      </w:pPr>
-      <w:r>
-        <w:t xml:space="preserve">Nous adressons nos remerciements à notre enseignant du module « Gestion de projets » pour son encadrement méthodologique, ainsi qu’à l’ensemble des personnes qui ont accepté d’échanger avec nous sur les enjeux de mobilité urbaine à Tanger. Nous remercions également notre établissement pour la mise à disposition des ressources documentaires ayant permis de mener à bien ce travail collectif.</w:t>
-      </w:r>
-    </w:p>
-    <w:p>
-      <w:pPr>
-        <w:pStyle w:val="BlockText"/>
-      </w:pPr>
-      <w:r>
-        <w:rPr>
-          <w:iCs/>
-          <w:i/>
-        </w:rPr>
-        <w:t xml:space="preserve">Section facultative — à personnaliser par l’équipe.</w:t>
-      </w:r>
-    </w:p>
-    <w:p>
-      <w:r>
-        <w:pict>
-          <v:rect style="width:0;height:1.5pt" o:hralign="center" o:hrstd="t" o:hr="t"/>
-        </w:pict>
-      </w:r>
-    </w:p>
-    <w:bookmarkEnd w:id="24"/>
-    <w:bookmarkStart w:id="25" w:name="résumé-exécutif"/>
-    <w:p>
-      <w:pPr>
-        <w:pStyle w:val="Heading2"/>
-      </w:pPr>
-      <w:r>
-        <w:t xml:space="preserve">Résumé exécutif</w:t>
-      </w:r>
-    </w:p>
-    <w:p>
-      <w:pPr>
-        <w:pStyle w:val="FirstParagraph"/>
-      </w:pPr>
-      <w:r>
-        <w:rPr>
-          <w:bCs/>
-          <w:b/>
-        </w:rPr>
-        <w:t xml:space="preserve">ReadyToGo</w:t>
-      </w:r>
-      <w:r>
-        <w:t xml:space="preserve"> </w:t>
-      </w:r>
-      <w:r>
-        <w:t xml:space="preserve">est un projet de micromobilité visant à déployer à Tanger un service de trottinettes électriques en libre-service. Il répond à un besoin concret : la congestion du centre-ville, la difficulté d’accès rapide à certaines zones stratégiques et l’afflux attendu de visiteurs à l’horizon de la</w:t>
-      </w:r>
-      <w:r>
-        <w:t xml:space="preserve"> </w:t>
-      </w:r>
-      <w:r>
-        <w:rPr>
-          <w:bCs/>
-          <w:b/>
-        </w:rPr>
-        <w:t xml:space="preserve">Coupe du Monde 2030</w:t>
-      </w:r>
-      <w:r>
-        <w:t xml:space="preserve">. ReadyToGo se positionne comme une</w:t>
-      </w:r>
-      <w:r>
-        <w:t xml:space="preserve"> </w:t>
-      </w:r>
-      <w:r>
-        <w:rPr>
-          <w:bCs/>
-          <w:b/>
-        </w:rPr>
-        <w:t xml:space="preserve">solution complémentaire</w:t>
-      </w:r>
-      <w:r>
-        <w:t xml:space="preserve"> </w:t>
-      </w:r>
-      <w:r>
-        <w:t xml:space="preserve">aux transports existants (bus, taxi, voiture, marche) pour les trajets courts, et non comme un substitut aux transports publics.</w:t>
-      </w:r>
-    </w:p>
-    <w:p>
-      <w:pPr>
-        <w:pStyle w:val="BodyText"/>
-      </w:pPr>
-      <w:r>
-        <w:t xml:space="preserve">Le présent rapport traite le projet sous l’angle de la</w:t>
-      </w:r>
-      <w:r>
-        <w:t xml:space="preserve"> </w:t>
-      </w:r>
-      <w:r>
-        <w:rPr>
-          <w:bCs/>
-          <w:b/>
-        </w:rPr>
-        <w:t xml:space="preserve">gestion de projet</w:t>
-      </w:r>
-      <w:r>
-        <w:t xml:space="preserve">, conformément aux sept étapes attendues : définition, planification, organisation du travail, gestion des risques, plan de communication, suivi &amp; indicateurs, et livraison. Il mobilise les outils standards de la discipline : arbre à problèmes et à objectifs, SWOT, PESTEL, objectifs SMART, WBS, diagramme de Gantt, matrice RACI, plan de charge, registre des risques, matrice probabilité-impact, KPI et</w:t>
-      </w:r>
-      <w:r>
-        <w:t xml:space="preserve"> </w:t>
-      </w:r>
-      <w:r>
-        <w:rPr>
-          <w:bCs/>
-          <w:b/>
-        </w:rPr>
-        <w:t xml:space="preserve">pilotage par la valeur acquise (EVM)</w:t>
-      </w:r>
-      <w:r>
-        <w:t xml:space="preserve">.</w:t>
-      </w:r>
-    </w:p>
-    <w:p>
-      <w:pPr>
-        <w:pStyle w:val="BodyText"/>
-      </w:pPr>
-      <w:r>
-        <w:t xml:space="preserve">Le déploiement est</w:t>
-      </w:r>
-      <w:r>
-        <w:t xml:space="preserve"> </w:t>
-      </w:r>
-      <w:r>
-        <w:rPr>
-          <w:bCs/>
-          <w:b/>
-        </w:rPr>
-        <w:t xml:space="preserve">progressif et jalonné</w:t>
-      </w:r>
-      <w:r>
-        <w:t xml:space="preserve"> </w:t>
-      </w:r>
-      <w:r>
-        <w:t xml:space="preserve">: phase pilote 2026-2027 (150 trottinettes, 12 bornes sur la corniche et le centre-ville), extension en 2028 (gare, aéroport, quartiers hôteliers), liaison vers le Grand Stade en 2029, puis dispositif renforcé pour 2030.</w:t>
-      </w:r>
-    </w:p>
-    <w:p>
-      <w:pPr>
-        <w:pStyle w:val="BodyText"/>
-      </w:pPr>
-      <w:r>
-        <w:t xml:space="preserve">Sur le plan économique, l’analyse budgétaire détaillée (bottom-up) produit trois scénarios :</w:t>
-      </w:r>
-      <w:r>
-        <w:t xml:space="preserve"> </w:t>
-      </w:r>
-      <w:r>
-        <w:rPr>
-          <w:bCs/>
-          <w:b/>
-        </w:rPr>
-        <w:t xml:space="preserve">minimal ≈ 1,68 M DH</w:t>
-      </w:r>
-      <w:r>
-        <w:t xml:space="preserve">,</w:t>
-      </w:r>
-      <w:r>
-        <w:t xml:space="preserve"> </w:t>
-      </w:r>
-      <w:r>
-        <w:rPr>
-          <w:bCs/>
-          <w:b/>
-        </w:rPr>
-        <w:t xml:space="preserve">probable ≈ 2,16 M DH</w:t>
-      </w:r>
-      <w:r>
-        <w:t xml:space="preserve">,</w:t>
-      </w:r>
-      <w:r>
-        <w:t xml:space="preserve"> </w:t>
-      </w:r>
-      <w:r>
-        <w:rPr>
-          <w:bCs/>
-          <w:b/>
-        </w:rPr>
-        <w:t xml:space="preserve">maximal ≈ 2,76 M DH</w:t>
-      </w:r>
-      <w:r>
-        <w:t xml:space="preserve">. Le scénario probable dépasse légèrement (~8 %) la fourchette initiale de 1,5 à 2 M DH : cet écart est analysé et des leviers d’ajustement sont proposés. L’analyse du seuil de rentabilité situe le point mort opérationnel autour de</w:t>
-      </w:r>
-      <w:r>
-        <w:t xml:space="preserve"> </w:t>
-      </w:r>
-      <w:r>
-        <w:rPr>
-          <w:bCs/>
-          <w:b/>
-        </w:rPr>
-        <w:t xml:space="preserve">3,1 trajets par trottinette et par jour</w:t>
-      </w:r>
-      <w:r>
-        <w:t xml:space="preserve"> </w:t>
-      </w:r>
-      <w:r>
-        <w:t xml:space="preserve">; le scénario de fréquentation « faible » est déficitaire, tandis que les scénarios « probable » et « élevé » dégagent une marge. Aucune rentabilité n’est promise : elle est</w:t>
-      </w:r>
-      <w:r>
-        <w:t xml:space="preserve"> </w:t>
-      </w:r>
-      <w:r>
-        <w:rPr>
-          <w:bCs/>
-          <w:b/>
-        </w:rPr>
-        <w:t xml:space="preserve">conditionnée</w:t>
-      </w:r>
-      <w:r>
-        <w:t xml:space="preserve"> </w:t>
-      </w:r>
-      <w:r>
-        <w:t xml:space="preserve">à l’adoption réelle du service.</w:t>
-      </w:r>
-    </w:p>
-    <w:p>
-      <w:pPr>
-        <w:pStyle w:val="BodyText"/>
-      </w:pPr>
-      <w:r>
-        <w:t xml:space="preserve">Fait distinctif de ce rapport, le</w:t>
-      </w:r>
-      <w:r>
-        <w:t xml:space="preserve"> </w:t>
-      </w:r>
-      <w:r>
-        <w:rPr>
-          <w:bCs/>
-          <w:b/>
-        </w:rPr>
-        <w:t xml:space="preserve">déroulement réel du projet et la gestion des aléas</w:t>
-      </w:r>
-      <w:r>
-        <w:t xml:space="preserve"> </w:t>
-      </w:r>
-      <w:r>
-        <w:t xml:space="preserve">sont traités sans complaisance : dix difficultés réalistes (retard d’autorisation, hausse du prix des trottinettes, retard de l’application, surcharge d’un membre, pannes en test, stationnement non conforme, incident de cybersécurité, adoption faible, accident mineur, demande de changement de périmètre) surviennent au cours de l’exécution et</w:t>
-      </w:r>
-      <w:r>
-        <w:t xml:space="preserve"> </w:t>
-      </w:r>
-      <w:r>
-        <w:rPr>
-          <w:bCs/>
-          <w:b/>
-        </w:rPr>
-        <w:t xml:space="preserve">modifient réellement</w:t>
-      </w:r>
-      <w:r>
-        <w:t xml:space="preserve"> </w:t>
-      </w:r>
-      <w:r>
-        <w:t xml:space="preserve">le planning, le budget, le plan de charge, les KPI et la courbe EVM (périodes avec SPI &lt; 1 et CPI &lt; 1), avant redressement grâce aux actions correctives.</w:t>
-      </w:r>
-    </w:p>
-    <w:p>
-      <w:pPr>
-        <w:pStyle w:val="BodyText"/>
-      </w:pPr>
-      <w:r>
-        <w:rPr>
-          <w:bCs/>
-          <w:b/>
-        </w:rPr>
-        <w:t xml:space="preserve">Conclusion :</w:t>
-      </w:r>
-      <w:r>
-        <w:t xml:space="preserve"> </w:t>
-      </w:r>
-      <w:r>
-        <w:t xml:space="preserve">ReadyToGo est</w:t>
-      </w:r>
-      <w:r>
-        <w:t xml:space="preserve"> </w:t>
-      </w:r>
-      <w:r>
-        <w:rPr>
-          <w:bCs/>
-          <w:b/>
-        </w:rPr>
-        <w:t xml:space="preserve">faisable sous conditions</w:t>
-      </w:r>
-      <w:r>
-        <w:t xml:space="preserve"> </w:t>
-      </w:r>
-      <w:r>
-        <w:t xml:space="preserve">(obtention des autorisations, maîtrise des coûts, adoption suffisante, qualité et sécurité). La réussite d’un projet ne réside pas dans l’absence de problèmes, mais dans la capacité de l’équipe à les détecter, décider et corriger rapidement.</w:t>
-      </w:r>
-    </w:p>
-    <w:p>
-      <w:r>
-        <w:pict>
-          <v:rect style="width:0;height:1.5pt" o:hralign="center" o:hrstd="t" o:hr="t"/>
-        </w:pict>
-      </w:r>
-    </w:p>
-    <w:bookmarkEnd w:id="25"/>
-    <w:bookmarkStart w:id="26" w:name="liste-des-sigles-et-abréviations"/>
-    <w:p>
-      <w:pPr>
-        <w:pStyle w:val="Heading2"/>
-      </w:pPr>
-      <w:r>
-        <w:t xml:space="preserve">Liste des sigles et abréviations</w:t>
-      </w:r>
-    </w:p>
-    <w:tbl>
-      <w:tblPr>
-        <w:tblStyle w:val="Table"/>
-        <w:tblW w:type="pct" w:w="5000"/>
-        <w:tblLook w:firstRow="1" w:lastRow="0" w:firstColumn="0" w:lastColumn="0" w:noHBand="0" w:noVBand="0" w:val="0020"/>
-        <w:jc w:val="start"/>
-        <w:tblBorders>
-          <w:top w:val="single" w:sz="4" w:color="C9D3DC"/>
-          <w:left w:val="single" w:sz="4" w:color="C9D3DC"/>
-          <w:bottom w:val="single" w:sz="4" w:color="C9D3DC"/>
-          <w:right w:val="single" w:sz="4" w:color="C9D3DC"/>
-          <w:insideH w:val="single" w:sz="4" w:color="C9D3DC"/>
-          <w:insideV w:val="single" w:sz="4" w:color="C9D3DC"/>
-        </w:tblBorders>
-      </w:tblPr>
-      <w:tblGrid>
-        <w:gridCol w:w="3960"/>
-        <w:gridCol w:w="3960"/>
-      </w:tblGrid>
-      <w:tr>
-        <w:trPr>
-          <w:tblHeader w:val="true"/>
-        </w:trPr>
-        <w:tc>
-          <w:tcPr>
-            <w:shd w:val="clear" w:fill="0B5394"/>
-          </w:tcPr>
-          <w:p>
-            <w:pPr>
-              <w:pStyle w:val="Compact"/>
-              <w:jc w:val="left"/>
-            </w:pPr>
-            <w:r>
-              <w:rPr>
-                <w:b/>
-                <w:color w:val="FFFFFF"/>
-                <w:sz w:val="17"/>
-              </w:rPr>
               <w:t xml:space="preserve">Sigle</w:t>
             </w:r>
           </w:p>
@@ -2772,7 +2631,7 @@
           <w:bCs/>
           <w:b/>
         </w:rPr>
-        <w:t xml:space="preserve">Organisation du travail (5 personnes)</w:t>
+        <w:t xml:space="preserve">Organisation du travail</w:t>
       </w:r>
     </w:p>
     <w:p>
@@ -3585,23 +3444,13 @@
       </w:r>
     </w:p>
     <w:bookmarkEnd w:id="28"/>
-    <w:bookmarkStart w:id="50" w:name="définition-du-projet-étape-1"/>
+    <w:bookmarkStart w:id="50" w:name="définition-du-projet"/>
     <w:p>
       <w:pPr>
         <w:pStyle w:val="Heading1"/>
       </w:pPr>
       <w:r>
         <w:t xml:space="preserve">2. Définition du projet</w:t>
-      </w:r>
-      <w:r>
-        <w:t xml:space="preserve"> </w:t>
-      </w:r>
-      <w:r>
-        <w:rPr>
-          <w:iCs/>
-          <w:i/>
-        </w:rPr>
-        <w:t xml:space="preserve">(Étape 1)</w:t>
       </w:r>
     </w:p>
     <w:bookmarkStart w:id="29" w:name="présentation-de-readytogo"/>
@@ -11984,23 +11833,13 @@
     </w:p>
     <w:bookmarkEnd w:id="49"/>
     <w:bookmarkEnd w:id="50"/>
-    <w:bookmarkStart w:id="67" w:name="planification-globale-étape-2"/>
+    <w:bookmarkStart w:id="67" w:name="planification-globale"/>
     <w:p>
       <w:pPr>
         <w:pStyle w:val="Heading1"/>
       </w:pPr>
       <w:r>
         <w:t xml:space="preserve">3. Planification globale</w:t>
-      </w:r>
-      <w:r>
-        <w:t xml:space="preserve"> </w:t>
-      </w:r>
-      <w:r>
-        <w:rPr>
-          <w:iCs/>
-          <w:i/>
-        </w:rPr>
-        <w:t xml:space="preserve">(Étape 2)</w:t>
       </w:r>
     </w:p>
     <w:bookmarkStart w:id="51" w:name="méthode-de-gestion-hybride"/>
@@ -16577,23 +16416,13 @@
     </w:p>
     <w:bookmarkEnd w:id="66"/>
     <w:bookmarkEnd w:id="67"/>
-    <w:bookmarkStart w:id="78" w:name="Xa9141207d677526388019ac46bc86ef123b8ec5"/>
+    <w:bookmarkStart w:id="78" w:name="organisation-du-travail"/>
     <w:p>
       <w:pPr>
         <w:pStyle w:val="Heading1"/>
       </w:pPr>
       <w:r>
-        <w:t xml:space="preserve">4. Organisation du travail (5 personnes)</w:t>
-      </w:r>
-      <w:r>
-        <w:t xml:space="preserve"> </w:t>
-      </w:r>
-      <w:r>
-        <w:rPr>
-          <w:iCs/>
-          <w:i/>
-        </w:rPr>
-        <w:t xml:space="preserve">(Étape 3)</w:t>
+        <w:t xml:space="preserve">4. Organisation du travail</w:t>
       </w:r>
     </w:p>
     <w:p>
@@ -25047,23 +24876,13 @@
     </w:p>
     <w:bookmarkEnd w:id="77"/>
     <w:bookmarkEnd w:id="78"/>
-    <w:bookmarkStart w:id="83" w:name="gestion-des-risques-étape-4"/>
+    <w:bookmarkStart w:id="83" w:name="gestion-des-risques"/>
     <w:p>
       <w:pPr>
         <w:pStyle w:val="Heading1"/>
       </w:pPr>
       <w:r>
         <w:t xml:space="preserve">5. Gestion des risques</w:t>
-      </w:r>
-      <w:r>
-        <w:t xml:space="preserve"> </w:t>
-      </w:r>
-      <w:r>
-        <w:rPr>
-          <w:iCs/>
-          <w:i/>
-        </w:rPr>
-        <w:t xml:space="preserve">(Étape 4)</w:t>
       </w:r>
     </w:p>
     <w:bookmarkStart w:id="79" w:name="méthode"/>
@@ -30898,23 +30717,13 @@
     </w:p>
     <w:bookmarkEnd w:id="82"/>
     <w:bookmarkEnd w:id="83"/>
-    <w:bookmarkStart w:id="88" w:name="plan-de-communication-étape-5"/>
+    <w:bookmarkStart w:id="88" w:name="plan-de-communication"/>
     <w:p>
       <w:pPr>
         <w:pStyle w:val="Heading1"/>
       </w:pPr>
       <w:r>
         <w:t xml:space="preserve">6. Plan de communication</w:t>
-      </w:r>
-      <w:r>
-        <w:t xml:space="preserve"> </w:t>
-      </w:r>
-      <w:r>
-        <w:rPr>
-          <w:iCs/>
-          <w:i/>
-        </w:rPr>
-        <w:t xml:space="preserve">(Étape 5)</w:t>
       </w:r>
     </w:p>
     <w:bookmarkStart w:id="84" w:name="objectifs-de-communication"/>
@@ -40396,23 +40205,13 @@
     </w:p>
     <w:bookmarkEnd w:id="101"/>
     <w:bookmarkEnd w:id="102"/>
-    <w:bookmarkStart w:id="114" w:name="suivi-et-indicateurs-étape-6"/>
+    <w:bookmarkStart w:id="114" w:name="suivi-et-indicateurs"/>
     <w:p>
       <w:pPr>
         <w:pStyle w:val="Heading1"/>
       </w:pPr>
       <w:r>
         <w:t xml:space="preserve">8. Suivi et indicateurs</w:t>
-      </w:r>
-      <w:r>
-        <w:t xml:space="preserve"> </w:t>
-      </w:r>
-      <w:r>
-        <w:rPr>
-          <w:iCs/>
-          <w:i/>
-        </w:rPr>
-        <w:t xml:space="preserve">(Étape 6)</w:t>
       </w:r>
     </w:p>
     <w:bookmarkStart w:id="103" w:name="kpi"/>
@@ -44739,23 +44538,13 @@
     </w:p>
     <w:bookmarkEnd w:id="113"/>
     <w:bookmarkEnd w:id="114"/>
-    <w:bookmarkStart w:id="119" w:name="livraison-du-projet-étape-7"/>
+    <w:bookmarkStart w:id="119" w:name="livraison-du-projet"/>
     <w:p>
       <w:pPr>
         <w:pStyle w:val="Heading1"/>
       </w:pPr>
       <w:r>
         <w:t xml:space="preserve">9. Livraison du projet</w:t>
-      </w:r>
-      <w:r>
-        <w:t xml:space="preserve"> </w:t>
-      </w:r>
-      <w:r>
-        <w:rPr>
-          <w:iCs/>
-          <w:i/>
-        </w:rPr>
-        <w:t xml:space="preserve">(Étape 7)</w:t>
       </w:r>
     </w:p>
     <w:bookmarkStart w:id="115" w:name="vérification-des-livrables"/>
@@ -61226,23 +61015,7 @@
         <w:t xml:space="preserve"> </w:t>
       </w:r>
       <w:r>
-        <w:t xml:space="preserve">l’ensemble des exigences est satisfait. Les éléments non figés (noms des membres, établissement, filière, enseignant, date de remise) sont explicitement marqués «</w:t>
-      </w:r>
-      <w:r>
-        <w:t xml:space="preserve"> </w:t>
-      </w:r>
-      <w:r>
-        <w:rPr>
-          <w:iCs/>
-          <w:i/>
-        </w:rPr>
-        <w:t xml:space="preserve">[À compléter]</w:t>
-      </w:r>
-      <w:r>
-        <w:t xml:space="preserve"> </w:t>
-      </w:r>
-      <w:r>
-        <w:t xml:space="preserve">» et les données non vérifiées «</w:t>
+        <w:t xml:space="preserve">l’ensemble des exigences est satisfait. Les données non vérifiées restent signalées «</w:t>
       </w:r>
       <w:r>
         <w:t xml:space="preserve"> </w:t>

</xml_diff>